<commit_message>
Created cover page, table of content and Introduction
</commit_message>
<xml_diff>
--- a/REPORT/Report.docx
+++ b/REPORT/Report.docx
@@ -4,309 +4,296 @@
   <w:body>
     <w:p>
       <w:pPr>
+        <w:jc w:val="center"/>
+        <w:rPr>
+          <w:rStyle w:val="Strong"/>
+          <w:sz w:val="40"/>
+          <w:szCs w:val="40"/>
+          <w:lang w:val="en-US"/>
+        </w:rPr>
+      </w:pPr>
+      <w:r>
+        <w:rPr>
+          <w:rStyle w:val="Strong"/>
+          <w:sz w:val="40"/>
+          <w:szCs w:val="40"/>
+          <w:lang w:val="en-US"/>
+        </w:rPr>
+        <w:t>Dr. B.R. Ambedkar National Institute of Technology, Jalandhar</w:t>
+      </w:r>
+    </w:p>
+    <w:p>
+      <w:pPr>
+        <w:spacing w:line="360" w:lineRule="auto"/>
+        <w:jc w:val="center"/>
+        <w:rPr>
+          <w:rStyle w:val="Strong"/>
+          <w:sz w:val="40"/>
+          <w:szCs w:val="40"/>
+          <w:lang w:val="en-US"/>
+        </w:rPr>
+      </w:pPr>
+      <w:r>
+        <w:rPr>
+          <w:b/>
+          <w:bCs/>
+          <w:noProof/>
+          <w:sz w:val="40"/>
+          <w:szCs w:val="40"/>
+          <w:lang w:val="en-US"/>
+        </w:rPr>
+        <w:drawing>
+          <wp:inline distT="0" distB="0" distL="0" distR="0" wp14:anchorId="3B3C8FAD" wp14:editId="049A0C4E">
+            <wp:extent cx="2076450" cy="2270186"/>
+            <wp:effectExtent l="0" t="0" r="0" b="0"/>
+            <wp:docPr id="1037293824" name="Picture 1"/>
+            <wp:cNvGraphicFramePr>
+              <a:graphicFrameLocks xmlns:a="http://schemas.openxmlformats.org/drawingml/2006/main" noChangeAspect="1"/>
+            </wp:cNvGraphicFramePr>
+            <a:graphic xmlns:a="http://schemas.openxmlformats.org/drawingml/2006/main">
+              <a:graphicData uri="http://schemas.openxmlformats.org/drawingml/2006/picture">
+                <pic:pic xmlns:pic="http://schemas.openxmlformats.org/drawingml/2006/picture">
+                  <pic:nvPicPr>
+                    <pic:cNvPr id="1037293824" name="Picture 1037293824"/>
+                    <pic:cNvPicPr/>
+                  </pic:nvPicPr>
+                  <pic:blipFill>
+                    <a:blip r:embed="rId5">
+                      <a:extLst>
+                        <a:ext uri="{28A0092B-C50C-407E-A947-70E740481C1C}">
+                          <a14:useLocalDpi xmlns:a14="http://schemas.microsoft.com/office/drawing/2010/main" val="0"/>
+                        </a:ext>
+                      </a:extLst>
+                    </a:blip>
+                    <a:stretch>
+                      <a:fillRect/>
+                    </a:stretch>
+                  </pic:blipFill>
+                  <pic:spPr>
+                    <a:xfrm>
+                      <a:off x="0" y="0"/>
+                      <a:ext cx="2088952" cy="2283854"/>
+                    </a:xfrm>
+                    <a:prstGeom prst="rect">
+                      <a:avLst/>
+                    </a:prstGeom>
+                  </pic:spPr>
+                </pic:pic>
+              </a:graphicData>
+            </a:graphic>
+          </wp:inline>
+        </w:drawing>
+      </w:r>
+    </w:p>
+    <w:p>
+      <w:pPr>
         <w:pStyle w:val="IntenseQuote"/>
-        <w:ind w:left="0"/>
-        <w:rPr>
+        <w:rPr>
+          <w:rStyle w:val="Strong"/>
+          <w:sz w:val="40"/>
+          <w:szCs w:val="40"/>
+          <w:lang w:val="en-US"/>
+        </w:rPr>
+      </w:pPr>
+      <w:r>
+        <w:rPr>
+          <w:rStyle w:val="Strong"/>
+          <w:sz w:val="40"/>
+          <w:szCs w:val="40"/>
+          <w:lang w:val="en-US"/>
+        </w:rPr>
+        <w:t>Department of Instrumentation and Control Engineering</w:t>
+      </w:r>
+    </w:p>
+    <w:p>
+      <w:pPr>
+        <w:jc w:val="center"/>
+        <w:rPr>
+          <w:rFonts w:ascii="Times New Roman" w:hAnsi="Times New Roman" w:cs="Times New Roman"/>
+          <w:b/>
+          <w:bCs/>
+          <w:sz w:val="40"/>
+          <w:szCs w:val="40"/>
+          <w:lang w:val="en-US"/>
+        </w:rPr>
+      </w:pPr>
+      <w:r>
+        <w:rPr>
+          <w:rFonts w:ascii="Times New Roman" w:hAnsi="Times New Roman" w:cs="Times New Roman"/>
+          <w:b/>
+          <w:bCs/>
+          <w:sz w:val="40"/>
+          <w:szCs w:val="40"/>
+          <w:lang w:val="en-US"/>
+        </w:rPr>
+        <w:t>Internship Report</w:t>
+      </w:r>
+    </w:p>
+    <w:p>
+      <w:pPr>
+        <w:jc w:val="center"/>
+        <w:rPr>
+          <w:rStyle w:val="IntenseEmphasis"/>
           <w:rFonts w:ascii="Times New Roman" w:hAnsi="Times New Roman" w:cs="Times New Roman"/>
           <w:b/>
           <w:bCs/>
           <w:i w:val="0"/>
           <w:iCs w:val="0"/>
-          <w:sz w:val="56"/>
-          <w:szCs w:val="56"/>
-          <w:lang w:val="en-US"/>
+          <w:sz w:val="40"/>
+          <w:szCs w:val="40"/>
         </w:rPr>
       </w:pPr>
       <w:r>
         <w:rPr>
+          <w:rStyle w:val="IntenseEmphasis"/>
           <w:rFonts w:ascii="Times New Roman" w:hAnsi="Times New Roman" w:cs="Times New Roman"/>
           <w:b/>
           <w:bCs/>
           <w:i w:val="0"/>
           <w:iCs w:val="0"/>
-          <w:sz w:val="56"/>
-          <w:szCs w:val="56"/>
-          <w:lang w:val="en-US"/>
-        </w:rPr>
-        <w:t>Table of Contents</w:t>
+          <w:sz w:val="40"/>
+          <w:szCs w:val="40"/>
+        </w:rPr>
+        <w:t xml:space="preserve">Project: </w:t>
+      </w:r>
+      <w:r>
+        <w:rPr>
+          <w:rStyle w:val="IntenseEmphasis"/>
+          <w:rFonts w:ascii="Times New Roman" w:hAnsi="Times New Roman" w:cs="Times New Roman"/>
+          <w:b/>
+          <w:bCs/>
+          <w:i w:val="0"/>
+          <w:iCs w:val="0"/>
+          <w:sz w:val="40"/>
+          <w:szCs w:val="40"/>
+        </w:rPr>
+        <w:t>Multi-Zone Reflow Oven Temperature Control Using PI Controller</w:t>
       </w:r>
     </w:p>
     <w:p>
       <w:pPr>
-        <w:pStyle w:val="ListParagraph"/>
-        <w:numPr>
-          <w:ilvl w:val="0"/>
-          <w:numId w:val="1"/>
-        </w:numPr>
-        <w:rPr>
-          <w:lang w:val="en-US"/>
-        </w:rPr>
-      </w:pPr>
-      <w:r>
-        <w:rPr>
-          <w:lang w:val="en-US"/>
-        </w:rPr>
-        <w:t>Acknowledgment</w:t>
-      </w:r>
+        <w:rPr>
+          <w:rStyle w:val="IntenseEmphasis"/>
+          <w:rFonts w:ascii="Times New Roman" w:hAnsi="Times New Roman" w:cs="Times New Roman"/>
+          <w:b/>
+          <w:bCs/>
+          <w:i w:val="0"/>
+          <w:iCs w:val="0"/>
+          <w:sz w:val="40"/>
+          <w:szCs w:val="40"/>
+        </w:rPr>
+      </w:pPr>
     </w:p>
     <w:p>
       <w:pPr>
-        <w:pStyle w:val="ListParagraph"/>
-        <w:numPr>
-          <w:ilvl w:val="0"/>
-          <w:numId w:val="1"/>
-        </w:numPr>
-        <w:rPr>
-          <w:lang w:val="en-US"/>
-        </w:rPr>
-      </w:pPr>
-      <w:r>
-        <w:rPr>
-          <w:lang w:val="en-US"/>
-        </w:rPr>
-        <w:t>Introduction</w:t>
-      </w:r>
+        <w:rPr>
+          <w:rStyle w:val="IntenseEmphasis"/>
+          <w:rFonts w:ascii="Times New Roman" w:hAnsi="Times New Roman" w:cs="Times New Roman"/>
+          <w:b/>
+          <w:bCs/>
+          <w:i w:val="0"/>
+          <w:iCs w:val="0"/>
+          <w:sz w:val="40"/>
+          <w:szCs w:val="40"/>
+        </w:rPr>
+      </w:pPr>
     </w:p>
     <w:p>
       <w:pPr>
-        <w:pStyle w:val="ListParagraph"/>
-        <w:numPr>
-          <w:ilvl w:val="0"/>
-          <w:numId w:val="1"/>
-        </w:numPr>
-        <w:rPr>
-          <w:lang w:val="en-US"/>
-        </w:rPr>
-      </w:pPr>
-      <w:r>
-        <w:rPr>
-          <w:lang w:val="en-US"/>
-        </w:rPr>
-        <w:t>Company Overview</w:t>
-      </w:r>
+        <w:rPr>
+          <w:rStyle w:val="IntenseEmphasis"/>
+          <w:rFonts w:ascii="Times New Roman" w:hAnsi="Times New Roman" w:cs="Times New Roman"/>
+          <w:b/>
+          <w:bCs/>
+          <w:i w:val="0"/>
+          <w:iCs w:val="0"/>
+          <w:sz w:val="40"/>
+          <w:szCs w:val="40"/>
+        </w:rPr>
+      </w:pPr>
     </w:p>
     <w:p>
       <w:pPr>
-        <w:pStyle w:val="ListParagraph"/>
-        <w:numPr>
-          <w:ilvl w:val="0"/>
-          <w:numId w:val="1"/>
-        </w:numPr>
-        <w:rPr>
-          <w:lang w:val="en-US"/>
-        </w:rPr>
-      </w:pPr>
-      <w:r>
-        <w:rPr>
-          <w:lang w:val="en-US"/>
-        </w:rPr>
-        <w:t>Problem Statement</w:t>
-      </w:r>
+        <w:rPr>
+          <w:rStyle w:val="IntenseEmphasis"/>
+          <w:rFonts w:ascii="Times New Roman" w:hAnsi="Times New Roman" w:cs="Times New Roman"/>
+          <w:b/>
+          <w:bCs/>
+          <w:i w:val="0"/>
+          <w:iCs w:val="0"/>
+          <w:sz w:val="40"/>
+          <w:szCs w:val="40"/>
+        </w:rPr>
+      </w:pPr>
     </w:p>
     <w:p>
       <w:pPr>
-        <w:pStyle w:val="ListParagraph"/>
-        <w:numPr>
-          <w:ilvl w:val="0"/>
-          <w:numId w:val="1"/>
-        </w:numPr>
-        <w:rPr>
-          <w:lang w:val="en-US"/>
-        </w:rPr>
-      </w:pPr>
-      <w:r>
-        <w:rPr>
-          <w:lang w:val="en-US"/>
-        </w:rPr>
-        <w:t>Objectives</w:t>
-      </w:r>
+        <w:rPr>
+          <w:rStyle w:val="IntenseEmphasis"/>
+          <w:rFonts w:ascii="Times New Roman" w:hAnsi="Times New Roman" w:cs="Times New Roman"/>
+          <w:b/>
+          <w:bCs/>
+          <w:i w:val="0"/>
+          <w:iCs w:val="0"/>
+          <w:sz w:val="40"/>
+          <w:szCs w:val="40"/>
+        </w:rPr>
+      </w:pPr>
     </w:p>
     <w:p>
       <w:pPr>
-        <w:pStyle w:val="ListParagraph"/>
-        <w:numPr>
-          <w:ilvl w:val="0"/>
-          <w:numId w:val="1"/>
-        </w:numPr>
-        <w:rPr>
-          <w:lang w:val="en-US"/>
-        </w:rPr>
-      </w:pPr>
-      <w:r>
-        <w:rPr>
-          <w:lang w:val="en-US"/>
-        </w:rPr>
-        <w:t>Literature Review</w:t>
-      </w:r>
+        <w:rPr>
+          <w:rStyle w:val="IntenseEmphasis"/>
+          <w:rFonts w:ascii="Times New Roman" w:hAnsi="Times New Roman" w:cs="Times New Roman"/>
+          <w:b/>
+          <w:bCs/>
+          <w:i w:val="0"/>
+          <w:iCs w:val="0"/>
+          <w:sz w:val="40"/>
+          <w:szCs w:val="40"/>
+        </w:rPr>
+      </w:pPr>
     </w:p>
     <w:p>
       <w:pPr>
-        <w:pStyle w:val="ListParagraph"/>
-        <w:numPr>
-          <w:ilvl w:val="0"/>
-          <w:numId w:val="1"/>
-        </w:numPr>
-        <w:rPr>
-          <w:lang w:val="en-US"/>
-        </w:rPr>
-      </w:pPr>
-      <w:r>
-        <w:rPr>
-          <w:lang w:val="en-US"/>
-        </w:rPr>
-        <w:t>System Modeling</w:t>
-      </w:r>
+        <w:rPr>
+          <w:rStyle w:val="IntenseEmphasis"/>
+          <w:rFonts w:ascii="Times New Roman" w:hAnsi="Times New Roman" w:cs="Times New Roman"/>
+          <w:b/>
+          <w:bCs/>
+          <w:i w:val="0"/>
+          <w:iCs w:val="0"/>
+          <w:sz w:val="40"/>
+          <w:szCs w:val="40"/>
+        </w:rPr>
+      </w:pPr>
     </w:p>
     <w:p>
       <w:pPr>
-        <w:pStyle w:val="ListParagraph"/>
-        <w:numPr>
-          <w:ilvl w:val="0"/>
-          <w:numId w:val="1"/>
-        </w:numPr>
-        <w:rPr>
-          <w:lang w:val="en-US"/>
-        </w:rPr>
-      </w:pPr>
-      <w:r>
-        <w:rPr>
-          <w:lang w:val="en-US"/>
-        </w:rPr>
-        <w:t>PID Controller Design</w:t>
-      </w:r>
+        <w:rPr>
+          <w:rStyle w:val="IntenseEmphasis"/>
+          <w:rFonts w:ascii="Times New Roman" w:hAnsi="Times New Roman" w:cs="Times New Roman"/>
+          <w:b/>
+          <w:bCs/>
+          <w:i w:val="0"/>
+          <w:iCs w:val="0"/>
+          <w:sz w:val="40"/>
+          <w:szCs w:val="40"/>
+        </w:rPr>
+      </w:pPr>
     </w:p>
     <w:p>
       <w:pPr>
-        <w:pStyle w:val="ListParagraph"/>
-        <w:numPr>
-          <w:ilvl w:val="0"/>
-          <w:numId w:val="1"/>
-        </w:numPr>
-        <w:rPr>
-          <w:lang w:val="en-US"/>
-        </w:rPr>
-      </w:pPr>
-      <w:r>
-        <w:rPr>
-          <w:lang w:val="en-US"/>
-        </w:rPr>
-        <w:t>Simulation Results</w:t>
-      </w:r>
-    </w:p>
-    <w:p>
-      <w:pPr>
-        <w:pStyle w:val="ListParagraph"/>
-        <w:numPr>
-          <w:ilvl w:val="0"/>
-          <w:numId w:val="1"/>
-        </w:numPr>
-        <w:rPr>
-          <w:lang w:val="en-US"/>
-        </w:rPr>
-      </w:pPr>
-      <w:r>
-        <w:rPr>
-          <w:lang w:val="en-US"/>
-        </w:rPr>
-        <w:t>Conclusion</w:t>
-      </w:r>
-    </w:p>
-    <w:p>
-      <w:pPr>
-        <w:pStyle w:val="ListParagraph"/>
-        <w:numPr>
-          <w:ilvl w:val="0"/>
-          <w:numId w:val="1"/>
-        </w:numPr>
-        <w:rPr>
-          <w:lang w:val="en-US"/>
-        </w:rPr>
-      </w:pPr>
-      <w:r>
-        <w:rPr>
-          <w:lang w:val="en-US"/>
-        </w:rPr>
-        <w:t>Future Scope</w:t>
-      </w:r>
-    </w:p>
-    <w:p>
-      <w:pPr>
-        <w:pStyle w:val="ListParagraph"/>
-        <w:numPr>
-          <w:ilvl w:val="0"/>
-          <w:numId w:val="1"/>
-        </w:numPr>
-        <w:rPr>
-          <w:lang w:val="en-US"/>
-        </w:rPr>
-      </w:pPr>
-      <w:r>
-        <w:rPr>
-          <w:lang w:val="en-US"/>
-        </w:rPr>
-        <w:t>Reference</w:t>
-      </w:r>
-    </w:p>
-    <w:p>
-      <w:pPr>
-        <w:pStyle w:val="ListParagraph"/>
-        <w:numPr>
-          <w:ilvl w:val="0"/>
-          <w:numId w:val="1"/>
-        </w:numPr>
-        <w:rPr>
-          <w:lang w:val="en-US"/>
-        </w:rPr>
-      </w:pPr>
-      <w:r>
-        <w:rPr>
-          <w:lang w:val="en-US"/>
-        </w:rPr>
-        <w:t>Certificate</w:t>
-      </w:r>
-    </w:p>
-    <w:p>
-      <w:pPr>
-        <w:pStyle w:val="ListParagraph"/>
-        <w:numPr>
-          <w:ilvl w:val="0"/>
-          <w:numId w:val="1"/>
-        </w:numPr>
-        <w:rPr>
-          <w:lang w:val="en-US"/>
-        </w:rPr>
-      </w:pPr>
-      <w:r>
-        <w:rPr>
-          <w:lang w:val="en-US"/>
-        </w:rPr>
-        <w:t>Letter of Recommendation</w:t>
-      </w:r>
-    </w:p>
-    <w:p>
-      <w:pPr>
-        <w:pStyle w:val="ListParagraph"/>
-        <w:rPr>
-          <w:lang w:val="en-US"/>
-        </w:rPr>
-      </w:pPr>
-      <w:r>
-        <w:rPr>
-          <w:lang w:val="en-US"/>
-        </w:rPr>
-        <w:t>I will change this content nd will start report writing from tomorrow</w:t>
-      </w:r>
-      <w:r>
-        <w:rPr>
-          <w:lang w:val="en-US"/>
-        </w:rPr>
-        <w:t xml:space="preserve"> will do</w:t>
-      </w:r>
-    </w:p>
-    <w:p>
-      <w:pPr>
-        <w:pStyle w:val="ListParagraph"/>
-        <w:rPr>
+        <w:pStyle w:val="NoSpacing"/>
+        <w:rPr>
+          <w:rStyle w:val="IntenseEmphasis"/>
+          <w:rFonts w:ascii="Times New Roman" w:hAnsi="Times New Roman" w:cs="Times New Roman"/>
+          <w:b/>
+          <w:bCs/>
+          <w:i w:val="0"/>
+          <w:iCs w:val="0"/>
+          <w:sz w:val="40"/>
+          <w:szCs w:val="40"/>
           <w:lang w:val="en-US"/>
         </w:rPr>
       </w:pPr>
@@ -314,6 +301,12 @@
     <w:sectPr>
       <w:pgSz w:w="11906" w:h="16838"/>
       <w:pgMar w:top="1440" w:right="1440" w:bottom="1440" w:left="1440" w:header="708" w:footer="708" w:gutter="0"/>
+      <w:pgBorders w:display="firstPage" w:offsetFrom="page">
+        <w:top w:val="thinThickSmallGap" w:sz="24" w:space="24" w:color="auto"/>
+        <w:left w:val="thinThickSmallGap" w:sz="24" w:space="24" w:color="auto"/>
+        <w:bottom w:val="thinThickSmallGap" w:sz="24" w:space="24" w:color="auto"/>
+        <w:right w:val="thinThickSmallGap" w:sz="24" w:space="24" w:color="auto"/>
+      </w:pgBorders>
       <w:cols w:space="708"/>
       <w:docGrid w:linePitch="360"/>
     </w:sectPr>
@@ -1113,7 +1106,6 @@
   <w:style w:type="character" w:default="1" w:styleId="DefaultParagraphFont">
     <w:name w:val="Default Paragraph Font"/>
     <w:uiPriority w:val="1"/>
-    <w:semiHidden/>
     <w:unhideWhenUsed/>
   </w:style>
   <w:style w:type="table" w:default="1" w:styleId="TableNormal">
@@ -1427,6 +1419,29 @@
       <w:smallCaps/>
       <w:color w:val="2F5496" w:themeColor="accent1" w:themeShade="BF"/>
       <w:spacing w:val="5"/>
+    </w:rPr>
+  </w:style>
+  <w:style w:type="character" w:styleId="Strong">
+    <w:name w:val="Strong"/>
+    <w:basedOn w:val="DefaultParagraphFont"/>
+    <w:uiPriority w:val="22"/>
+    <w:qFormat/>
+    <w:rsid w:val="00D44BD1"/>
+    <w:rPr>
+      <w:b/>
+      <w:bCs/>
+    </w:rPr>
+  </w:style>
+  <w:style w:type="paragraph" w:styleId="NoSpacing">
+    <w:name w:val="No Spacing"/>
+    <w:uiPriority w:val="1"/>
+    <w:qFormat/>
+    <w:rsid w:val="008F63E8"/>
+    <w:pPr>
+      <w:spacing w:after="0" w:line="240" w:lineRule="auto"/>
+    </w:pPr>
+    <w:rPr>
+      <w:rFonts w:cs="Mangal"/>
     </w:rPr>
   </w:style>
 </w:styles>

</xml_diff>

<commit_message>
created introduction for the report
</commit_message>
<xml_diff>
--- a/REPORT/Report.docx
+++ b/REPORT/Report.docx
@@ -7,6 +7,7 @@
         <w:jc w:val="center"/>
         <w:rPr>
           <w:rStyle w:val="Strong"/>
+          <w:rFonts w:ascii="Times New Roman" w:hAnsi="Times New Roman" w:cs="Times New Roman"/>
           <w:sz w:val="40"/>
           <w:szCs w:val="40"/>
           <w:lang w:val="en-US"/>
@@ -15,6 +16,7 @@
       <w:r>
         <w:rPr>
           <w:rStyle w:val="Strong"/>
+          <w:rFonts w:ascii="Times New Roman" w:hAnsi="Times New Roman" w:cs="Times New Roman"/>
           <w:sz w:val="40"/>
           <w:szCs w:val="40"/>
           <w:lang w:val="en-US"/>
@@ -28,6 +30,7 @@
         <w:jc w:val="center"/>
         <w:rPr>
           <w:rStyle w:val="Strong"/>
+          <w:rFonts w:ascii="Times New Roman" w:hAnsi="Times New Roman" w:cs="Times New Roman"/>
           <w:sz w:val="40"/>
           <w:szCs w:val="40"/>
           <w:lang w:val="en-US"/>
@@ -35,6 +38,7 @@
       </w:pPr>
       <w:r>
         <w:rPr>
+          <w:rFonts w:ascii="Times New Roman" w:hAnsi="Times New Roman" w:cs="Times New Roman"/>
           <w:b/>
           <w:bCs/>
           <w:noProof/>
@@ -90,6 +94,7 @@
         <w:pStyle w:val="IntenseQuote"/>
         <w:rPr>
           <w:rStyle w:val="Strong"/>
+          <w:rFonts w:ascii="Times New Roman" w:hAnsi="Times New Roman" w:cs="Times New Roman"/>
           <w:sz w:val="40"/>
           <w:szCs w:val="40"/>
           <w:lang w:val="en-US"/>
@@ -98,6 +103,7 @@
       <w:r>
         <w:rPr>
           <w:rStyle w:val="Strong"/>
+          <w:rFonts w:ascii="Times New Roman" w:hAnsi="Times New Roman" w:cs="Times New Roman"/>
           <w:sz w:val="40"/>
           <w:szCs w:val="40"/>
           <w:lang w:val="en-US"/>
@@ -154,150 +160,2095 @@
           <w:sz w:val="40"/>
           <w:szCs w:val="40"/>
         </w:rPr>
-        <w:t xml:space="preserve">Project: </w:t>
-      </w:r>
-      <w:r>
-        <w:rPr>
-          <w:rStyle w:val="IntenseEmphasis"/>
-          <w:rFonts w:ascii="Times New Roman" w:hAnsi="Times New Roman" w:cs="Times New Roman"/>
-          <w:b/>
-          <w:bCs/>
-          <w:i w:val="0"/>
-          <w:iCs w:val="0"/>
-          <w:sz w:val="40"/>
-          <w:szCs w:val="40"/>
-        </w:rPr>
-        <w:t>Multi-Zone Reflow Oven Temperature Control Using PI Controller</w:t>
-      </w:r>
-    </w:p>
-    <w:p>
-      <w:pPr>
-        <w:rPr>
-          <w:rStyle w:val="IntenseEmphasis"/>
-          <w:rFonts w:ascii="Times New Roman" w:hAnsi="Times New Roman" w:cs="Times New Roman"/>
-          <w:b/>
-          <w:bCs/>
-          <w:i w:val="0"/>
-          <w:iCs w:val="0"/>
-          <w:sz w:val="40"/>
-          <w:szCs w:val="40"/>
-        </w:rPr>
-      </w:pPr>
-    </w:p>
-    <w:p>
-      <w:pPr>
-        <w:rPr>
-          <w:rStyle w:val="IntenseEmphasis"/>
-          <w:rFonts w:ascii="Times New Roman" w:hAnsi="Times New Roman" w:cs="Times New Roman"/>
-          <w:b/>
-          <w:bCs/>
-          <w:i w:val="0"/>
-          <w:iCs w:val="0"/>
-          <w:sz w:val="40"/>
-          <w:szCs w:val="40"/>
-        </w:rPr>
-      </w:pPr>
-    </w:p>
-    <w:p>
-      <w:pPr>
-        <w:rPr>
-          <w:rStyle w:val="IntenseEmphasis"/>
-          <w:rFonts w:ascii="Times New Roman" w:hAnsi="Times New Roman" w:cs="Times New Roman"/>
-          <w:b/>
-          <w:bCs/>
-          <w:i w:val="0"/>
-          <w:iCs w:val="0"/>
-          <w:sz w:val="40"/>
-          <w:szCs w:val="40"/>
-        </w:rPr>
-      </w:pPr>
-    </w:p>
-    <w:p>
-      <w:pPr>
-        <w:rPr>
-          <w:rStyle w:val="IntenseEmphasis"/>
-          <w:rFonts w:ascii="Times New Roman" w:hAnsi="Times New Roman" w:cs="Times New Roman"/>
-          <w:b/>
-          <w:bCs/>
-          <w:i w:val="0"/>
-          <w:iCs w:val="0"/>
-          <w:sz w:val="40"/>
-          <w:szCs w:val="40"/>
-        </w:rPr>
-      </w:pPr>
-    </w:p>
-    <w:p>
-      <w:pPr>
-        <w:rPr>
-          <w:rStyle w:val="IntenseEmphasis"/>
-          <w:rFonts w:ascii="Times New Roman" w:hAnsi="Times New Roman" w:cs="Times New Roman"/>
-          <w:b/>
-          <w:bCs/>
-          <w:i w:val="0"/>
-          <w:iCs w:val="0"/>
-          <w:sz w:val="40"/>
-          <w:szCs w:val="40"/>
-        </w:rPr>
-      </w:pPr>
-    </w:p>
-    <w:p>
-      <w:pPr>
-        <w:rPr>
-          <w:rStyle w:val="IntenseEmphasis"/>
-          <w:rFonts w:ascii="Times New Roman" w:hAnsi="Times New Roman" w:cs="Times New Roman"/>
-          <w:b/>
-          <w:bCs/>
-          <w:i w:val="0"/>
-          <w:iCs w:val="0"/>
-          <w:sz w:val="40"/>
-          <w:szCs w:val="40"/>
-        </w:rPr>
-      </w:pPr>
-    </w:p>
-    <w:p>
-      <w:pPr>
-        <w:rPr>
-          <w:rStyle w:val="IntenseEmphasis"/>
-          <w:rFonts w:ascii="Times New Roman" w:hAnsi="Times New Roman" w:cs="Times New Roman"/>
-          <w:b/>
-          <w:bCs/>
-          <w:i w:val="0"/>
-          <w:iCs w:val="0"/>
-          <w:sz w:val="40"/>
-          <w:szCs w:val="40"/>
-        </w:rPr>
-      </w:pPr>
-    </w:p>
-    <w:p>
-      <w:pPr>
-        <w:rPr>
-          <w:rStyle w:val="IntenseEmphasis"/>
-          <w:rFonts w:ascii="Times New Roman" w:hAnsi="Times New Roman" w:cs="Times New Roman"/>
-          <w:b/>
-          <w:bCs/>
-          <w:i w:val="0"/>
-          <w:iCs w:val="0"/>
-          <w:sz w:val="40"/>
-          <w:szCs w:val="40"/>
-        </w:rPr>
-      </w:pPr>
-    </w:p>
-    <w:p>
-      <w:pPr>
-        <w:pStyle w:val="NoSpacing"/>
-        <w:rPr>
-          <w:rStyle w:val="IntenseEmphasis"/>
-          <w:rFonts w:ascii="Times New Roman" w:hAnsi="Times New Roman" w:cs="Times New Roman"/>
-          <w:b/>
-          <w:bCs/>
-          <w:i w:val="0"/>
-          <w:iCs w:val="0"/>
+        <w:t>Project: Multi-Zone Reflow Oven Temperature Control Using PI Controller</w:t>
+      </w:r>
+    </w:p>
+    <w:p>
+      <w:pPr>
+        <w:jc w:val="center"/>
+        <w:rPr>
+          <w:rFonts w:ascii="Times New Roman" w:hAnsi="Times New Roman" w:cs="Times New Roman"/>
+          <w:b/>
+          <w:bCs/>
           <w:sz w:val="40"/>
           <w:szCs w:val="40"/>
           <w:lang w:val="en-US"/>
         </w:rPr>
       </w:pPr>
     </w:p>
+    <w:p>
+      <w:pPr>
+        <w:jc w:val="center"/>
+        <w:rPr>
+          <w:rFonts w:ascii="Times New Roman" w:hAnsi="Times New Roman" w:cs="Times New Roman"/>
+          <w:b/>
+          <w:bCs/>
+          <w:sz w:val="40"/>
+          <w:szCs w:val="40"/>
+          <w:lang w:val="en-US"/>
+        </w:rPr>
+      </w:pPr>
+      <w:proofErr w:type="spellStart"/>
+      <w:proofErr w:type="gramStart"/>
+      <w:r>
+        <w:rPr>
+          <w:rFonts w:ascii="Times New Roman" w:hAnsi="Times New Roman" w:cs="Times New Roman"/>
+          <w:b/>
+          <w:bCs/>
+          <w:sz w:val="40"/>
+          <w:szCs w:val="40"/>
+          <w:lang w:val="en-US"/>
+        </w:rPr>
+        <w:t>B.Tech</w:t>
+      </w:r>
+      <w:proofErr w:type="spellEnd"/>
+      <w:proofErr w:type="gramEnd"/>
+      <w:r>
+        <w:rPr>
+          <w:rFonts w:ascii="Times New Roman" w:hAnsi="Times New Roman" w:cs="Times New Roman"/>
+          <w:b/>
+          <w:bCs/>
+          <w:sz w:val="40"/>
+          <w:szCs w:val="40"/>
+          <w:lang w:val="en-US"/>
+        </w:rPr>
+        <w:t xml:space="preserve"> 5</w:t>
+      </w:r>
+      <w:r>
+        <w:rPr>
+          <w:rFonts w:ascii="Times New Roman" w:hAnsi="Times New Roman" w:cs="Times New Roman"/>
+          <w:b/>
+          <w:bCs/>
+          <w:sz w:val="40"/>
+          <w:szCs w:val="40"/>
+          <w:vertAlign w:val="superscript"/>
+          <w:lang w:val="en-US"/>
+        </w:rPr>
+        <w:t>th</w:t>
+      </w:r>
+      <w:r>
+        <w:rPr>
+          <w:rFonts w:ascii="Times New Roman" w:hAnsi="Times New Roman" w:cs="Times New Roman"/>
+          <w:b/>
+          <w:bCs/>
+          <w:sz w:val="40"/>
+          <w:szCs w:val="40"/>
+          <w:lang w:val="en-US"/>
+        </w:rPr>
+        <w:t xml:space="preserve"> Semester</w:t>
+      </w:r>
+    </w:p>
+    <w:p>
+      <w:pPr>
+        <w:jc w:val="center"/>
+        <w:rPr>
+          <w:rFonts w:ascii="Times New Roman" w:hAnsi="Times New Roman" w:cs="Times New Roman"/>
+          <w:b/>
+          <w:bCs/>
+          <w:sz w:val="40"/>
+          <w:szCs w:val="40"/>
+          <w:lang w:val="en-US"/>
+        </w:rPr>
+      </w:pPr>
+      <w:r>
+        <w:rPr>
+          <w:rFonts w:ascii="Times New Roman" w:hAnsi="Times New Roman" w:cs="Times New Roman"/>
+          <w:b/>
+          <w:bCs/>
+          <w:sz w:val="40"/>
+          <w:szCs w:val="40"/>
+          <w:lang w:val="en-US"/>
+        </w:rPr>
+        <w:t>Session: 2026-2027</w:t>
+      </w:r>
+    </w:p>
+    <w:p>
+      <w:pPr>
+        <w:jc w:val="center"/>
+        <w:rPr>
+          <w:rFonts w:ascii="Times New Roman" w:hAnsi="Times New Roman" w:cs="Times New Roman"/>
+          <w:b/>
+          <w:bCs/>
+          <w:sz w:val="40"/>
+          <w:szCs w:val="40"/>
+          <w:lang w:val="en-US"/>
+        </w:rPr>
+      </w:pPr>
+    </w:p>
+    <w:p>
+      <w:pPr>
+        <w:rPr>
+          <w:rFonts w:ascii="Times New Roman" w:hAnsi="Times New Roman" w:cs="Times New Roman"/>
+          <w:b/>
+          <w:bCs/>
+          <w:i/>
+          <w:iCs/>
+          <w:sz w:val="40"/>
+          <w:szCs w:val="40"/>
+          <w:lang w:val="en-US"/>
+        </w:rPr>
+      </w:pPr>
+      <w:r>
+        <w:rPr>
+          <w:rFonts w:ascii="Times New Roman" w:hAnsi="Times New Roman" w:cs="Times New Roman"/>
+          <w:b/>
+          <w:bCs/>
+          <w:i/>
+          <w:iCs/>
+          <w:sz w:val="40"/>
+          <w:szCs w:val="40"/>
+          <w:lang w:val="en-US"/>
+        </w:rPr>
+        <w:t>Submitted by:                                      Submitted to:</w:t>
+      </w:r>
+    </w:p>
+    <w:p>
+      <w:pPr>
+        <w:rPr>
+          <w:rFonts w:ascii="Times New Roman" w:hAnsi="Times New Roman" w:cs="Times New Roman"/>
+          <w:b/>
+          <w:bCs/>
+          <w:sz w:val="40"/>
+          <w:szCs w:val="40"/>
+          <w:lang w:val="en-US"/>
+        </w:rPr>
+      </w:pPr>
+      <w:r>
+        <w:rPr>
+          <w:rFonts w:ascii="Times New Roman" w:hAnsi="Times New Roman" w:cs="Times New Roman"/>
+          <w:b/>
+          <w:bCs/>
+          <w:sz w:val="40"/>
+          <w:szCs w:val="40"/>
+          <w:lang w:val="en-US"/>
+        </w:rPr>
+        <w:t>Preeti Sharma</w:t>
+      </w:r>
+    </w:p>
+    <w:p>
+      <w:pPr>
+        <w:rPr>
+          <w:rStyle w:val="IntenseEmphasis"/>
+          <w:rFonts w:ascii="Times New Roman" w:hAnsi="Times New Roman" w:cs="Times New Roman"/>
+          <w:b/>
+          <w:bCs/>
+          <w:i w:val="0"/>
+          <w:iCs w:val="0"/>
+          <w:color w:val="auto"/>
+          <w:sz w:val="40"/>
+          <w:szCs w:val="40"/>
+          <w:lang w:val="en-US"/>
+        </w:rPr>
+      </w:pPr>
+      <w:r>
+        <w:rPr>
+          <w:rFonts w:ascii="Times New Roman" w:hAnsi="Times New Roman" w:cs="Times New Roman"/>
+          <w:b/>
+          <w:bCs/>
+          <w:sz w:val="40"/>
+          <w:szCs w:val="40"/>
+          <w:lang w:val="en-US"/>
+        </w:rPr>
+        <w:t>Roll no.: 24106069</w:t>
+      </w:r>
+    </w:p>
+    <w:p>
+      <w:pPr>
+        <w:pStyle w:val="IntenseQuote"/>
+        <w:rPr>
+          <w:rStyle w:val="IntenseEmphasis"/>
+          <w:rFonts w:ascii="Times New Roman" w:hAnsi="Times New Roman" w:cs="Times New Roman"/>
+          <w:b/>
+          <w:bCs/>
+          <w:sz w:val="56"/>
+          <w:szCs w:val="56"/>
+        </w:rPr>
+      </w:pPr>
+      <w:r>
+        <w:rPr>
+          <w:rStyle w:val="IntenseEmphasis"/>
+          <w:rFonts w:ascii="Times New Roman" w:hAnsi="Times New Roman" w:cs="Times New Roman"/>
+          <w:b/>
+          <w:bCs/>
+          <w:sz w:val="56"/>
+          <w:szCs w:val="56"/>
+        </w:rPr>
+        <w:lastRenderedPageBreak/>
+        <w:t>Table of Contents</w:t>
+      </w:r>
+    </w:p>
+    <w:p>
+      <w:pPr>
+        <w:pStyle w:val="ListParagraph"/>
+        <w:numPr>
+          <w:ilvl w:val="0"/>
+          <w:numId w:val="3"/>
+        </w:numPr>
+        <w:jc w:val="both"/>
+        <w:rPr>
+          <w:rFonts w:ascii="Times New Roman" w:hAnsi="Times New Roman" w:cs="Times New Roman"/>
+          <w:b/>
+          <w:bCs/>
+          <w:sz w:val="24"/>
+          <w:szCs w:val="24"/>
+        </w:rPr>
+      </w:pPr>
+      <w:r>
+        <w:rPr>
+          <w:rFonts w:ascii="Times New Roman" w:hAnsi="Times New Roman" w:cs="Times New Roman"/>
+          <w:b/>
+          <w:bCs/>
+          <w:sz w:val="24"/>
+          <w:szCs w:val="24"/>
+        </w:rPr>
+        <w:t>Acknowledgment</w:t>
+      </w:r>
+    </w:p>
+    <w:p>
+      <w:pPr>
+        <w:pStyle w:val="ListParagraph"/>
+        <w:numPr>
+          <w:ilvl w:val="0"/>
+          <w:numId w:val="3"/>
+        </w:numPr>
+        <w:jc w:val="both"/>
+        <w:rPr>
+          <w:rFonts w:ascii="Times New Roman" w:hAnsi="Times New Roman" w:cs="Times New Roman"/>
+          <w:b/>
+          <w:bCs/>
+          <w:sz w:val="24"/>
+          <w:szCs w:val="24"/>
+        </w:rPr>
+      </w:pPr>
+      <w:r>
+        <w:rPr>
+          <w:rFonts w:ascii="Times New Roman" w:hAnsi="Times New Roman" w:cs="Times New Roman"/>
+          <w:b/>
+          <w:bCs/>
+          <w:sz w:val="24"/>
+          <w:szCs w:val="24"/>
+        </w:rPr>
+        <w:t>Introduction</w:t>
+      </w:r>
+    </w:p>
+    <w:p>
+      <w:pPr>
+        <w:pStyle w:val="ListParagraph"/>
+        <w:numPr>
+          <w:ilvl w:val="0"/>
+          <w:numId w:val="3"/>
+        </w:numPr>
+        <w:jc w:val="both"/>
+        <w:rPr>
+          <w:rFonts w:ascii="Times New Roman" w:hAnsi="Times New Roman" w:cs="Times New Roman"/>
+          <w:b/>
+          <w:bCs/>
+          <w:sz w:val="24"/>
+          <w:szCs w:val="24"/>
+        </w:rPr>
+      </w:pPr>
+      <w:r>
+        <w:rPr>
+          <w:rFonts w:ascii="Times New Roman" w:hAnsi="Times New Roman" w:cs="Times New Roman"/>
+          <w:b/>
+          <w:bCs/>
+          <w:sz w:val="24"/>
+          <w:szCs w:val="24"/>
+        </w:rPr>
+        <w:t>Objective of Internship</w:t>
+      </w:r>
+    </w:p>
+    <w:p>
+      <w:pPr>
+        <w:pStyle w:val="ListParagraph"/>
+        <w:numPr>
+          <w:ilvl w:val="0"/>
+          <w:numId w:val="3"/>
+        </w:numPr>
+        <w:jc w:val="both"/>
+        <w:rPr>
+          <w:rFonts w:ascii="Times New Roman" w:hAnsi="Times New Roman" w:cs="Times New Roman"/>
+          <w:b/>
+          <w:bCs/>
+          <w:sz w:val="24"/>
+          <w:szCs w:val="24"/>
+        </w:rPr>
+      </w:pPr>
+      <w:r>
+        <w:rPr>
+          <w:rFonts w:ascii="Times New Roman" w:hAnsi="Times New Roman" w:cs="Times New Roman"/>
+          <w:b/>
+          <w:bCs/>
+          <w:sz w:val="24"/>
+          <w:szCs w:val="24"/>
+        </w:rPr>
+        <w:t>Company Profile</w:t>
+      </w:r>
+    </w:p>
+    <w:p>
+      <w:pPr>
+        <w:pStyle w:val="ListParagraph"/>
+        <w:numPr>
+          <w:ilvl w:val="0"/>
+          <w:numId w:val="4"/>
+        </w:numPr>
+        <w:jc w:val="both"/>
+        <w:rPr>
+          <w:rFonts w:ascii="Times New Roman" w:hAnsi="Times New Roman" w:cs="Times New Roman"/>
+          <w:sz w:val="24"/>
+          <w:szCs w:val="24"/>
+        </w:rPr>
+      </w:pPr>
+      <w:r>
+        <w:rPr>
+          <w:rFonts w:ascii="Times New Roman" w:hAnsi="Times New Roman" w:cs="Times New Roman"/>
+          <w:sz w:val="24"/>
+          <w:szCs w:val="24"/>
+        </w:rPr>
+        <w:t>About Elin Electronics</w:t>
+      </w:r>
+    </w:p>
+    <w:p>
+      <w:pPr>
+        <w:pStyle w:val="ListParagraph"/>
+        <w:numPr>
+          <w:ilvl w:val="0"/>
+          <w:numId w:val="4"/>
+        </w:numPr>
+        <w:jc w:val="both"/>
+        <w:rPr>
+          <w:rFonts w:ascii="Times New Roman" w:hAnsi="Times New Roman" w:cs="Times New Roman"/>
+          <w:sz w:val="24"/>
+          <w:szCs w:val="24"/>
+        </w:rPr>
+      </w:pPr>
+      <w:r>
+        <w:rPr>
+          <w:rFonts w:ascii="Times New Roman" w:hAnsi="Times New Roman" w:cs="Times New Roman"/>
+          <w:sz w:val="24"/>
+          <w:szCs w:val="24"/>
+        </w:rPr>
+        <w:t>Organizational Overview</w:t>
+      </w:r>
+    </w:p>
+    <w:p>
+      <w:pPr>
+        <w:pStyle w:val="ListParagraph"/>
+        <w:numPr>
+          <w:ilvl w:val="0"/>
+          <w:numId w:val="4"/>
+        </w:numPr>
+        <w:jc w:val="both"/>
+        <w:rPr>
+          <w:rFonts w:ascii="Times New Roman" w:hAnsi="Times New Roman" w:cs="Times New Roman"/>
+          <w:sz w:val="24"/>
+          <w:szCs w:val="24"/>
+        </w:rPr>
+      </w:pPr>
+      <w:r>
+        <w:rPr>
+          <w:rFonts w:ascii="Times New Roman" w:hAnsi="Times New Roman" w:cs="Times New Roman"/>
+          <w:sz w:val="24"/>
+          <w:szCs w:val="24"/>
+        </w:rPr>
+        <w:t>Products and Services</w:t>
+      </w:r>
+    </w:p>
+    <w:p>
+      <w:pPr>
+        <w:pStyle w:val="ListParagraph"/>
+        <w:numPr>
+          <w:ilvl w:val="0"/>
+          <w:numId w:val="3"/>
+        </w:numPr>
+        <w:jc w:val="both"/>
+        <w:rPr>
+          <w:rFonts w:ascii="Times New Roman" w:hAnsi="Times New Roman" w:cs="Times New Roman"/>
+          <w:b/>
+          <w:bCs/>
+          <w:sz w:val="24"/>
+          <w:szCs w:val="24"/>
+        </w:rPr>
+      </w:pPr>
+      <w:r>
+        <w:rPr>
+          <w:rFonts w:ascii="Times New Roman" w:hAnsi="Times New Roman" w:cs="Times New Roman"/>
+          <w:b/>
+          <w:bCs/>
+          <w:sz w:val="24"/>
+          <w:szCs w:val="24"/>
+        </w:rPr>
+        <w:t>Project Focus Area</w:t>
+      </w:r>
+    </w:p>
+    <w:p>
+      <w:pPr>
+        <w:pStyle w:val="ListParagraph"/>
+        <w:numPr>
+          <w:ilvl w:val="0"/>
+          <w:numId w:val="5"/>
+        </w:numPr>
+        <w:jc w:val="both"/>
+        <w:rPr>
+          <w:rFonts w:ascii="Times New Roman" w:hAnsi="Times New Roman" w:cs="Times New Roman"/>
+          <w:sz w:val="24"/>
+          <w:szCs w:val="24"/>
+        </w:rPr>
+      </w:pPr>
+      <w:r>
+        <w:rPr>
+          <w:rFonts w:ascii="Times New Roman" w:hAnsi="Times New Roman" w:cs="Times New Roman"/>
+          <w:sz w:val="24"/>
+          <w:szCs w:val="24"/>
+        </w:rPr>
+        <w:t>Reflow Oven</w:t>
+      </w:r>
+    </w:p>
+    <w:p>
+      <w:pPr>
+        <w:pStyle w:val="ListParagraph"/>
+        <w:numPr>
+          <w:ilvl w:val="0"/>
+          <w:numId w:val="5"/>
+        </w:numPr>
+        <w:jc w:val="both"/>
+        <w:rPr>
+          <w:rFonts w:ascii="Times New Roman" w:hAnsi="Times New Roman" w:cs="Times New Roman"/>
+          <w:sz w:val="24"/>
+          <w:szCs w:val="24"/>
+        </w:rPr>
+      </w:pPr>
+      <w:r>
+        <w:rPr>
+          <w:rFonts w:ascii="Times New Roman" w:hAnsi="Times New Roman" w:cs="Times New Roman"/>
+          <w:sz w:val="24"/>
+          <w:szCs w:val="24"/>
+        </w:rPr>
+        <w:t>Surface Mount Technology (SMT)</w:t>
+      </w:r>
+    </w:p>
+    <w:p>
+      <w:pPr>
+        <w:pStyle w:val="ListParagraph"/>
+        <w:numPr>
+          <w:ilvl w:val="0"/>
+          <w:numId w:val="5"/>
+        </w:numPr>
+        <w:jc w:val="both"/>
+        <w:rPr>
+          <w:rFonts w:ascii="Times New Roman" w:hAnsi="Times New Roman" w:cs="Times New Roman"/>
+          <w:sz w:val="24"/>
+          <w:szCs w:val="24"/>
+        </w:rPr>
+      </w:pPr>
+      <w:r>
+        <w:rPr>
+          <w:rFonts w:ascii="Times New Roman" w:hAnsi="Times New Roman" w:cs="Times New Roman"/>
+          <w:sz w:val="24"/>
+          <w:szCs w:val="24"/>
+        </w:rPr>
+        <w:t>Temperature Profile Tracking</w:t>
+      </w:r>
+    </w:p>
+    <w:p>
+      <w:pPr>
+        <w:pStyle w:val="ListParagraph"/>
+        <w:numPr>
+          <w:ilvl w:val="0"/>
+          <w:numId w:val="5"/>
+        </w:numPr>
+        <w:jc w:val="both"/>
+        <w:rPr>
+          <w:rFonts w:ascii="Times New Roman" w:hAnsi="Times New Roman" w:cs="Times New Roman"/>
+          <w:sz w:val="24"/>
+          <w:szCs w:val="24"/>
+        </w:rPr>
+      </w:pPr>
+      <w:r>
+        <w:rPr>
+          <w:rFonts w:ascii="Times New Roman" w:hAnsi="Times New Roman" w:cs="Times New Roman"/>
+          <w:sz w:val="24"/>
+          <w:szCs w:val="24"/>
+        </w:rPr>
+        <w:t>Multi-Zone Temperature</w:t>
+      </w:r>
+      <w:r>
+        <w:rPr>
+          <w:rFonts w:ascii="Times New Roman" w:hAnsi="Times New Roman" w:cs="Times New Roman"/>
+          <w:sz w:val="24"/>
+          <w:szCs w:val="24"/>
+        </w:rPr>
+        <w:t xml:space="preserve"> Control</w:t>
+      </w:r>
+    </w:p>
+    <w:p>
+      <w:pPr>
+        <w:pStyle w:val="ListParagraph"/>
+        <w:numPr>
+          <w:ilvl w:val="0"/>
+          <w:numId w:val="3"/>
+        </w:numPr>
+        <w:jc w:val="both"/>
+        <w:rPr>
+          <w:rFonts w:ascii="Times New Roman" w:hAnsi="Times New Roman" w:cs="Times New Roman"/>
+          <w:b/>
+          <w:bCs/>
+          <w:sz w:val="24"/>
+          <w:szCs w:val="24"/>
+        </w:rPr>
+      </w:pPr>
+      <w:r>
+        <w:rPr>
+          <w:rFonts w:ascii="Times New Roman" w:hAnsi="Times New Roman" w:cs="Times New Roman"/>
+          <w:b/>
+          <w:bCs/>
+          <w:sz w:val="24"/>
+          <w:szCs w:val="24"/>
+        </w:rPr>
+        <w:t>Internship Roles and Responsibilities</w:t>
+      </w:r>
+    </w:p>
+    <w:p>
+      <w:pPr>
+        <w:pStyle w:val="ListParagraph"/>
+        <w:numPr>
+          <w:ilvl w:val="0"/>
+          <w:numId w:val="6"/>
+        </w:numPr>
+        <w:jc w:val="both"/>
+        <w:rPr>
+          <w:rFonts w:ascii="Times New Roman" w:hAnsi="Times New Roman" w:cs="Times New Roman"/>
+          <w:sz w:val="24"/>
+          <w:szCs w:val="24"/>
+        </w:rPr>
+      </w:pPr>
+      <w:r>
+        <w:rPr>
+          <w:rFonts w:ascii="Times New Roman" w:hAnsi="Times New Roman" w:cs="Times New Roman"/>
+          <w:sz w:val="24"/>
+          <w:szCs w:val="24"/>
+        </w:rPr>
+        <w:t>Understanding the Reflow Oven Process</w:t>
+      </w:r>
+    </w:p>
+    <w:p>
+      <w:pPr>
+        <w:pStyle w:val="ListParagraph"/>
+        <w:numPr>
+          <w:ilvl w:val="0"/>
+          <w:numId w:val="6"/>
+        </w:numPr>
+        <w:jc w:val="both"/>
+        <w:rPr>
+          <w:rFonts w:ascii="Times New Roman" w:hAnsi="Times New Roman" w:cs="Times New Roman"/>
+          <w:sz w:val="24"/>
+          <w:szCs w:val="24"/>
+        </w:rPr>
+      </w:pPr>
+      <w:r>
+        <w:rPr>
+          <w:rFonts w:ascii="Times New Roman" w:hAnsi="Times New Roman" w:cs="Times New Roman"/>
+          <w:sz w:val="24"/>
+          <w:szCs w:val="24"/>
+        </w:rPr>
+        <w:t xml:space="preserve">Mathematical </w:t>
+      </w:r>
+      <w:proofErr w:type="spellStart"/>
+      <w:r>
+        <w:rPr>
+          <w:rFonts w:ascii="Times New Roman" w:hAnsi="Times New Roman" w:cs="Times New Roman"/>
+          <w:sz w:val="24"/>
+          <w:szCs w:val="24"/>
+        </w:rPr>
+        <w:t>Modeling</w:t>
+      </w:r>
+      <w:proofErr w:type="spellEnd"/>
+      <w:r>
+        <w:rPr>
+          <w:rFonts w:ascii="Times New Roman" w:hAnsi="Times New Roman" w:cs="Times New Roman"/>
+          <w:sz w:val="24"/>
+          <w:szCs w:val="24"/>
+        </w:rPr>
+        <w:t xml:space="preserve"> of the Thermal System</w:t>
+      </w:r>
+    </w:p>
+    <w:p>
+      <w:pPr>
+        <w:pStyle w:val="ListParagraph"/>
+        <w:numPr>
+          <w:ilvl w:val="0"/>
+          <w:numId w:val="6"/>
+        </w:numPr>
+        <w:jc w:val="both"/>
+        <w:rPr>
+          <w:rFonts w:ascii="Times New Roman" w:hAnsi="Times New Roman" w:cs="Times New Roman"/>
+          <w:sz w:val="24"/>
+          <w:szCs w:val="24"/>
+        </w:rPr>
+      </w:pPr>
+      <w:r>
+        <w:rPr>
+          <w:rFonts w:ascii="Times New Roman" w:hAnsi="Times New Roman" w:cs="Times New Roman"/>
+          <w:sz w:val="24"/>
+          <w:szCs w:val="24"/>
+        </w:rPr>
+        <w:t>PI Controller Design</w:t>
+      </w:r>
+    </w:p>
+    <w:p>
+      <w:pPr>
+        <w:pStyle w:val="ListParagraph"/>
+        <w:numPr>
+          <w:ilvl w:val="0"/>
+          <w:numId w:val="6"/>
+        </w:numPr>
+        <w:jc w:val="both"/>
+        <w:rPr>
+          <w:rFonts w:ascii="Times New Roman" w:hAnsi="Times New Roman" w:cs="Times New Roman"/>
+          <w:sz w:val="24"/>
+          <w:szCs w:val="24"/>
+        </w:rPr>
+      </w:pPr>
+      <w:r>
+        <w:rPr>
+          <w:rFonts w:ascii="Times New Roman" w:hAnsi="Times New Roman" w:cs="Times New Roman"/>
+          <w:sz w:val="24"/>
+          <w:szCs w:val="24"/>
+        </w:rPr>
+        <w:t>MATLAB/Simulink Model Development</w:t>
+      </w:r>
+    </w:p>
+    <w:p>
+      <w:pPr>
+        <w:pStyle w:val="ListParagraph"/>
+        <w:numPr>
+          <w:ilvl w:val="0"/>
+          <w:numId w:val="6"/>
+        </w:numPr>
+        <w:jc w:val="both"/>
+        <w:rPr>
+          <w:rFonts w:ascii="Times New Roman" w:hAnsi="Times New Roman" w:cs="Times New Roman"/>
+          <w:sz w:val="24"/>
+          <w:szCs w:val="24"/>
+        </w:rPr>
+      </w:pPr>
+      <w:r>
+        <w:rPr>
+          <w:rFonts w:ascii="Times New Roman" w:hAnsi="Times New Roman" w:cs="Times New Roman"/>
+          <w:sz w:val="24"/>
+          <w:szCs w:val="24"/>
+        </w:rPr>
+        <w:t>Performance Analysis and Testing</w:t>
+      </w:r>
+    </w:p>
+    <w:p>
+      <w:pPr>
+        <w:pStyle w:val="ListParagraph"/>
+        <w:numPr>
+          <w:ilvl w:val="0"/>
+          <w:numId w:val="6"/>
+        </w:numPr>
+        <w:jc w:val="both"/>
+        <w:rPr>
+          <w:rFonts w:ascii="Times New Roman" w:hAnsi="Times New Roman" w:cs="Times New Roman"/>
+          <w:sz w:val="24"/>
+          <w:szCs w:val="24"/>
+        </w:rPr>
+      </w:pPr>
+      <w:r>
+        <w:rPr>
+          <w:rFonts w:ascii="Times New Roman" w:hAnsi="Times New Roman" w:cs="Times New Roman"/>
+          <w:sz w:val="24"/>
+          <w:szCs w:val="24"/>
+        </w:rPr>
+        <w:t>Dashboard Development</w:t>
+      </w:r>
+    </w:p>
+    <w:p>
+      <w:pPr>
+        <w:pStyle w:val="ListParagraph"/>
+        <w:numPr>
+          <w:ilvl w:val="0"/>
+          <w:numId w:val="3"/>
+        </w:numPr>
+        <w:jc w:val="both"/>
+        <w:rPr>
+          <w:rFonts w:ascii="Times New Roman" w:hAnsi="Times New Roman" w:cs="Times New Roman"/>
+          <w:b/>
+          <w:bCs/>
+          <w:sz w:val="24"/>
+          <w:szCs w:val="24"/>
+        </w:rPr>
+      </w:pPr>
+      <w:r>
+        <w:rPr>
+          <w:rFonts w:ascii="Times New Roman" w:hAnsi="Times New Roman" w:cs="Times New Roman"/>
+          <w:b/>
+          <w:bCs/>
+          <w:sz w:val="24"/>
+          <w:szCs w:val="24"/>
+        </w:rPr>
+        <w:t>Project: Multi-Zone Reflow Oven Temperature Control using PI Controller</w:t>
+      </w:r>
+    </w:p>
+    <w:p>
+      <w:pPr>
+        <w:pStyle w:val="ListParagraph"/>
+        <w:numPr>
+          <w:ilvl w:val="0"/>
+          <w:numId w:val="7"/>
+        </w:numPr>
+        <w:jc w:val="both"/>
+        <w:rPr>
+          <w:rFonts w:ascii="Times New Roman" w:hAnsi="Times New Roman" w:cs="Times New Roman"/>
+          <w:sz w:val="24"/>
+          <w:szCs w:val="24"/>
+        </w:rPr>
+      </w:pPr>
+      <w:r>
+        <w:rPr>
+          <w:rFonts w:ascii="Times New Roman" w:hAnsi="Times New Roman" w:cs="Times New Roman"/>
+          <w:sz w:val="24"/>
+          <w:szCs w:val="24"/>
+        </w:rPr>
+        <w:t>Problem Statement</w:t>
+      </w:r>
+    </w:p>
+    <w:p>
+      <w:pPr>
+        <w:pStyle w:val="ListParagraph"/>
+        <w:numPr>
+          <w:ilvl w:val="0"/>
+          <w:numId w:val="7"/>
+        </w:numPr>
+        <w:jc w:val="both"/>
+        <w:rPr>
+          <w:rFonts w:ascii="Times New Roman" w:hAnsi="Times New Roman" w:cs="Times New Roman"/>
+          <w:sz w:val="24"/>
+          <w:szCs w:val="24"/>
+        </w:rPr>
+      </w:pPr>
+      <w:r>
+        <w:rPr>
+          <w:rFonts w:ascii="Times New Roman" w:hAnsi="Times New Roman" w:cs="Times New Roman"/>
+          <w:sz w:val="24"/>
+          <w:szCs w:val="24"/>
+        </w:rPr>
+        <w:t>Literature Overview</w:t>
+      </w:r>
+    </w:p>
+    <w:p>
+      <w:pPr>
+        <w:pStyle w:val="ListParagraph"/>
+        <w:numPr>
+          <w:ilvl w:val="0"/>
+          <w:numId w:val="7"/>
+        </w:numPr>
+        <w:jc w:val="both"/>
+        <w:rPr>
+          <w:rFonts w:ascii="Times New Roman" w:hAnsi="Times New Roman" w:cs="Times New Roman"/>
+          <w:sz w:val="24"/>
+          <w:szCs w:val="24"/>
+        </w:rPr>
+      </w:pPr>
+      <w:r>
+        <w:rPr>
+          <w:rFonts w:ascii="Times New Roman" w:hAnsi="Times New Roman" w:cs="Times New Roman"/>
+          <w:sz w:val="24"/>
+          <w:szCs w:val="24"/>
+        </w:rPr>
+        <w:t xml:space="preserve">System </w:t>
+      </w:r>
+      <w:proofErr w:type="spellStart"/>
+      <w:r>
+        <w:rPr>
+          <w:rFonts w:ascii="Times New Roman" w:hAnsi="Times New Roman" w:cs="Times New Roman"/>
+          <w:sz w:val="24"/>
+          <w:szCs w:val="24"/>
+        </w:rPr>
+        <w:t>Modeling</w:t>
+      </w:r>
+      <w:proofErr w:type="spellEnd"/>
+    </w:p>
+    <w:p>
+      <w:pPr>
+        <w:pStyle w:val="ListParagraph"/>
+        <w:numPr>
+          <w:ilvl w:val="0"/>
+          <w:numId w:val="7"/>
+        </w:numPr>
+        <w:jc w:val="both"/>
+        <w:rPr>
+          <w:rFonts w:ascii="Times New Roman" w:hAnsi="Times New Roman" w:cs="Times New Roman"/>
+          <w:sz w:val="24"/>
+          <w:szCs w:val="24"/>
+        </w:rPr>
+      </w:pPr>
+      <w:r>
+        <w:rPr>
+          <w:rFonts w:ascii="Times New Roman" w:hAnsi="Times New Roman" w:cs="Times New Roman"/>
+          <w:sz w:val="24"/>
+          <w:szCs w:val="24"/>
+        </w:rPr>
+        <w:t>Transfer Function Development</w:t>
+      </w:r>
+    </w:p>
+    <w:p>
+      <w:pPr>
+        <w:pStyle w:val="ListParagraph"/>
+        <w:numPr>
+          <w:ilvl w:val="0"/>
+          <w:numId w:val="7"/>
+        </w:numPr>
+        <w:jc w:val="both"/>
+        <w:rPr>
+          <w:rFonts w:ascii="Times New Roman" w:hAnsi="Times New Roman" w:cs="Times New Roman"/>
+          <w:sz w:val="24"/>
+          <w:szCs w:val="24"/>
+        </w:rPr>
+      </w:pPr>
+      <w:r>
+        <w:rPr>
+          <w:rFonts w:ascii="Times New Roman" w:hAnsi="Times New Roman" w:cs="Times New Roman"/>
+          <w:sz w:val="24"/>
+          <w:szCs w:val="24"/>
+        </w:rPr>
+        <w:t>PI Controller Design</w:t>
+      </w:r>
+    </w:p>
+    <w:p>
+      <w:pPr>
+        <w:pStyle w:val="ListParagraph"/>
+        <w:numPr>
+          <w:ilvl w:val="0"/>
+          <w:numId w:val="7"/>
+        </w:numPr>
+        <w:jc w:val="both"/>
+        <w:rPr>
+          <w:rFonts w:ascii="Times New Roman" w:hAnsi="Times New Roman" w:cs="Times New Roman"/>
+          <w:sz w:val="24"/>
+          <w:szCs w:val="24"/>
+        </w:rPr>
+      </w:pPr>
+      <w:r>
+        <w:rPr>
+          <w:rFonts w:ascii="Times New Roman" w:hAnsi="Times New Roman" w:cs="Times New Roman"/>
+          <w:sz w:val="24"/>
+          <w:szCs w:val="24"/>
+        </w:rPr>
+        <w:t>Manual PI Tuning</w:t>
+      </w:r>
+    </w:p>
+    <w:p>
+      <w:pPr>
+        <w:pStyle w:val="ListParagraph"/>
+        <w:numPr>
+          <w:ilvl w:val="0"/>
+          <w:numId w:val="7"/>
+        </w:numPr>
+        <w:jc w:val="both"/>
+        <w:rPr>
+          <w:rFonts w:ascii="Times New Roman" w:hAnsi="Times New Roman" w:cs="Times New Roman"/>
+          <w:sz w:val="24"/>
+          <w:szCs w:val="24"/>
+        </w:rPr>
+      </w:pPr>
+      <w:r>
+        <w:rPr>
+          <w:rFonts w:ascii="Times New Roman" w:hAnsi="Times New Roman" w:cs="Times New Roman"/>
+          <w:sz w:val="24"/>
+          <w:szCs w:val="24"/>
+        </w:rPr>
+        <w:t xml:space="preserve">Automatic PI Tuning using </w:t>
+      </w:r>
+      <w:proofErr w:type="spellStart"/>
+      <w:proofErr w:type="gramStart"/>
+      <w:r>
+        <w:rPr>
+          <w:rFonts w:ascii="Times New Roman" w:hAnsi="Times New Roman" w:cs="Times New Roman"/>
+          <w:sz w:val="24"/>
+          <w:szCs w:val="24"/>
+        </w:rPr>
+        <w:t>pidtune</w:t>
+      </w:r>
+      <w:proofErr w:type="spellEnd"/>
+      <w:r>
+        <w:rPr>
+          <w:rFonts w:ascii="Times New Roman" w:hAnsi="Times New Roman" w:cs="Times New Roman"/>
+          <w:sz w:val="24"/>
+          <w:szCs w:val="24"/>
+        </w:rPr>
+        <w:t>(</w:t>
+      </w:r>
+      <w:proofErr w:type="gramEnd"/>
+      <w:r>
+        <w:rPr>
+          <w:rFonts w:ascii="Times New Roman" w:hAnsi="Times New Roman" w:cs="Times New Roman"/>
+          <w:sz w:val="24"/>
+          <w:szCs w:val="24"/>
+        </w:rPr>
+        <w:t>)</w:t>
+      </w:r>
+    </w:p>
+    <w:p>
+      <w:pPr>
+        <w:pStyle w:val="ListParagraph"/>
+        <w:numPr>
+          <w:ilvl w:val="0"/>
+          <w:numId w:val="7"/>
+        </w:numPr>
+        <w:jc w:val="both"/>
+        <w:rPr>
+          <w:rFonts w:ascii="Times New Roman" w:hAnsi="Times New Roman" w:cs="Times New Roman"/>
+          <w:sz w:val="24"/>
+          <w:szCs w:val="24"/>
+        </w:rPr>
+      </w:pPr>
+      <w:r>
+        <w:rPr>
+          <w:rFonts w:ascii="Times New Roman" w:hAnsi="Times New Roman" w:cs="Times New Roman"/>
+          <w:sz w:val="24"/>
+          <w:szCs w:val="24"/>
+        </w:rPr>
+        <w:t>Temperature Profile Tracking</w:t>
+      </w:r>
+    </w:p>
+    <w:p>
+      <w:pPr>
+        <w:pStyle w:val="ListParagraph"/>
+        <w:numPr>
+          <w:ilvl w:val="0"/>
+          <w:numId w:val="7"/>
+        </w:numPr>
+        <w:jc w:val="both"/>
+        <w:rPr>
+          <w:rFonts w:ascii="Times New Roman" w:hAnsi="Times New Roman" w:cs="Times New Roman"/>
+          <w:sz w:val="24"/>
+          <w:szCs w:val="24"/>
+        </w:rPr>
+      </w:pPr>
+      <w:r>
+        <w:rPr>
+          <w:rFonts w:ascii="Times New Roman" w:hAnsi="Times New Roman" w:cs="Times New Roman"/>
+          <w:sz w:val="24"/>
+          <w:szCs w:val="24"/>
+        </w:rPr>
+        <w:t>Time Constant Comparison</w:t>
+      </w:r>
+    </w:p>
+    <w:p>
+      <w:pPr>
+        <w:pStyle w:val="ListParagraph"/>
+        <w:numPr>
+          <w:ilvl w:val="0"/>
+          <w:numId w:val="7"/>
+        </w:numPr>
+        <w:jc w:val="both"/>
+        <w:rPr>
+          <w:rFonts w:ascii="Times New Roman" w:hAnsi="Times New Roman" w:cs="Times New Roman"/>
+          <w:sz w:val="24"/>
+          <w:szCs w:val="24"/>
+        </w:rPr>
+      </w:pPr>
+      <w:r>
+        <w:rPr>
+          <w:rFonts w:ascii="Times New Roman" w:hAnsi="Times New Roman" w:cs="Times New Roman"/>
+          <w:sz w:val="24"/>
+          <w:szCs w:val="24"/>
+        </w:rPr>
+        <w:t>Disturbance Analysis</w:t>
+      </w:r>
+    </w:p>
+    <w:p>
+      <w:pPr>
+        <w:pStyle w:val="ListParagraph"/>
+        <w:numPr>
+          <w:ilvl w:val="0"/>
+          <w:numId w:val="7"/>
+        </w:numPr>
+        <w:jc w:val="both"/>
+        <w:rPr>
+          <w:rFonts w:ascii="Times New Roman" w:hAnsi="Times New Roman" w:cs="Times New Roman"/>
+          <w:sz w:val="24"/>
+          <w:szCs w:val="24"/>
+        </w:rPr>
+      </w:pPr>
+      <w:r>
+        <w:rPr>
+          <w:rFonts w:ascii="Times New Roman" w:hAnsi="Times New Roman" w:cs="Times New Roman"/>
+          <w:sz w:val="24"/>
+          <w:szCs w:val="24"/>
+        </w:rPr>
+        <w:t>Dashboard Implementation</w:t>
+      </w:r>
+    </w:p>
+    <w:p>
+      <w:pPr>
+        <w:pStyle w:val="ListParagraph"/>
+        <w:numPr>
+          <w:ilvl w:val="0"/>
+          <w:numId w:val="7"/>
+        </w:numPr>
+        <w:jc w:val="both"/>
+        <w:rPr>
+          <w:rFonts w:ascii="Times New Roman" w:hAnsi="Times New Roman" w:cs="Times New Roman"/>
+          <w:sz w:val="24"/>
+          <w:szCs w:val="24"/>
+        </w:rPr>
+      </w:pPr>
+      <w:r>
+        <w:rPr>
+          <w:rFonts w:ascii="Times New Roman" w:hAnsi="Times New Roman" w:cs="Times New Roman"/>
+          <w:sz w:val="24"/>
+          <w:szCs w:val="24"/>
+        </w:rPr>
+        <w:t>Simulation Results and Discussion</w:t>
+      </w:r>
+    </w:p>
+    <w:p>
+      <w:pPr>
+        <w:pStyle w:val="ListParagraph"/>
+        <w:numPr>
+          <w:ilvl w:val="0"/>
+          <w:numId w:val="3"/>
+        </w:numPr>
+        <w:jc w:val="both"/>
+        <w:rPr>
+          <w:rFonts w:ascii="Times New Roman" w:hAnsi="Times New Roman" w:cs="Times New Roman"/>
+          <w:b/>
+          <w:bCs/>
+          <w:sz w:val="24"/>
+          <w:szCs w:val="24"/>
+        </w:rPr>
+      </w:pPr>
+      <w:r>
+        <w:rPr>
+          <w:rFonts w:ascii="Times New Roman" w:hAnsi="Times New Roman" w:cs="Times New Roman"/>
+          <w:b/>
+          <w:bCs/>
+          <w:sz w:val="24"/>
+          <w:szCs w:val="24"/>
+        </w:rPr>
+        <w:t>Learning Outcomes</w:t>
+      </w:r>
+    </w:p>
+    <w:p>
+      <w:pPr>
+        <w:pStyle w:val="ListParagraph"/>
+        <w:numPr>
+          <w:ilvl w:val="0"/>
+          <w:numId w:val="3"/>
+        </w:numPr>
+        <w:jc w:val="both"/>
+        <w:rPr>
+          <w:rFonts w:ascii="Times New Roman" w:hAnsi="Times New Roman" w:cs="Times New Roman"/>
+          <w:b/>
+          <w:bCs/>
+          <w:sz w:val="24"/>
+          <w:szCs w:val="24"/>
+        </w:rPr>
+      </w:pPr>
+      <w:r>
+        <w:rPr>
+          <w:rFonts w:ascii="Times New Roman" w:hAnsi="Times New Roman" w:cs="Times New Roman"/>
+          <w:b/>
+          <w:bCs/>
+          <w:sz w:val="24"/>
+          <w:szCs w:val="24"/>
+        </w:rPr>
+        <w:t>Challenges Faced</w:t>
+      </w:r>
+    </w:p>
+    <w:p>
+      <w:pPr>
+        <w:pStyle w:val="ListParagraph"/>
+        <w:numPr>
+          <w:ilvl w:val="0"/>
+          <w:numId w:val="3"/>
+        </w:numPr>
+        <w:jc w:val="both"/>
+        <w:rPr>
+          <w:rFonts w:ascii="Times New Roman" w:hAnsi="Times New Roman" w:cs="Times New Roman"/>
+          <w:b/>
+          <w:bCs/>
+          <w:sz w:val="24"/>
+          <w:szCs w:val="24"/>
+        </w:rPr>
+      </w:pPr>
+      <w:r>
+        <w:rPr>
+          <w:rFonts w:ascii="Times New Roman" w:hAnsi="Times New Roman" w:cs="Times New Roman"/>
+          <w:b/>
+          <w:bCs/>
+          <w:sz w:val="24"/>
+          <w:szCs w:val="24"/>
+        </w:rPr>
+        <w:t>Conclusion</w:t>
+      </w:r>
+    </w:p>
+    <w:p>
+      <w:pPr>
+        <w:pStyle w:val="ListParagraph"/>
+        <w:numPr>
+          <w:ilvl w:val="0"/>
+          <w:numId w:val="3"/>
+        </w:numPr>
+        <w:jc w:val="both"/>
+        <w:rPr>
+          <w:rFonts w:ascii="Times New Roman" w:hAnsi="Times New Roman" w:cs="Times New Roman"/>
+          <w:b/>
+          <w:bCs/>
+          <w:sz w:val="24"/>
+          <w:szCs w:val="24"/>
+        </w:rPr>
+      </w:pPr>
+      <w:r>
+        <w:rPr>
+          <w:rFonts w:ascii="Times New Roman" w:hAnsi="Times New Roman" w:cs="Times New Roman"/>
+          <w:b/>
+          <w:bCs/>
+          <w:sz w:val="24"/>
+          <w:szCs w:val="24"/>
+        </w:rPr>
+        <w:t>Future Scope</w:t>
+      </w:r>
+    </w:p>
+    <w:p>
+      <w:pPr>
+        <w:pStyle w:val="ListParagraph"/>
+        <w:numPr>
+          <w:ilvl w:val="0"/>
+          <w:numId w:val="3"/>
+        </w:numPr>
+        <w:jc w:val="both"/>
+        <w:rPr>
+          <w:rFonts w:ascii="Times New Roman" w:hAnsi="Times New Roman" w:cs="Times New Roman"/>
+          <w:b/>
+          <w:bCs/>
+          <w:sz w:val="24"/>
+          <w:szCs w:val="24"/>
+        </w:rPr>
+      </w:pPr>
+      <w:r>
+        <w:rPr>
+          <w:rFonts w:ascii="Times New Roman" w:hAnsi="Times New Roman" w:cs="Times New Roman"/>
+          <w:b/>
+          <w:bCs/>
+          <w:sz w:val="24"/>
+          <w:szCs w:val="24"/>
+        </w:rPr>
+        <w:t>References</w:t>
+      </w:r>
+    </w:p>
+    <w:p>
+      <w:pPr>
+        <w:pStyle w:val="ListParagraph"/>
+        <w:numPr>
+          <w:ilvl w:val="0"/>
+          <w:numId w:val="3"/>
+        </w:numPr>
+        <w:jc w:val="both"/>
+        <w:rPr>
+          <w:rFonts w:ascii="Times New Roman" w:hAnsi="Times New Roman" w:cs="Times New Roman"/>
+          <w:b/>
+          <w:bCs/>
+          <w:sz w:val="24"/>
+          <w:szCs w:val="24"/>
+        </w:rPr>
+      </w:pPr>
+      <w:r>
+        <w:rPr>
+          <w:rFonts w:ascii="Times New Roman" w:hAnsi="Times New Roman" w:cs="Times New Roman"/>
+          <w:b/>
+          <w:bCs/>
+          <w:sz w:val="24"/>
+          <w:szCs w:val="24"/>
+        </w:rPr>
+        <w:t>Internship Certificate</w:t>
+      </w:r>
+    </w:p>
+    <w:p>
+      <w:pPr>
+        <w:jc w:val="both"/>
+      </w:pPr>
+    </w:p>
+    <w:p>
+      <w:pPr>
+        <w:jc w:val="both"/>
+      </w:pPr>
+    </w:p>
+    <w:p>
+      <w:pPr>
+        <w:pStyle w:val="Heading1"/>
+        <w:jc w:val="center"/>
+        <w:rPr>
+          <w:rFonts w:ascii="Times New Roman" w:hAnsi="Times New Roman" w:cs="Times New Roman"/>
+          <w:b/>
+          <w:bCs/>
+          <w:color w:val="000000" w:themeColor="text1"/>
+        </w:rPr>
+      </w:pPr>
+      <w:r>
+        <w:rPr>
+          <w:rFonts w:ascii="Times New Roman" w:hAnsi="Times New Roman" w:cs="Times New Roman"/>
+          <w:b/>
+          <w:bCs/>
+          <w:color w:val="000000" w:themeColor="text1"/>
+        </w:rPr>
+        <w:lastRenderedPageBreak/>
+        <w:t>Acknowledgment</w:t>
+      </w:r>
+    </w:p>
+    <w:p/>
+    <w:p>
+      <w:pPr>
+        <w:spacing w:line="360" w:lineRule="auto"/>
+        <w:jc w:val="both"/>
+        <w:rPr>
+          <w:rFonts w:ascii="Times New Roman" w:hAnsi="Times New Roman" w:cs="Times New Roman"/>
+          <w:sz w:val="24"/>
+          <w:szCs w:val="24"/>
+        </w:rPr>
+      </w:pPr>
+      <w:r>
+        <w:rPr>
+          <w:rFonts w:ascii="Times New Roman" w:hAnsi="Times New Roman" w:cs="Times New Roman"/>
+          <w:sz w:val="24"/>
+          <w:szCs w:val="24"/>
+        </w:rPr>
+        <w:t xml:space="preserve">I would like to express my sincere gratitude to </w:t>
+      </w:r>
+      <w:r>
+        <w:rPr>
+          <w:rFonts w:ascii="Times New Roman" w:hAnsi="Times New Roman" w:cs="Times New Roman"/>
+          <w:b/>
+          <w:bCs/>
+          <w:sz w:val="24"/>
+          <w:szCs w:val="24"/>
+        </w:rPr>
+        <w:t>Elin Electronics Ltd.</w:t>
+      </w:r>
+      <w:r>
+        <w:rPr>
+          <w:rFonts w:ascii="Times New Roman" w:hAnsi="Times New Roman" w:cs="Times New Roman"/>
+          <w:sz w:val="24"/>
+          <w:szCs w:val="24"/>
+        </w:rPr>
+        <w:t xml:space="preserve"> for providing me with the opportunity to undertake my internship and gain practical exposure to industrial processes and control systems. This internship has been an invaluable learning experience, allowing me to bridge the gap between theoretical concepts and real-world engineering applications.</w:t>
+      </w:r>
+    </w:p>
+    <w:p>
+      <w:pPr>
+        <w:spacing w:line="360" w:lineRule="auto"/>
+        <w:jc w:val="both"/>
+        <w:rPr>
+          <w:rFonts w:ascii="Times New Roman" w:hAnsi="Times New Roman" w:cs="Times New Roman"/>
+          <w:sz w:val="24"/>
+          <w:szCs w:val="24"/>
+        </w:rPr>
+      </w:pPr>
+      <w:r>
+        <w:rPr>
+          <w:rFonts w:ascii="Times New Roman" w:hAnsi="Times New Roman" w:cs="Times New Roman"/>
+          <w:sz w:val="24"/>
+          <w:szCs w:val="24"/>
+        </w:rPr>
+        <w:t>I am deeply thankful to the management and technical staff of Elin Electronics Ltd. for their guidance, encouragement, and support throughout the internship period. Their valuable insights into manufacturing processes and industrial automation greatly enhanced my understanding of control engineering and its practical applications.</w:t>
+      </w:r>
+    </w:p>
+    <w:p>
+      <w:pPr>
+        <w:spacing w:line="360" w:lineRule="auto"/>
+        <w:jc w:val="both"/>
+        <w:rPr>
+          <w:rFonts w:ascii="Times New Roman" w:hAnsi="Times New Roman" w:cs="Times New Roman"/>
+          <w:sz w:val="24"/>
+          <w:szCs w:val="24"/>
+        </w:rPr>
+      </w:pPr>
+      <w:r>
+        <w:rPr>
+          <w:rFonts w:ascii="Times New Roman" w:hAnsi="Times New Roman" w:cs="Times New Roman"/>
+          <w:sz w:val="24"/>
+          <w:szCs w:val="24"/>
+        </w:rPr>
+        <w:t xml:space="preserve">I would also like to express my heartfelt gratitude to the faculty members of the </w:t>
+      </w:r>
+      <w:r>
+        <w:rPr>
+          <w:rFonts w:ascii="Times New Roman" w:hAnsi="Times New Roman" w:cs="Times New Roman"/>
+          <w:b/>
+          <w:bCs/>
+          <w:sz w:val="24"/>
+          <w:szCs w:val="24"/>
+        </w:rPr>
+        <w:t>Department of Instrumentation and Control Engineering, Dr. B. R. Ambedkar National Institute of Technology (NIT) Jalandhar</w:t>
+      </w:r>
+      <w:r>
+        <w:rPr>
+          <w:rFonts w:ascii="Times New Roman" w:hAnsi="Times New Roman" w:cs="Times New Roman"/>
+          <w:sz w:val="24"/>
+          <w:szCs w:val="24"/>
+        </w:rPr>
+        <w:t>, for providing me with the academic foundation and motivation to undertake this project. Their continuous encouragement has played a significant role in the successful completion of my internship.</w:t>
+      </w:r>
+    </w:p>
+    <w:p>
+      <w:pPr>
+        <w:spacing w:line="360" w:lineRule="auto"/>
+        <w:jc w:val="both"/>
+        <w:rPr>
+          <w:rFonts w:ascii="Times New Roman" w:hAnsi="Times New Roman" w:cs="Times New Roman"/>
+          <w:sz w:val="24"/>
+          <w:szCs w:val="24"/>
+        </w:rPr>
+      </w:pPr>
+      <w:r>
+        <w:rPr>
+          <w:rFonts w:ascii="Times New Roman" w:hAnsi="Times New Roman" w:cs="Times New Roman"/>
+          <w:sz w:val="24"/>
+          <w:szCs w:val="24"/>
+        </w:rPr>
+        <w:t>Finally, I would like to thank my family and friends for their constant support, motivation, and encouragement throughout this internship. Their confidence in me inspired me to complete this project successfully</w:t>
+      </w:r>
+    </w:p>
+    <w:p/>
+    <w:p/>
+    <w:p>
+      <w:pPr>
+        <w:rPr>
+          <w:rFonts w:ascii="Times New Roman" w:hAnsi="Times New Roman" w:cs="Times New Roman"/>
+          <w:sz w:val="24"/>
+          <w:szCs w:val="24"/>
+        </w:rPr>
+      </w:pPr>
+    </w:p>
+    <w:p/>
+    <w:p/>
+    <w:p/>
+    <w:p/>
+    <w:p/>
+    <w:p/>
+    <w:p/>
+    <w:p/>
+    <w:p/>
+    <w:p>
+      <w:pPr>
+        <w:spacing w:line="360" w:lineRule="auto"/>
+      </w:pPr>
+    </w:p>
+    <w:p>
+      <w:pPr>
+        <w:pStyle w:val="Heading1"/>
+        <w:spacing w:line="360" w:lineRule="auto"/>
+        <w:jc w:val="center"/>
+        <w:rPr>
+          <w:rFonts w:ascii="Times New Roman" w:hAnsi="Times New Roman" w:cs="Times New Roman"/>
+          <w:b/>
+          <w:bCs/>
+          <w:color w:val="000000" w:themeColor="text1"/>
+        </w:rPr>
+      </w:pPr>
+      <w:r>
+        <w:rPr>
+          <w:rFonts w:ascii="Times New Roman" w:hAnsi="Times New Roman" w:cs="Times New Roman"/>
+          <w:b/>
+          <w:bCs/>
+          <w:color w:val="000000" w:themeColor="text1"/>
+        </w:rPr>
+        <w:t>Introduction</w:t>
+      </w:r>
+    </w:p>
+    <w:p>
+      <w:pPr>
+        <w:spacing w:line="360" w:lineRule="auto"/>
+        <w:jc w:val="both"/>
+        <w:rPr>
+          <w:rFonts w:ascii="Times New Roman" w:hAnsi="Times New Roman" w:cs="Times New Roman"/>
+          <w:sz w:val="24"/>
+          <w:szCs w:val="24"/>
+        </w:rPr>
+      </w:pPr>
+      <w:r>
+        <w:rPr>
+          <w:rFonts w:ascii="Times New Roman" w:hAnsi="Times New Roman" w:cs="Times New Roman"/>
+          <w:sz w:val="24"/>
+          <w:szCs w:val="24"/>
+        </w:rPr>
+        <w:t xml:space="preserve">The rapid advancement in electronics technology has </w:t>
+      </w:r>
+      <w:proofErr w:type="spellStart"/>
+      <w:proofErr w:type="gramStart"/>
+      <w:r>
+        <w:rPr>
+          <w:rFonts w:ascii="Times New Roman" w:hAnsi="Times New Roman" w:cs="Times New Roman"/>
+          <w:sz w:val="24"/>
+          <w:szCs w:val="24"/>
+        </w:rPr>
+        <w:t>lead</w:t>
+      </w:r>
+      <w:proofErr w:type="spellEnd"/>
+      <w:proofErr w:type="gramEnd"/>
+      <w:r>
+        <w:rPr>
+          <w:rFonts w:ascii="Times New Roman" w:hAnsi="Times New Roman" w:cs="Times New Roman"/>
+          <w:sz w:val="24"/>
+          <w:szCs w:val="24"/>
+        </w:rPr>
+        <w:t xml:space="preserve"> to the significant increase in demand for a compact, reliable and high performance</w:t>
+      </w:r>
+      <w:r>
+        <w:rPr>
+          <w:rFonts w:ascii="Times New Roman" w:hAnsi="Times New Roman" w:cs="Times New Roman"/>
+          <w:sz w:val="24"/>
+          <w:szCs w:val="24"/>
+        </w:rPr>
+        <w:t xml:space="preserve"> of</w:t>
+      </w:r>
+      <w:r>
+        <w:rPr>
+          <w:rFonts w:ascii="Times New Roman" w:hAnsi="Times New Roman" w:cs="Times New Roman"/>
+          <w:sz w:val="24"/>
+          <w:szCs w:val="24"/>
+        </w:rPr>
+        <w:t xml:space="preserve"> electronic devices. Now</w:t>
+      </w:r>
+      <w:r>
+        <w:rPr>
+          <w:rFonts w:ascii="Times New Roman" w:hAnsi="Times New Roman" w:cs="Times New Roman"/>
+          <w:sz w:val="24"/>
+          <w:szCs w:val="24"/>
+        </w:rPr>
+        <w:t>adays</w:t>
+      </w:r>
+      <w:r>
+        <w:rPr>
+          <w:rFonts w:ascii="Times New Roman" w:hAnsi="Times New Roman" w:cs="Times New Roman"/>
+          <w:sz w:val="24"/>
+          <w:szCs w:val="24"/>
+        </w:rPr>
+        <w:t>, Surface Mount Technology (SMT) has become the standard manufacturing process for assembling the modern electronic circuits due to its high production speed, improved reliability and efficient utilization of printed circuit boards (PCBs). SMT process involves a crucial stage of reflow soldering, in which the electronic components are permanently gets attached to the PCB using a controlled heating process.</w:t>
+      </w:r>
+    </w:p>
+    <w:p>
+      <w:pPr>
+        <w:spacing w:line="360" w:lineRule="auto"/>
+        <w:jc w:val="both"/>
+        <w:rPr>
+          <w:rFonts w:ascii="Times New Roman" w:hAnsi="Times New Roman" w:cs="Times New Roman"/>
+          <w:sz w:val="24"/>
+          <w:szCs w:val="24"/>
+        </w:rPr>
+      </w:pPr>
+      <w:r>
+        <w:rPr>
+          <w:rFonts w:ascii="Times New Roman" w:hAnsi="Times New Roman" w:cs="Times New Roman"/>
+          <w:sz w:val="24"/>
+          <w:szCs w:val="24"/>
+        </w:rPr>
+        <w:t>A reflow oven is a specialized industrial machine which is designed to heat assembled PCBs according to a predefined temperature profile. The profile consists of 4 stages which are as following-</w:t>
+      </w:r>
+    </w:p>
+    <w:p>
+      <w:pPr>
+        <w:pStyle w:val="ListParagraph"/>
+        <w:numPr>
+          <w:ilvl w:val="0"/>
+          <w:numId w:val="8"/>
+        </w:numPr>
+        <w:spacing w:line="360" w:lineRule="auto"/>
+        <w:jc w:val="both"/>
+        <w:rPr>
+          <w:rFonts w:ascii="Times New Roman" w:hAnsi="Times New Roman" w:cs="Times New Roman"/>
+          <w:sz w:val="24"/>
+          <w:szCs w:val="24"/>
+        </w:rPr>
+      </w:pPr>
+      <w:r>
+        <w:rPr>
+          <w:rFonts w:ascii="Times New Roman" w:hAnsi="Times New Roman" w:cs="Times New Roman"/>
+          <w:sz w:val="24"/>
+          <w:szCs w:val="24"/>
+        </w:rPr>
+        <w:t xml:space="preserve">Preheating </w:t>
+      </w:r>
+    </w:p>
+    <w:p>
+      <w:pPr>
+        <w:pStyle w:val="ListParagraph"/>
+        <w:numPr>
+          <w:ilvl w:val="0"/>
+          <w:numId w:val="8"/>
+        </w:numPr>
+        <w:spacing w:line="360" w:lineRule="auto"/>
+        <w:jc w:val="both"/>
+        <w:rPr>
+          <w:rFonts w:ascii="Times New Roman" w:hAnsi="Times New Roman" w:cs="Times New Roman"/>
+          <w:sz w:val="24"/>
+          <w:szCs w:val="24"/>
+        </w:rPr>
+      </w:pPr>
+      <w:r>
+        <w:rPr>
+          <w:rFonts w:ascii="Times New Roman" w:hAnsi="Times New Roman" w:cs="Times New Roman"/>
+          <w:sz w:val="24"/>
+          <w:szCs w:val="24"/>
+        </w:rPr>
+        <w:t>Soaking</w:t>
+      </w:r>
+    </w:p>
+    <w:p>
+      <w:pPr>
+        <w:pStyle w:val="ListParagraph"/>
+        <w:numPr>
+          <w:ilvl w:val="0"/>
+          <w:numId w:val="8"/>
+        </w:numPr>
+        <w:spacing w:line="360" w:lineRule="auto"/>
+        <w:jc w:val="both"/>
+        <w:rPr>
+          <w:rFonts w:ascii="Times New Roman" w:hAnsi="Times New Roman" w:cs="Times New Roman"/>
+          <w:sz w:val="24"/>
+          <w:szCs w:val="24"/>
+        </w:rPr>
+      </w:pPr>
+      <w:r>
+        <w:rPr>
+          <w:rFonts w:ascii="Times New Roman" w:hAnsi="Times New Roman" w:cs="Times New Roman"/>
+          <w:sz w:val="24"/>
+          <w:szCs w:val="24"/>
+        </w:rPr>
+        <w:t>Reflow</w:t>
+      </w:r>
+    </w:p>
+    <w:p>
+      <w:pPr>
+        <w:pStyle w:val="ListParagraph"/>
+        <w:numPr>
+          <w:ilvl w:val="0"/>
+          <w:numId w:val="8"/>
+        </w:numPr>
+        <w:spacing w:line="360" w:lineRule="auto"/>
+        <w:jc w:val="both"/>
+        <w:rPr>
+          <w:rFonts w:ascii="Times New Roman" w:hAnsi="Times New Roman" w:cs="Times New Roman"/>
+          <w:sz w:val="24"/>
+          <w:szCs w:val="24"/>
+        </w:rPr>
+      </w:pPr>
+      <w:r>
+        <w:rPr>
+          <w:rFonts w:ascii="Times New Roman" w:hAnsi="Times New Roman" w:cs="Times New Roman"/>
+          <w:sz w:val="24"/>
+          <w:szCs w:val="24"/>
+        </w:rPr>
+        <w:t>And Cooling</w:t>
+      </w:r>
+    </w:p>
+    <w:p>
+      <w:pPr>
+        <w:spacing w:line="360" w:lineRule="auto"/>
+        <w:jc w:val="both"/>
+        <w:rPr>
+          <w:rFonts w:ascii="Times New Roman" w:hAnsi="Times New Roman" w:cs="Times New Roman"/>
+          <w:sz w:val="24"/>
+          <w:szCs w:val="24"/>
+        </w:rPr>
+      </w:pPr>
+      <w:r>
+        <w:rPr>
+          <w:rFonts w:ascii="Times New Roman" w:hAnsi="Times New Roman" w:cs="Times New Roman"/>
+          <w:sz w:val="24"/>
+          <w:szCs w:val="24"/>
+        </w:rPr>
+        <w:t xml:space="preserve">Each stage plays a significant role, </w:t>
+      </w:r>
+      <w:proofErr w:type="gramStart"/>
+      <w:r>
+        <w:rPr>
+          <w:rFonts w:ascii="Times New Roman" w:hAnsi="Times New Roman" w:cs="Times New Roman"/>
+          <w:sz w:val="24"/>
+          <w:szCs w:val="24"/>
+        </w:rPr>
+        <w:t>ensuring  proper</w:t>
+      </w:r>
+      <w:proofErr w:type="gramEnd"/>
+      <w:r>
+        <w:rPr>
+          <w:rFonts w:ascii="Times New Roman" w:hAnsi="Times New Roman" w:cs="Times New Roman"/>
+          <w:sz w:val="24"/>
+          <w:szCs w:val="24"/>
+        </w:rPr>
+        <w:t xml:space="preserve"> solder melting, strong electrical connections and prevents the damage of components. And if the temperature becomes higher or falls below the desired value, then the soldering effects such as cold joints, solder bridges, insufficient wetting, or component failure may occur. Therefore, a precise temperature regulation is one of the most critical </w:t>
+      </w:r>
+      <w:proofErr w:type="gramStart"/>
+      <w:r>
+        <w:rPr>
+          <w:rFonts w:ascii="Times New Roman" w:hAnsi="Times New Roman" w:cs="Times New Roman"/>
+          <w:sz w:val="24"/>
+          <w:szCs w:val="24"/>
+        </w:rPr>
+        <w:t>requirement</w:t>
+      </w:r>
+      <w:proofErr w:type="gramEnd"/>
+      <w:r>
+        <w:rPr>
+          <w:rFonts w:ascii="Times New Roman" w:hAnsi="Times New Roman" w:cs="Times New Roman"/>
+          <w:sz w:val="24"/>
+          <w:szCs w:val="24"/>
+        </w:rPr>
+        <w:t xml:space="preserve"> in the reflow soldering process.</w:t>
+      </w:r>
+    </w:p>
+    <w:p>
+      <w:pPr>
+        <w:keepNext/>
+        <w:spacing w:line="360" w:lineRule="auto"/>
+        <w:jc w:val="center"/>
+      </w:pPr>
+      <w:r>
+        <w:rPr>
+          <w:rFonts w:ascii="Times New Roman" w:hAnsi="Times New Roman" w:cs="Times New Roman"/>
+          <w:noProof/>
+          <w:sz w:val="24"/>
+          <w:szCs w:val="24"/>
+        </w:rPr>
+        <w:drawing>
+          <wp:inline distT="0" distB="0" distL="0" distR="0" wp14:anchorId="05D04E99" wp14:editId="6A731AEC">
+            <wp:extent cx="3616657" cy="2035521"/>
+            <wp:effectExtent l="0" t="0" r="3175" b="3175"/>
+            <wp:docPr id="1585425453" name="Picture 1"/>
+            <wp:cNvGraphicFramePr>
+              <a:graphicFrameLocks xmlns:a="http://schemas.openxmlformats.org/drawingml/2006/main" noChangeAspect="1"/>
+            </wp:cNvGraphicFramePr>
+            <a:graphic xmlns:a="http://schemas.openxmlformats.org/drawingml/2006/main">
+              <a:graphicData uri="http://schemas.openxmlformats.org/drawingml/2006/picture">
+                <pic:pic xmlns:pic="http://schemas.openxmlformats.org/drawingml/2006/picture">
+                  <pic:nvPicPr>
+                    <pic:cNvPr id="1585425453" name="Picture 1585425453"/>
+                    <pic:cNvPicPr/>
+                  </pic:nvPicPr>
+                  <pic:blipFill>
+                    <a:blip r:embed="rId6" cstate="print">
+                      <a:extLst>
+                        <a:ext uri="{28A0092B-C50C-407E-A947-70E740481C1C}">
+                          <a14:useLocalDpi xmlns:a14="http://schemas.microsoft.com/office/drawing/2010/main" val="0"/>
+                        </a:ext>
+                      </a:extLst>
+                    </a:blip>
+                    <a:stretch>
+                      <a:fillRect/>
+                    </a:stretch>
+                  </pic:blipFill>
+                  <pic:spPr>
+                    <a:xfrm>
+                      <a:off x="0" y="0"/>
+                      <a:ext cx="3624691" cy="2040043"/>
+                    </a:xfrm>
+                    <a:prstGeom prst="rect">
+                      <a:avLst/>
+                    </a:prstGeom>
+                  </pic:spPr>
+                </pic:pic>
+              </a:graphicData>
+            </a:graphic>
+          </wp:inline>
+        </w:drawing>
+      </w:r>
+    </w:p>
+    <w:p>
+      <w:pPr>
+        <w:pStyle w:val="Caption"/>
+        <w:jc w:val="center"/>
+        <w:rPr>
+          <w:rFonts w:ascii="Times New Roman" w:hAnsi="Times New Roman" w:cs="Times New Roman"/>
+          <w:sz w:val="24"/>
+          <w:szCs w:val="24"/>
+        </w:rPr>
+      </w:pPr>
+      <w:r>
+        <w:t xml:space="preserve">Figure </w:t>
+      </w:r>
+      <w:r>
+        <w:fldChar w:fldCharType="begin"/>
+      </w:r>
+      <w:r>
+        <w:instrText xml:space="preserve"> SEQ Figure \* ARABIC </w:instrText>
+      </w:r>
+      <w:r>
+        <w:fldChar w:fldCharType="separate"/>
+      </w:r>
+      <w:r>
+        <w:rPr>
+          <w:noProof/>
+        </w:rPr>
+        <w:t>1</w:t>
+      </w:r>
+      <w:r>
+        <w:fldChar w:fldCharType="end"/>
+      </w:r>
+      <w:r>
+        <w:rPr>
+          <w:lang w:val="en-US"/>
+        </w:rPr>
+        <w:t>Industrial Reflow Oven Used in Surface Mount Technology (SMT)</w:t>
+      </w:r>
+    </w:p>
+    <w:p>
+      <w:pPr>
+        <w:spacing w:line="360" w:lineRule="auto"/>
+        <w:jc w:val="both"/>
+        <w:rPr>
+          <w:rFonts w:ascii="Times New Roman" w:hAnsi="Times New Roman" w:cs="Times New Roman"/>
+          <w:sz w:val="24"/>
+          <w:szCs w:val="24"/>
+        </w:rPr>
+      </w:pPr>
+      <w:r>
+        <w:rPr>
+          <w:rFonts w:ascii="Times New Roman" w:hAnsi="Times New Roman" w:cs="Times New Roman"/>
+          <w:sz w:val="24"/>
+          <w:szCs w:val="24"/>
+        </w:rPr>
+        <w:lastRenderedPageBreak/>
+        <w:t>Generally, modern reflow ovens consists of multiple heating zones</w:t>
+      </w:r>
+      <w:r>
+        <w:rPr>
+          <w:rFonts w:ascii="Times New Roman" w:hAnsi="Times New Roman" w:cs="Times New Roman"/>
+          <w:sz w:val="24"/>
+          <w:szCs w:val="24"/>
+        </w:rPr>
+        <w:t xml:space="preserve">, and each zone is responsible for maintaining a specific range of temperature. Accurate control of these heating zones ensures that the PCB follows the desired thermal profile </w:t>
+      </w:r>
+      <w:proofErr w:type="spellStart"/>
+      <w:r>
+        <w:rPr>
+          <w:rFonts w:ascii="Times New Roman" w:hAnsi="Times New Roman" w:cs="Times New Roman"/>
+          <w:sz w:val="24"/>
+          <w:szCs w:val="24"/>
+        </w:rPr>
+        <w:t>throught</w:t>
+      </w:r>
+      <w:proofErr w:type="spellEnd"/>
+      <w:r>
+        <w:rPr>
+          <w:rFonts w:ascii="Times New Roman" w:hAnsi="Times New Roman" w:cs="Times New Roman"/>
+          <w:sz w:val="24"/>
+          <w:szCs w:val="24"/>
+        </w:rPr>
+        <w:t xml:space="preserve"> the soldering process. To achieve this, automatic control systems are employed to continuously monitoring the temperature and adjust the heater output correctly.</w:t>
+      </w:r>
+    </w:p>
+    <w:p>
+      <w:pPr>
+        <w:spacing w:line="360" w:lineRule="auto"/>
+        <w:jc w:val="both"/>
+        <w:rPr>
+          <w:rFonts w:ascii="Times New Roman" w:hAnsi="Times New Roman" w:cs="Times New Roman"/>
+          <w:sz w:val="24"/>
+          <w:szCs w:val="24"/>
+        </w:rPr>
+      </w:pPr>
+      <w:r>
+        <w:rPr>
+          <w:rFonts w:ascii="Times New Roman" w:hAnsi="Times New Roman" w:cs="Times New Roman"/>
+          <w:sz w:val="24"/>
+          <w:szCs w:val="24"/>
+        </w:rPr>
+        <w:t>There are various control techniques, but the Proportional-Integral (PI) controller is widely used in industrial thermal system because of its simplicity, reliability and ability to minimize steady state error while maintaining stable system performance. Proper tuning of the PI controller improves the response of heating system, reduces temperature fluctuations and enhances the overall quality of soldering process.</w:t>
+      </w:r>
+    </w:p>
+    <w:p>
+      <w:pPr>
+        <w:spacing w:line="360" w:lineRule="auto"/>
+        <w:jc w:val="both"/>
+        <w:rPr>
+          <w:rFonts w:ascii="Times New Roman" w:hAnsi="Times New Roman" w:cs="Times New Roman"/>
+          <w:sz w:val="24"/>
+          <w:szCs w:val="24"/>
+        </w:rPr>
+      </w:pPr>
+      <w:r>
+        <w:rPr>
+          <w:rFonts w:ascii="Times New Roman" w:hAnsi="Times New Roman" w:cs="Times New Roman"/>
+          <w:sz w:val="24"/>
+          <w:szCs w:val="24"/>
+        </w:rPr>
+        <w:t>In this internship project I have modelled a simplified multi-zone reflow oven temperature control system and simulated using the MATLAB/ Simulink. I have used a first order transfer function to represent the thermal dynamics of the heating system.</w:t>
+      </w:r>
+      <w:r>
+        <w:rPr>
+          <w:rFonts w:ascii="Times New Roman" w:hAnsi="Times New Roman" w:cs="Times New Roman"/>
+          <w:sz w:val="24"/>
+          <w:szCs w:val="24"/>
+        </w:rPr>
+        <w:t xml:space="preserve"> I performed both manual tuning and automatic tuning using MATLAB’s </w:t>
+      </w:r>
+      <w:proofErr w:type="spellStart"/>
+      <w:proofErr w:type="gramStart"/>
+      <w:r>
+        <w:rPr>
+          <w:rFonts w:ascii="Times New Roman" w:hAnsi="Times New Roman" w:cs="Times New Roman"/>
+          <w:sz w:val="24"/>
+          <w:szCs w:val="24"/>
+        </w:rPr>
+        <w:t>pidtune</w:t>
+      </w:r>
+      <w:proofErr w:type="spellEnd"/>
+      <w:r>
+        <w:rPr>
+          <w:rFonts w:ascii="Times New Roman" w:hAnsi="Times New Roman" w:cs="Times New Roman"/>
+          <w:sz w:val="24"/>
+          <w:szCs w:val="24"/>
+        </w:rPr>
+        <w:t>(</w:t>
+      </w:r>
+      <w:proofErr w:type="gramEnd"/>
+      <w:r>
+        <w:rPr>
+          <w:rFonts w:ascii="Times New Roman" w:hAnsi="Times New Roman" w:cs="Times New Roman"/>
+          <w:sz w:val="24"/>
+          <w:szCs w:val="24"/>
+        </w:rPr>
+        <w:t xml:space="preserve">) function to obtain a suitable PI controller parameters. The performance of the controller was </w:t>
+      </w:r>
+      <w:proofErr w:type="spellStart"/>
+      <w:r>
+        <w:rPr>
+          <w:rFonts w:ascii="Times New Roman" w:hAnsi="Times New Roman" w:cs="Times New Roman"/>
+          <w:sz w:val="24"/>
+          <w:szCs w:val="24"/>
+        </w:rPr>
+        <w:t>analyzed</w:t>
+      </w:r>
+      <w:proofErr w:type="spellEnd"/>
+      <w:r>
+        <w:rPr>
+          <w:rFonts w:ascii="Times New Roman" w:hAnsi="Times New Roman" w:cs="Times New Roman"/>
+          <w:sz w:val="24"/>
+          <w:szCs w:val="24"/>
+        </w:rPr>
+        <w:t xml:space="preserve"> under different operating conditions including the variations in the time constant of system and introduction of externally applied disturbances. I have also added dashboard consisting of a circular </w:t>
+      </w:r>
+      <w:proofErr w:type="spellStart"/>
+      <w:r>
+        <w:rPr>
+          <w:rFonts w:ascii="Times New Roman" w:hAnsi="Times New Roman" w:cs="Times New Roman"/>
+          <w:sz w:val="24"/>
+          <w:szCs w:val="24"/>
+        </w:rPr>
+        <w:t>guage</w:t>
+      </w:r>
+      <w:proofErr w:type="spellEnd"/>
+      <w:r>
+        <w:rPr>
+          <w:rFonts w:ascii="Times New Roman" w:hAnsi="Times New Roman" w:cs="Times New Roman"/>
+          <w:sz w:val="24"/>
+          <w:szCs w:val="24"/>
+        </w:rPr>
+        <w:t>, numeric display and an indicator lamp to visualize the simulated oven temperature in real time.</w:t>
+      </w:r>
+    </w:p>
+    <w:p>
+      <w:pPr>
+        <w:spacing w:line="360" w:lineRule="auto"/>
+        <w:jc w:val="both"/>
+        <w:rPr>
+          <w:rFonts w:ascii="Times New Roman" w:hAnsi="Times New Roman" w:cs="Times New Roman"/>
+          <w:sz w:val="24"/>
+          <w:szCs w:val="24"/>
+        </w:rPr>
+      </w:pPr>
+      <w:r>
+        <w:rPr>
+          <w:rFonts w:ascii="Times New Roman" w:hAnsi="Times New Roman" w:cs="Times New Roman"/>
+          <w:sz w:val="24"/>
+          <w:szCs w:val="24"/>
+        </w:rPr>
+        <w:t xml:space="preserve">The objective of this project is to understand the application of control engineering principles in industrial thermal systems and to evaluate the effectiveness of PI control in maintaining the desired temperature profile of a reflow oven. The knowledge that I have gained through this work gave me a practical insight into process control, system modelling, controller design and simulation techniques used in modern electronics manufacturing.   </w:t>
+      </w:r>
+      <w:r>
+        <w:rPr>
+          <w:rFonts w:ascii="Times New Roman" w:hAnsi="Times New Roman" w:cs="Times New Roman"/>
+          <w:sz w:val="24"/>
+          <w:szCs w:val="24"/>
+        </w:rPr>
+        <w:t xml:space="preserve"> </w:t>
+      </w:r>
+    </w:p>
+    <w:p>
+      <w:pPr>
+        <w:spacing w:line="360" w:lineRule="auto"/>
+        <w:jc w:val="both"/>
+        <w:rPr>
+          <w:rFonts w:ascii="Times New Roman" w:hAnsi="Times New Roman" w:cs="Times New Roman"/>
+          <w:sz w:val="24"/>
+          <w:szCs w:val="24"/>
+        </w:rPr>
+      </w:pPr>
+    </w:p>
+    <w:p>
+      <w:pPr>
+        <w:spacing w:line="360" w:lineRule="auto"/>
+        <w:jc w:val="both"/>
+        <w:rPr>
+          <w:rFonts w:ascii="Times New Roman" w:hAnsi="Times New Roman" w:cs="Times New Roman"/>
+          <w:sz w:val="24"/>
+          <w:szCs w:val="24"/>
+        </w:rPr>
+      </w:pPr>
+    </w:p>
+    <w:p>
+      <w:pPr>
+        <w:spacing w:line="360" w:lineRule="auto"/>
+        <w:jc w:val="both"/>
+        <w:rPr>
+          <w:rFonts w:ascii="Times New Roman" w:hAnsi="Times New Roman" w:cs="Times New Roman"/>
+          <w:sz w:val="24"/>
+          <w:szCs w:val="24"/>
+        </w:rPr>
+      </w:pPr>
+    </w:p>
+    <w:p>
+      <w:pPr>
+        <w:spacing w:line="360" w:lineRule="auto"/>
+        <w:jc w:val="both"/>
+        <w:rPr>
+          <w:rFonts w:ascii="Times New Roman" w:hAnsi="Times New Roman" w:cs="Times New Roman"/>
+          <w:sz w:val="24"/>
+          <w:szCs w:val="24"/>
+        </w:rPr>
+      </w:pPr>
+    </w:p>
+    <w:p>
+      <w:pPr>
+        <w:spacing w:line="360" w:lineRule="auto"/>
+        <w:jc w:val="both"/>
+        <w:rPr>
+          <w:rFonts w:ascii="Times New Roman" w:hAnsi="Times New Roman" w:cs="Times New Roman"/>
+          <w:sz w:val="24"/>
+          <w:szCs w:val="24"/>
+        </w:rPr>
+      </w:pPr>
+    </w:p>
+    <w:p>
+      <w:pPr>
+        <w:spacing w:line="360" w:lineRule="auto"/>
+        <w:jc w:val="both"/>
+        <w:rPr>
+          <w:rFonts w:ascii="Times New Roman" w:hAnsi="Times New Roman" w:cs="Times New Roman"/>
+          <w:sz w:val="24"/>
+          <w:szCs w:val="24"/>
+        </w:rPr>
+      </w:pPr>
+    </w:p>
+    <w:p>
+      <w:pPr>
+        <w:spacing w:line="360" w:lineRule="auto"/>
+        <w:jc w:val="both"/>
+        <w:rPr>
+          <w:rFonts w:ascii="Times New Roman" w:hAnsi="Times New Roman" w:cs="Times New Roman"/>
+          <w:sz w:val="24"/>
+          <w:szCs w:val="24"/>
+        </w:rPr>
+      </w:pPr>
+    </w:p>
+    <w:p>
+      <w:pPr>
+        <w:spacing w:line="360" w:lineRule="auto"/>
+        <w:jc w:val="both"/>
+        <w:rPr>
+          <w:rFonts w:ascii="Times New Roman" w:hAnsi="Times New Roman" w:cs="Times New Roman"/>
+          <w:sz w:val="24"/>
+          <w:szCs w:val="24"/>
+        </w:rPr>
+      </w:pPr>
+    </w:p>
+    <w:p>
+      <w:pPr>
+        <w:spacing w:line="360" w:lineRule="auto"/>
+        <w:jc w:val="both"/>
+        <w:rPr>
+          <w:rFonts w:ascii="Times New Roman" w:hAnsi="Times New Roman" w:cs="Times New Roman"/>
+          <w:sz w:val="24"/>
+          <w:szCs w:val="24"/>
+        </w:rPr>
+      </w:pPr>
+    </w:p>
+    <w:p>
+      <w:pPr>
+        <w:spacing w:line="360" w:lineRule="auto"/>
+        <w:jc w:val="both"/>
+        <w:rPr>
+          <w:rFonts w:ascii="Times New Roman" w:hAnsi="Times New Roman" w:cs="Times New Roman"/>
+          <w:sz w:val="24"/>
+          <w:szCs w:val="24"/>
+        </w:rPr>
+      </w:pPr>
+    </w:p>
+    <w:p>
+      <w:pPr>
+        <w:spacing w:line="360" w:lineRule="auto"/>
+        <w:jc w:val="both"/>
+        <w:rPr>
+          <w:rFonts w:ascii="Times New Roman" w:hAnsi="Times New Roman" w:cs="Times New Roman"/>
+          <w:sz w:val="24"/>
+          <w:szCs w:val="24"/>
+        </w:rPr>
+      </w:pPr>
+    </w:p>
+    <w:p>
+      <w:pPr>
+        <w:spacing w:line="360" w:lineRule="auto"/>
+        <w:jc w:val="both"/>
+        <w:rPr>
+          <w:rFonts w:ascii="Times New Roman" w:hAnsi="Times New Roman" w:cs="Times New Roman"/>
+          <w:sz w:val="24"/>
+          <w:szCs w:val="24"/>
+        </w:rPr>
+      </w:pPr>
+    </w:p>
+    <w:p>
+      <w:pPr>
+        <w:rPr>
+          <w:rFonts w:ascii="Times New Roman" w:hAnsi="Times New Roman" w:cs="Times New Roman"/>
+          <w:sz w:val="24"/>
+          <w:szCs w:val="24"/>
+        </w:rPr>
+      </w:pPr>
+      <w:r>
+        <w:rPr>
+          <w:rFonts w:ascii="Times New Roman" w:hAnsi="Times New Roman" w:cs="Times New Roman"/>
+          <w:sz w:val="24"/>
+          <w:szCs w:val="24"/>
+        </w:rPr>
+        <w:br w:type="page"/>
+      </w:r>
+    </w:p>
+    <w:p>
+      <w:pPr>
+        <w:pStyle w:val="Heading1"/>
+        <w:jc w:val="center"/>
+        <w:rPr>
+          <w:rFonts w:ascii="Times New Roman" w:hAnsi="Times New Roman" w:cs="Times New Roman"/>
+          <w:b/>
+          <w:bCs/>
+          <w:color w:val="000000" w:themeColor="text1"/>
+        </w:rPr>
+      </w:pPr>
+      <w:r>
+        <w:rPr>
+          <w:rFonts w:ascii="Times New Roman" w:hAnsi="Times New Roman" w:cs="Times New Roman"/>
+          <w:b/>
+          <w:bCs/>
+          <w:color w:val="000000" w:themeColor="text1"/>
+        </w:rPr>
+        <w:lastRenderedPageBreak/>
+        <w:t>Objective of Internship</w:t>
+      </w:r>
+    </w:p>
+    <w:p/>
     <w:sectPr>
       <w:pgSz w:w="11906" w:h="16838"/>
       <w:pgMar w:top="1440" w:right="1440" w:bottom="1440" w:left="1440" w:header="708" w:footer="708" w:gutter="0"/>
@@ -317,6 +2268,95 @@
 <file path=word/numbering.xml><?xml version="1.0" encoding="utf-8"?>
 <w:numbering xmlns:wpc="http://schemas.microsoft.com/office/word/2010/wordprocessingCanvas" xmlns:cx="http://schemas.microsoft.com/office/drawing/2014/chartex" xmlns:cx1="http://schemas.microsoft.com/office/drawing/2015/9/8/chartex" xmlns:cx2="http://schemas.microsoft.com/office/drawing/2015/10/21/chartex" xmlns:cx3="http://schemas.microsoft.com/office/drawing/2016/5/9/chartex" xmlns:cx4="http://schemas.microsoft.com/office/drawing/2016/5/10/chartex" xmlns:cx5="http://schemas.microsoft.com/office/drawing/2016/5/11/chartex" xmlns:cx6="http://schemas.microsoft.com/office/drawing/2016/5/12/chartex" xmlns:cx7="http://schemas.microsoft.com/office/drawing/2016/5/13/chartex" xmlns:cx8="http://schemas.microsoft.com/office/drawing/2016/5/14/chartex" xmlns:mc="http://schemas.openxmlformats.org/markup-compatibility/2006" xmlns:aink="http://schemas.microsoft.com/office/drawing/2016/ink" xmlns:am3d="http://schemas.microsoft.com/office/drawing/2017/model3d" xmlns:o="urn:schemas-microsoft-com:office:office" xmlns:oel="http://schemas.microsoft.com/office/2019/extlst" xmlns:r="http://schemas.openxmlformats.org/officeDocument/2006/relationships" xmlns:m="http://schemas.openxmlformats.org/officeDocument/2006/math" xmlns:v="urn:schemas-microsoft-com:vml" xmlns:wp14="http://schemas.microsoft.com/office/word/2010/wordprocessingDrawing" xmlns:wp="http://schemas.openxmlformats.org/drawingml/2006/wordprocessingDrawing" xmlns:w10="urn:schemas-microsoft-com:office:word" xmlns:w="http://schemas.openxmlformats.org/wordprocessingml/2006/main" xmlns:w14="http://schemas.microsoft.com/office/word/2010/wordml" xmlns:w15="http://schemas.microsoft.com/office/word/2012/wordml" xmlns:w16cex="http://schemas.microsoft.com/office/word/2018/wordml/cex" xmlns:w16cid="http://schemas.microsoft.com/office/word/2016/wordml/cid" xmlns:w16="http://schemas.microsoft.com/office/word/2018/wordml" xmlns:w16du="http://schemas.microsoft.com/office/word/2023/wordml/word16du" xmlns:w16sdtdh="http://schemas.microsoft.com/office/word/2020/wordml/sdtdatahash" xmlns:w16sdtfl="http://schemas.microsoft.com/office/word/2024/wordml/sdtformatlock" xmlns:w16se="http://schemas.microsoft.com/office/word/2015/wordml/symex" xmlns:wpg="http://schemas.microsoft.com/office/word/2010/wordprocessingGroup" xmlns:wpi="http://schemas.microsoft.com/office/word/2010/wordprocessingInk" xmlns:wne="http://schemas.microsoft.com/office/word/2006/wordml" xmlns:wps="http://schemas.microsoft.com/office/word/2010/wordprocessingShape" mc:Ignorable="w14 w15 w16se w16cid w16 w16cex w16sdtdh w16sdtfl w16du wp14">
   <w:abstractNum w:abstractNumId="0" w15:restartNumberingAfterBreak="0">
+    <w:nsid w:val="24940DD7"/>
+    <w:multiLevelType w:val="hybridMultilevel"/>
+    <w:tmpl w:val="6282A794"/>
+    <w:lvl w:ilvl="0" w:tplc="58B4600A">
+      <w:start w:val="1"/>
+      <w:numFmt w:val="lowerRoman"/>
+      <w:lvlText w:val="%1."/>
+      <w:lvlJc w:val="left"/>
+      <w:pPr>
+        <w:ind w:left="1440" w:hanging="360"/>
+      </w:pPr>
+      <w:rPr>
+        <w:rFonts w:hint="default"/>
+      </w:rPr>
+    </w:lvl>
+    <w:lvl w:ilvl="1" w:tplc="40090019" w:tentative="1">
+      <w:start w:val="1"/>
+      <w:numFmt w:val="lowerLetter"/>
+      <w:lvlText w:val="%2."/>
+      <w:lvlJc w:val="left"/>
+      <w:pPr>
+        <w:ind w:left="2160" w:hanging="360"/>
+      </w:pPr>
+    </w:lvl>
+    <w:lvl w:ilvl="2" w:tplc="4009001B" w:tentative="1">
+      <w:start w:val="1"/>
+      <w:numFmt w:val="lowerRoman"/>
+      <w:lvlText w:val="%3."/>
+      <w:lvlJc w:val="right"/>
+      <w:pPr>
+        <w:ind w:left="2880" w:hanging="180"/>
+      </w:pPr>
+    </w:lvl>
+    <w:lvl w:ilvl="3" w:tplc="4009000F" w:tentative="1">
+      <w:start w:val="1"/>
+      <w:numFmt w:val="decimal"/>
+      <w:lvlText w:val="%4."/>
+      <w:lvlJc w:val="left"/>
+      <w:pPr>
+        <w:ind w:left="3600" w:hanging="360"/>
+      </w:pPr>
+    </w:lvl>
+    <w:lvl w:ilvl="4" w:tplc="40090019" w:tentative="1">
+      <w:start w:val="1"/>
+      <w:numFmt w:val="lowerLetter"/>
+      <w:lvlText w:val="%5."/>
+      <w:lvlJc w:val="left"/>
+      <w:pPr>
+        <w:ind w:left="4320" w:hanging="360"/>
+      </w:pPr>
+    </w:lvl>
+    <w:lvl w:ilvl="5" w:tplc="4009001B" w:tentative="1">
+      <w:start w:val="1"/>
+      <w:numFmt w:val="lowerRoman"/>
+      <w:lvlText w:val="%6."/>
+      <w:lvlJc w:val="right"/>
+      <w:pPr>
+        <w:ind w:left="5040" w:hanging="180"/>
+      </w:pPr>
+    </w:lvl>
+    <w:lvl w:ilvl="6" w:tplc="4009000F" w:tentative="1">
+      <w:start w:val="1"/>
+      <w:numFmt w:val="decimal"/>
+      <w:lvlText w:val="%7."/>
+      <w:lvlJc w:val="left"/>
+      <w:pPr>
+        <w:ind w:left="5760" w:hanging="360"/>
+      </w:pPr>
+    </w:lvl>
+    <w:lvl w:ilvl="7" w:tplc="40090019" w:tentative="1">
+      <w:start w:val="1"/>
+      <w:numFmt w:val="lowerLetter"/>
+      <w:lvlText w:val="%8."/>
+      <w:lvlJc w:val="left"/>
+      <w:pPr>
+        <w:ind w:left="6480" w:hanging="360"/>
+      </w:pPr>
+    </w:lvl>
+    <w:lvl w:ilvl="8" w:tplc="4009001B" w:tentative="1">
+      <w:start w:val="1"/>
+      <w:numFmt w:val="lowerRoman"/>
+      <w:lvlText w:val="%9."/>
+      <w:lvlJc w:val="right"/>
+      <w:pPr>
+        <w:ind w:left="7200" w:hanging="180"/>
+      </w:pPr>
+    </w:lvl>
+  </w:abstractNum>
+  <w:abstractNum w:abstractNumId="1" w15:restartNumberingAfterBreak="0">
     <w:nsid w:val="32B04232"/>
     <w:multiLevelType w:val="hybridMultilevel"/>
     <w:tmpl w:val="AF12C438"/>
@@ -405,7 +2445,7 @@
       </w:pPr>
     </w:lvl>
   </w:abstractNum>
-  <w:abstractNum w:abstractNumId="1" w15:restartNumberingAfterBreak="0">
+  <w:abstractNum w:abstractNumId="2" w15:restartNumberingAfterBreak="0">
     <w:nsid w:val="40681EE4"/>
     <w:multiLevelType w:val="hybridMultilevel"/>
     <w:tmpl w:val="AF12C438"/>
@@ -494,11 +2534,495 @@
       </w:pPr>
     </w:lvl>
   </w:abstractNum>
+  <w:abstractNum w:abstractNumId="3" w15:restartNumberingAfterBreak="0">
+    <w:nsid w:val="4F8B50FB"/>
+    <w:multiLevelType w:val="hybridMultilevel"/>
+    <w:tmpl w:val="43C8B0FC"/>
+    <w:lvl w:ilvl="0" w:tplc="4009000F">
+      <w:start w:val="1"/>
+      <w:numFmt w:val="decimal"/>
+      <w:lvlText w:val="%1."/>
+      <w:lvlJc w:val="left"/>
+      <w:pPr>
+        <w:ind w:left="720" w:hanging="360"/>
+      </w:pPr>
+    </w:lvl>
+    <w:lvl w:ilvl="1" w:tplc="40090019" w:tentative="1">
+      <w:start w:val="1"/>
+      <w:numFmt w:val="lowerLetter"/>
+      <w:lvlText w:val="%2."/>
+      <w:lvlJc w:val="left"/>
+      <w:pPr>
+        <w:ind w:left="1440" w:hanging="360"/>
+      </w:pPr>
+    </w:lvl>
+    <w:lvl w:ilvl="2" w:tplc="4009001B" w:tentative="1">
+      <w:start w:val="1"/>
+      <w:numFmt w:val="lowerRoman"/>
+      <w:lvlText w:val="%3."/>
+      <w:lvlJc w:val="right"/>
+      <w:pPr>
+        <w:ind w:left="2160" w:hanging="180"/>
+      </w:pPr>
+    </w:lvl>
+    <w:lvl w:ilvl="3" w:tplc="4009000F" w:tentative="1">
+      <w:start w:val="1"/>
+      <w:numFmt w:val="decimal"/>
+      <w:lvlText w:val="%4."/>
+      <w:lvlJc w:val="left"/>
+      <w:pPr>
+        <w:ind w:left="2880" w:hanging="360"/>
+      </w:pPr>
+    </w:lvl>
+    <w:lvl w:ilvl="4" w:tplc="40090019" w:tentative="1">
+      <w:start w:val="1"/>
+      <w:numFmt w:val="lowerLetter"/>
+      <w:lvlText w:val="%5."/>
+      <w:lvlJc w:val="left"/>
+      <w:pPr>
+        <w:ind w:left="3600" w:hanging="360"/>
+      </w:pPr>
+    </w:lvl>
+    <w:lvl w:ilvl="5" w:tplc="4009001B" w:tentative="1">
+      <w:start w:val="1"/>
+      <w:numFmt w:val="lowerRoman"/>
+      <w:lvlText w:val="%6."/>
+      <w:lvlJc w:val="right"/>
+      <w:pPr>
+        <w:ind w:left="4320" w:hanging="180"/>
+      </w:pPr>
+    </w:lvl>
+    <w:lvl w:ilvl="6" w:tplc="4009000F" w:tentative="1">
+      <w:start w:val="1"/>
+      <w:numFmt w:val="decimal"/>
+      <w:lvlText w:val="%7."/>
+      <w:lvlJc w:val="left"/>
+      <w:pPr>
+        <w:ind w:left="5040" w:hanging="360"/>
+      </w:pPr>
+    </w:lvl>
+    <w:lvl w:ilvl="7" w:tplc="40090019" w:tentative="1">
+      <w:start w:val="1"/>
+      <w:numFmt w:val="lowerLetter"/>
+      <w:lvlText w:val="%8."/>
+      <w:lvlJc w:val="left"/>
+      <w:pPr>
+        <w:ind w:left="5760" w:hanging="360"/>
+      </w:pPr>
+    </w:lvl>
+    <w:lvl w:ilvl="8" w:tplc="4009001B" w:tentative="1">
+      <w:start w:val="1"/>
+      <w:numFmt w:val="lowerRoman"/>
+      <w:lvlText w:val="%9."/>
+      <w:lvlJc w:val="right"/>
+      <w:pPr>
+        <w:ind w:left="6480" w:hanging="180"/>
+      </w:pPr>
+    </w:lvl>
+  </w:abstractNum>
+  <w:abstractNum w:abstractNumId="4" w15:restartNumberingAfterBreak="0">
+    <w:nsid w:val="5D321B82"/>
+    <w:multiLevelType w:val="hybridMultilevel"/>
+    <w:tmpl w:val="E65AC260"/>
+    <w:lvl w:ilvl="0" w:tplc="58B4600A">
+      <w:start w:val="1"/>
+      <w:numFmt w:val="lowerRoman"/>
+      <w:lvlText w:val="%1."/>
+      <w:lvlJc w:val="left"/>
+      <w:pPr>
+        <w:ind w:left="1440" w:hanging="360"/>
+      </w:pPr>
+      <w:rPr>
+        <w:rFonts w:hint="default"/>
+      </w:rPr>
+    </w:lvl>
+    <w:lvl w:ilvl="1" w:tplc="40090019" w:tentative="1">
+      <w:start w:val="1"/>
+      <w:numFmt w:val="lowerLetter"/>
+      <w:lvlText w:val="%2."/>
+      <w:lvlJc w:val="left"/>
+      <w:pPr>
+        <w:ind w:left="2160" w:hanging="360"/>
+      </w:pPr>
+    </w:lvl>
+    <w:lvl w:ilvl="2" w:tplc="4009001B" w:tentative="1">
+      <w:start w:val="1"/>
+      <w:numFmt w:val="lowerRoman"/>
+      <w:lvlText w:val="%3."/>
+      <w:lvlJc w:val="right"/>
+      <w:pPr>
+        <w:ind w:left="2880" w:hanging="180"/>
+      </w:pPr>
+    </w:lvl>
+    <w:lvl w:ilvl="3" w:tplc="4009000F" w:tentative="1">
+      <w:start w:val="1"/>
+      <w:numFmt w:val="decimal"/>
+      <w:lvlText w:val="%4."/>
+      <w:lvlJc w:val="left"/>
+      <w:pPr>
+        <w:ind w:left="3600" w:hanging="360"/>
+      </w:pPr>
+    </w:lvl>
+    <w:lvl w:ilvl="4" w:tplc="40090019" w:tentative="1">
+      <w:start w:val="1"/>
+      <w:numFmt w:val="lowerLetter"/>
+      <w:lvlText w:val="%5."/>
+      <w:lvlJc w:val="left"/>
+      <w:pPr>
+        <w:ind w:left="4320" w:hanging="360"/>
+      </w:pPr>
+    </w:lvl>
+    <w:lvl w:ilvl="5" w:tplc="4009001B" w:tentative="1">
+      <w:start w:val="1"/>
+      <w:numFmt w:val="lowerRoman"/>
+      <w:lvlText w:val="%6."/>
+      <w:lvlJc w:val="right"/>
+      <w:pPr>
+        <w:ind w:left="5040" w:hanging="180"/>
+      </w:pPr>
+    </w:lvl>
+    <w:lvl w:ilvl="6" w:tplc="4009000F" w:tentative="1">
+      <w:start w:val="1"/>
+      <w:numFmt w:val="decimal"/>
+      <w:lvlText w:val="%7."/>
+      <w:lvlJc w:val="left"/>
+      <w:pPr>
+        <w:ind w:left="5760" w:hanging="360"/>
+      </w:pPr>
+    </w:lvl>
+    <w:lvl w:ilvl="7" w:tplc="40090019" w:tentative="1">
+      <w:start w:val="1"/>
+      <w:numFmt w:val="lowerLetter"/>
+      <w:lvlText w:val="%8."/>
+      <w:lvlJc w:val="left"/>
+      <w:pPr>
+        <w:ind w:left="6480" w:hanging="360"/>
+      </w:pPr>
+    </w:lvl>
+    <w:lvl w:ilvl="8" w:tplc="4009001B" w:tentative="1">
+      <w:start w:val="1"/>
+      <w:numFmt w:val="lowerRoman"/>
+      <w:lvlText w:val="%9."/>
+      <w:lvlJc w:val="right"/>
+      <w:pPr>
+        <w:ind w:left="7200" w:hanging="180"/>
+      </w:pPr>
+    </w:lvl>
+  </w:abstractNum>
+  <w:abstractNum w:abstractNumId="5" w15:restartNumberingAfterBreak="0">
+    <w:nsid w:val="6CDF7195"/>
+    <w:multiLevelType w:val="hybridMultilevel"/>
+    <w:tmpl w:val="565ECE92"/>
+    <w:lvl w:ilvl="0" w:tplc="58B4600A">
+      <w:start w:val="1"/>
+      <w:numFmt w:val="lowerRoman"/>
+      <w:lvlText w:val="%1."/>
+      <w:lvlJc w:val="left"/>
+      <w:pPr>
+        <w:ind w:left="1440" w:hanging="360"/>
+      </w:pPr>
+      <w:rPr>
+        <w:rFonts w:hint="default"/>
+      </w:rPr>
+    </w:lvl>
+    <w:lvl w:ilvl="1" w:tplc="40090019" w:tentative="1">
+      <w:start w:val="1"/>
+      <w:numFmt w:val="lowerLetter"/>
+      <w:lvlText w:val="%2."/>
+      <w:lvlJc w:val="left"/>
+      <w:pPr>
+        <w:ind w:left="2160" w:hanging="360"/>
+      </w:pPr>
+    </w:lvl>
+    <w:lvl w:ilvl="2" w:tplc="4009001B" w:tentative="1">
+      <w:start w:val="1"/>
+      <w:numFmt w:val="lowerRoman"/>
+      <w:lvlText w:val="%3."/>
+      <w:lvlJc w:val="right"/>
+      <w:pPr>
+        <w:ind w:left="2880" w:hanging="180"/>
+      </w:pPr>
+    </w:lvl>
+    <w:lvl w:ilvl="3" w:tplc="4009000F" w:tentative="1">
+      <w:start w:val="1"/>
+      <w:numFmt w:val="decimal"/>
+      <w:lvlText w:val="%4."/>
+      <w:lvlJc w:val="left"/>
+      <w:pPr>
+        <w:ind w:left="3600" w:hanging="360"/>
+      </w:pPr>
+    </w:lvl>
+    <w:lvl w:ilvl="4" w:tplc="40090019" w:tentative="1">
+      <w:start w:val="1"/>
+      <w:numFmt w:val="lowerLetter"/>
+      <w:lvlText w:val="%5."/>
+      <w:lvlJc w:val="left"/>
+      <w:pPr>
+        <w:ind w:left="4320" w:hanging="360"/>
+      </w:pPr>
+    </w:lvl>
+    <w:lvl w:ilvl="5" w:tplc="4009001B" w:tentative="1">
+      <w:start w:val="1"/>
+      <w:numFmt w:val="lowerRoman"/>
+      <w:lvlText w:val="%6."/>
+      <w:lvlJc w:val="right"/>
+      <w:pPr>
+        <w:ind w:left="5040" w:hanging="180"/>
+      </w:pPr>
+    </w:lvl>
+    <w:lvl w:ilvl="6" w:tplc="4009000F" w:tentative="1">
+      <w:start w:val="1"/>
+      <w:numFmt w:val="decimal"/>
+      <w:lvlText w:val="%7."/>
+      <w:lvlJc w:val="left"/>
+      <w:pPr>
+        <w:ind w:left="5760" w:hanging="360"/>
+      </w:pPr>
+    </w:lvl>
+    <w:lvl w:ilvl="7" w:tplc="40090019" w:tentative="1">
+      <w:start w:val="1"/>
+      <w:numFmt w:val="lowerLetter"/>
+      <w:lvlText w:val="%8."/>
+      <w:lvlJc w:val="left"/>
+      <w:pPr>
+        <w:ind w:left="6480" w:hanging="360"/>
+      </w:pPr>
+    </w:lvl>
+    <w:lvl w:ilvl="8" w:tplc="4009001B" w:tentative="1">
+      <w:start w:val="1"/>
+      <w:numFmt w:val="lowerRoman"/>
+      <w:lvlText w:val="%9."/>
+      <w:lvlJc w:val="right"/>
+      <w:pPr>
+        <w:ind w:left="7200" w:hanging="180"/>
+      </w:pPr>
+    </w:lvl>
+  </w:abstractNum>
+  <w:abstractNum w:abstractNumId="6" w15:restartNumberingAfterBreak="0">
+    <w:nsid w:val="6EC838CE"/>
+    <w:multiLevelType w:val="hybridMultilevel"/>
+    <w:tmpl w:val="0EE6CD74"/>
+    <w:lvl w:ilvl="0" w:tplc="58B4600A">
+      <w:start w:val="1"/>
+      <w:numFmt w:val="lowerRoman"/>
+      <w:lvlText w:val="%1."/>
+      <w:lvlJc w:val="left"/>
+      <w:pPr>
+        <w:ind w:left="1440" w:hanging="360"/>
+      </w:pPr>
+      <w:rPr>
+        <w:rFonts w:hint="default"/>
+      </w:rPr>
+    </w:lvl>
+    <w:lvl w:ilvl="1" w:tplc="40090019" w:tentative="1">
+      <w:start w:val="1"/>
+      <w:numFmt w:val="lowerLetter"/>
+      <w:lvlText w:val="%2."/>
+      <w:lvlJc w:val="left"/>
+      <w:pPr>
+        <w:ind w:left="2160" w:hanging="360"/>
+      </w:pPr>
+    </w:lvl>
+    <w:lvl w:ilvl="2" w:tplc="4009001B" w:tentative="1">
+      <w:start w:val="1"/>
+      <w:numFmt w:val="lowerRoman"/>
+      <w:lvlText w:val="%3."/>
+      <w:lvlJc w:val="right"/>
+      <w:pPr>
+        <w:ind w:left="2880" w:hanging="180"/>
+      </w:pPr>
+    </w:lvl>
+    <w:lvl w:ilvl="3" w:tplc="4009000F" w:tentative="1">
+      <w:start w:val="1"/>
+      <w:numFmt w:val="decimal"/>
+      <w:lvlText w:val="%4."/>
+      <w:lvlJc w:val="left"/>
+      <w:pPr>
+        <w:ind w:left="3600" w:hanging="360"/>
+      </w:pPr>
+    </w:lvl>
+    <w:lvl w:ilvl="4" w:tplc="40090019" w:tentative="1">
+      <w:start w:val="1"/>
+      <w:numFmt w:val="lowerLetter"/>
+      <w:lvlText w:val="%5."/>
+      <w:lvlJc w:val="left"/>
+      <w:pPr>
+        <w:ind w:left="4320" w:hanging="360"/>
+      </w:pPr>
+    </w:lvl>
+    <w:lvl w:ilvl="5" w:tplc="4009001B" w:tentative="1">
+      <w:start w:val="1"/>
+      <w:numFmt w:val="lowerRoman"/>
+      <w:lvlText w:val="%6."/>
+      <w:lvlJc w:val="right"/>
+      <w:pPr>
+        <w:ind w:left="5040" w:hanging="180"/>
+      </w:pPr>
+    </w:lvl>
+    <w:lvl w:ilvl="6" w:tplc="4009000F" w:tentative="1">
+      <w:start w:val="1"/>
+      <w:numFmt w:val="decimal"/>
+      <w:lvlText w:val="%7."/>
+      <w:lvlJc w:val="left"/>
+      <w:pPr>
+        <w:ind w:left="5760" w:hanging="360"/>
+      </w:pPr>
+    </w:lvl>
+    <w:lvl w:ilvl="7" w:tplc="40090019" w:tentative="1">
+      <w:start w:val="1"/>
+      <w:numFmt w:val="lowerLetter"/>
+      <w:lvlText w:val="%8."/>
+      <w:lvlJc w:val="left"/>
+      <w:pPr>
+        <w:ind w:left="6480" w:hanging="360"/>
+      </w:pPr>
+    </w:lvl>
+    <w:lvl w:ilvl="8" w:tplc="4009001B" w:tentative="1">
+      <w:start w:val="1"/>
+      <w:numFmt w:val="lowerRoman"/>
+      <w:lvlText w:val="%9."/>
+      <w:lvlJc w:val="right"/>
+      <w:pPr>
+        <w:ind w:left="7200" w:hanging="180"/>
+      </w:pPr>
+    </w:lvl>
+  </w:abstractNum>
+  <w:abstractNum w:abstractNumId="7" w15:restartNumberingAfterBreak="0">
+    <w:nsid w:val="7E7C3B25"/>
+    <w:multiLevelType w:val="hybridMultilevel"/>
+    <w:tmpl w:val="85E29EB8"/>
+    <w:lvl w:ilvl="0" w:tplc="40090001">
+      <w:start w:val="1"/>
+      <w:numFmt w:val="bullet"/>
+      <w:lvlText w:val=""/>
+      <w:lvlJc w:val="left"/>
+      <w:pPr>
+        <w:ind w:left="720" w:hanging="360"/>
+      </w:pPr>
+      <w:rPr>
+        <w:rFonts w:ascii="Symbol" w:hAnsi="Symbol" w:hint="default"/>
+      </w:rPr>
+    </w:lvl>
+    <w:lvl w:ilvl="1" w:tplc="40090003" w:tentative="1">
+      <w:start w:val="1"/>
+      <w:numFmt w:val="bullet"/>
+      <w:lvlText w:val="o"/>
+      <w:lvlJc w:val="left"/>
+      <w:pPr>
+        <w:ind w:left="1440" w:hanging="360"/>
+      </w:pPr>
+      <w:rPr>
+        <w:rFonts w:ascii="Courier New" w:hAnsi="Courier New" w:cs="Courier New" w:hint="default"/>
+      </w:rPr>
+    </w:lvl>
+    <w:lvl w:ilvl="2" w:tplc="40090005" w:tentative="1">
+      <w:start w:val="1"/>
+      <w:numFmt w:val="bullet"/>
+      <w:lvlText w:val=""/>
+      <w:lvlJc w:val="left"/>
+      <w:pPr>
+        <w:ind w:left="2160" w:hanging="360"/>
+      </w:pPr>
+      <w:rPr>
+        <w:rFonts w:ascii="Wingdings" w:hAnsi="Wingdings" w:hint="default"/>
+      </w:rPr>
+    </w:lvl>
+    <w:lvl w:ilvl="3" w:tplc="40090001" w:tentative="1">
+      <w:start w:val="1"/>
+      <w:numFmt w:val="bullet"/>
+      <w:lvlText w:val=""/>
+      <w:lvlJc w:val="left"/>
+      <w:pPr>
+        <w:ind w:left="2880" w:hanging="360"/>
+      </w:pPr>
+      <w:rPr>
+        <w:rFonts w:ascii="Symbol" w:hAnsi="Symbol" w:hint="default"/>
+      </w:rPr>
+    </w:lvl>
+    <w:lvl w:ilvl="4" w:tplc="40090003" w:tentative="1">
+      <w:start w:val="1"/>
+      <w:numFmt w:val="bullet"/>
+      <w:lvlText w:val="o"/>
+      <w:lvlJc w:val="left"/>
+      <w:pPr>
+        <w:ind w:left="3600" w:hanging="360"/>
+      </w:pPr>
+      <w:rPr>
+        <w:rFonts w:ascii="Courier New" w:hAnsi="Courier New" w:cs="Courier New" w:hint="default"/>
+      </w:rPr>
+    </w:lvl>
+    <w:lvl w:ilvl="5" w:tplc="40090005" w:tentative="1">
+      <w:start w:val="1"/>
+      <w:numFmt w:val="bullet"/>
+      <w:lvlText w:val=""/>
+      <w:lvlJc w:val="left"/>
+      <w:pPr>
+        <w:ind w:left="4320" w:hanging="360"/>
+      </w:pPr>
+      <w:rPr>
+        <w:rFonts w:ascii="Wingdings" w:hAnsi="Wingdings" w:hint="default"/>
+      </w:rPr>
+    </w:lvl>
+    <w:lvl w:ilvl="6" w:tplc="40090001" w:tentative="1">
+      <w:start w:val="1"/>
+      <w:numFmt w:val="bullet"/>
+      <w:lvlText w:val=""/>
+      <w:lvlJc w:val="left"/>
+      <w:pPr>
+        <w:ind w:left="5040" w:hanging="360"/>
+      </w:pPr>
+      <w:rPr>
+        <w:rFonts w:ascii="Symbol" w:hAnsi="Symbol" w:hint="default"/>
+      </w:rPr>
+    </w:lvl>
+    <w:lvl w:ilvl="7" w:tplc="40090003" w:tentative="1">
+      <w:start w:val="1"/>
+      <w:numFmt w:val="bullet"/>
+      <w:lvlText w:val="o"/>
+      <w:lvlJc w:val="left"/>
+      <w:pPr>
+        <w:ind w:left="5760" w:hanging="360"/>
+      </w:pPr>
+      <w:rPr>
+        <w:rFonts w:ascii="Courier New" w:hAnsi="Courier New" w:cs="Courier New" w:hint="default"/>
+      </w:rPr>
+    </w:lvl>
+    <w:lvl w:ilvl="8" w:tplc="40090005" w:tentative="1">
+      <w:start w:val="1"/>
+      <w:numFmt w:val="bullet"/>
+      <w:lvlText w:val=""/>
+      <w:lvlJc w:val="left"/>
+      <w:pPr>
+        <w:ind w:left="6480" w:hanging="360"/>
+      </w:pPr>
+      <w:rPr>
+        <w:rFonts w:ascii="Wingdings" w:hAnsi="Wingdings" w:hint="default"/>
+      </w:rPr>
+    </w:lvl>
+  </w:abstractNum>
   <w:num w:numId="1" w16cid:durableId="1417287238">
+    <w:abstractNumId w:val="2"/>
+  </w:num>
+  <w:num w:numId="2" w16cid:durableId="793670838">
     <w:abstractNumId w:val="1"/>
   </w:num>
-  <w:num w:numId="2" w16cid:durableId="793670838">
+  <w:num w:numId="3" w16cid:durableId="1197501969">
+    <w:abstractNumId w:val="3"/>
+  </w:num>
+  <w:num w:numId="4" w16cid:durableId="1782727289">
+    <w:abstractNumId w:val="5"/>
+  </w:num>
+  <w:num w:numId="5" w16cid:durableId="595528463">
+    <w:abstractNumId w:val="6"/>
+  </w:num>
+  <w:num w:numId="6" w16cid:durableId="562108961">
     <w:abstractNumId w:val="0"/>
+  </w:num>
+  <w:num w:numId="7" w16cid:durableId="1476604863">
+    <w:abstractNumId w:val="4"/>
+  </w:num>
+  <w:num w:numId="8" w16cid:durableId="1092624181">
+    <w:abstractNumId w:val="7"/>
   </w:num>
 </w:numbering>
 </file>
@@ -1444,6 +3968,25 @@
       <w:rFonts w:cs="Mangal"/>
     </w:rPr>
   </w:style>
+  <w:style w:type="paragraph" w:styleId="Caption">
+    <w:name w:val="caption"/>
+    <w:basedOn w:val="Normal"/>
+    <w:next w:val="Normal"/>
+    <w:uiPriority w:val="35"/>
+    <w:unhideWhenUsed/>
+    <w:qFormat/>
+    <w:rsid w:val="002073A2"/>
+    <w:pPr>
+      <w:spacing w:after="200" w:line="240" w:lineRule="auto"/>
+    </w:pPr>
+    <w:rPr>
+      <w:i/>
+      <w:iCs/>
+      <w:color w:val="44546A" w:themeColor="text2"/>
+      <w:sz w:val="18"/>
+      <w:szCs w:val="16"/>
+    </w:rPr>
+  </w:style>
 </w:styles>
 </file>
 

</xml_diff>

<commit_message>
added company profile and objective of internship
</commit_message>
<xml_diff>
--- a/REPORT/Report.docx
+++ b/REPORT/Report.docx
@@ -2131,122 +2131,6 @@
           <w:szCs w:val="24"/>
         </w:rPr>
       </w:pPr>
-    </w:p>
-    <w:p>
-      <w:pPr>
-        <w:spacing w:line="360" w:lineRule="auto"/>
-        <w:jc w:val="both"/>
-        <w:rPr>
-          <w:rFonts w:ascii="Times New Roman" w:hAnsi="Times New Roman" w:cs="Times New Roman"/>
-          <w:sz w:val="24"/>
-          <w:szCs w:val="24"/>
-        </w:rPr>
-      </w:pPr>
-    </w:p>
-    <w:p>
-      <w:pPr>
-        <w:spacing w:line="360" w:lineRule="auto"/>
-        <w:jc w:val="both"/>
-        <w:rPr>
-          <w:rFonts w:ascii="Times New Roman" w:hAnsi="Times New Roman" w:cs="Times New Roman"/>
-          <w:sz w:val="24"/>
-          <w:szCs w:val="24"/>
-        </w:rPr>
-      </w:pPr>
-    </w:p>
-    <w:p>
-      <w:pPr>
-        <w:spacing w:line="360" w:lineRule="auto"/>
-        <w:jc w:val="both"/>
-        <w:rPr>
-          <w:rFonts w:ascii="Times New Roman" w:hAnsi="Times New Roman" w:cs="Times New Roman"/>
-          <w:sz w:val="24"/>
-          <w:szCs w:val="24"/>
-        </w:rPr>
-      </w:pPr>
-    </w:p>
-    <w:p>
-      <w:pPr>
-        <w:spacing w:line="360" w:lineRule="auto"/>
-        <w:jc w:val="both"/>
-        <w:rPr>
-          <w:rFonts w:ascii="Times New Roman" w:hAnsi="Times New Roman" w:cs="Times New Roman"/>
-          <w:sz w:val="24"/>
-          <w:szCs w:val="24"/>
-        </w:rPr>
-      </w:pPr>
-    </w:p>
-    <w:p>
-      <w:pPr>
-        <w:spacing w:line="360" w:lineRule="auto"/>
-        <w:jc w:val="both"/>
-        <w:rPr>
-          <w:rFonts w:ascii="Times New Roman" w:hAnsi="Times New Roman" w:cs="Times New Roman"/>
-          <w:sz w:val="24"/>
-          <w:szCs w:val="24"/>
-        </w:rPr>
-      </w:pPr>
-    </w:p>
-    <w:p>
-      <w:pPr>
-        <w:spacing w:line="360" w:lineRule="auto"/>
-        <w:jc w:val="both"/>
-        <w:rPr>
-          <w:rFonts w:ascii="Times New Roman" w:hAnsi="Times New Roman" w:cs="Times New Roman"/>
-          <w:sz w:val="24"/>
-          <w:szCs w:val="24"/>
-        </w:rPr>
-      </w:pPr>
-    </w:p>
-    <w:p>
-      <w:pPr>
-        <w:spacing w:line="360" w:lineRule="auto"/>
-        <w:jc w:val="both"/>
-        <w:rPr>
-          <w:rFonts w:ascii="Times New Roman" w:hAnsi="Times New Roman" w:cs="Times New Roman"/>
-          <w:sz w:val="24"/>
-          <w:szCs w:val="24"/>
-        </w:rPr>
-      </w:pPr>
-    </w:p>
-    <w:p>
-      <w:pPr>
-        <w:rPr>
-          <w:rFonts w:ascii="Times New Roman" w:hAnsi="Times New Roman" w:cs="Times New Roman"/>
-          <w:sz w:val="24"/>
-          <w:szCs w:val="24"/>
-        </w:rPr>
-      </w:pPr>
-      <w:r>
-        <w:rPr>
-          <w:rFonts w:ascii="Times New Roman" w:hAnsi="Times New Roman" w:cs="Times New Roman"/>
-          <w:sz w:val="24"/>
-          <w:szCs w:val="24"/>
-        </w:rPr>
-        <w:br w:type="page"/>
-      </w:r>
-    </w:p>
-    <w:p>
-      <w:pPr>
-        <w:pStyle w:val="Heading1"/>
-        <w:jc w:val="center"/>
-        <w:rPr>
-          <w:rFonts w:ascii="Times New Roman" w:hAnsi="Times New Roman" w:cs="Times New Roman"/>
-          <w:b/>
-          <w:bCs/>
-          <w:color w:val="000000" w:themeColor="text1"/>
-        </w:rPr>
-      </w:pPr>
-      <w:r>
-        <w:rPr>
-          <w:rFonts w:ascii="Times New Roman" w:hAnsi="Times New Roman" w:cs="Times New Roman"/>
-          <w:b/>
-          <w:bCs/>
-          <w:color w:val="000000" w:themeColor="text1"/>
-        </w:rPr>
-        <w:lastRenderedPageBreak/>
-        <w:t>Objective of Internship</w:t>
-      </w:r>
     </w:p>
     <w:p/>
     <w:sectPr>

</xml_diff>

<commit_message>
added project focus area
</commit_message>
<xml_diff>
--- a/REPORT/Report.docx
+++ b/REPORT/Report.docx
@@ -188,8 +188,6 @@
           <w:lang w:val="en-US"/>
         </w:rPr>
       </w:pPr>
-      <w:proofErr w:type="spellStart"/>
-      <w:proofErr w:type="gramStart"/>
       <w:r>
         <w:rPr>
           <w:rFonts w:ascii="Times New Roman" w:hAnsi="Times New Roman" w:cs="Times New Roman"/>
@@ -199,20 +197,7 @@
           <w:szCs w:val="40"/>
           <w:lang w:val="en-US"/>
         </w:rPr>
-        <w:t>B.Tech</w:t>
-      </w:r>
-      <w:proofErr w:type="spellEnd"/>
-      <w:proofErr w:type="gramEnd"/>
-      <w:r>
-        <w:rPr>
-          <w:rFonts w:ascii="Times New Roman" w:hAnsi="Times New Roman" w:cs="Times New Roman"/>
-          <w:b/>
-          <w:bCs/>
-          <w:sz w:val="40"/>
-          <w:szCs w:val="40"/>
-          <w:lang w:val="en-US"/>
-        </w:rPr>
-        <w:t xml:space="preserve"> 5</w:t>
+        <w:t>B.Tech 5</w:t>
       </w:r>
       <w:r>
         <w:rPr>
@@ -751,25 +736,7 @@
           <w:sz w:val="24"/>
           <w:szCs w:val="24"/>
         </w:rPr>
-        <w:t xml:space="preserve">Mathematical </w:t>
-      </w:r>
-      <w:proofErr w:type="spellStart"/>
-      <w:r>
-        <w:rPr>
-          <w:rFonts w:ascii="Times New Roman" w:hAnsi="Times New Roman" w:cs="Times New Roman"/>
-          <w:sz w:val="24"/>
-          <w:szCs w:val="24"/>
-        </w:rPr>
-        <w:t>Modeling</w:t>
-      </w:r>
-      <w:proofErr w:type="spellEnd"/>
-      <w:r>
-        <w:rPr>
-          <w:rFonts w:ascii="Times New Roman" w:hAnsi="Times New Roman" w:cs="Times New Roman"/>
-          <w:sz w:val="24"/>
-          <w:szCs w:val="24"/>
-        </w:rPr>
-        <w:t xml:space="preserve"> of the Thermal System</w:t>
+        <w:t>Mathematical Modeling of the Thermal System</w:t>
       </w:r>
     </w:p>
     <w:p>
@@ -957,18 +924,8 @@
           <w:sz w:val="24"/>
           <w:szCs w:val="24"/>
         </w:rPr>
-        <w:t xml:space="preserve">System </w:t>
-      </w:r>
-      <w:proofErr w:type="spellStart"/>
-      <w:r>
-        <w:rPr>
-          <w:rFonts w:ascii="Times New Roman" w:hAnsi="Times New Roman" w:cs="Times New Roman"/>
-          <w:sz w:val="24"/>
-          <w:szCs w:val="24"/>
-        </w:rPr>
-        <w:t>Modeling</w:t>
-      </w:r>
-      <w:proofErr w:type="spellEnd"/>
+        <w:t>System Modeling</w:t>
+      </w:r>
     </w:p>
     <w:p>
       <w:pPr>
@@ -1059,35 +1016,7 @@
           <w:sz w:val="24"/>
           <w:szCs w:val="24"/>
         </w:rPr>
-        <w:t xml:space="preserve">Automatic PI Tuning using </w:t>
-      </w:r>
-      <w:proofErr w:type="spellStart"/>
-      <w:proofErr w:type="gramStart"/>
-      <w:r>
-        <w:rPr>
-          <w:rFonts w:ascii="Times New Roman" w:hAnsi="Times New Roman" w:cs="Times New Roman"/>
-          <w:sz w:val="24"/>
-          <w:szCs w:val="24"/>
-        </w:rPr>
-        <w:t>pidtune</w:t>
-      </w:r>
-      <w:proofErr w:type="spellEnd"/>
-      <w:r>
-        <w:rPr>
-          <w:rFonts w:ascii="Times New Roman" w:hAnsi="Times New Roman" w:cs="Times New Roman"/>
-          <w:sz w:val="24"/>
-          <w:szCs w:val="24"/>
-        </w:rPr>
-        <w:t>(</w:t>
-      </w:r>
-      <w:proofErr w:type="gramEnd"/>
-      <w:r>
-        <w:rPr>
-          <w:rFonts w:ascii="Times New Roman" w:hAnsi="Times New Roman" w:cs="Times New Roman"/>
-          <w:sz w:val="24"/>
-          <w:szCs w:val="24"/>
-        </w:rPr>
-        <w:t>)</w:t>
+        <w:t>Automatic PI Tuning using pidtune()</w:t>
       </w:r>
     </w:p>
     <w:p>
@@ -1530,13 +1459,6 @@
     <w:p/>
     <w:p/>
     <w:p/>
-    <w:p/>
-    <w:p/>
-    <w:p>
-      <w:pPr>
-        <w:spacing w:line="360" w:lineRule="auto"/>
-      </w:pPr>
-    </w:p>
     <w:p>
       <w:pPr>
         <w:pStyle w:val="Heading1"/>
@@ -1556,6 +1478,7 @@
           <w:bCs/>
           <w:color w:val="000000" w:themeColor="text1"/>
         </w:rPr>
+        <w:lastRenderedPageBreak/>
         <w:t>Introduction</w:t>
       </w:r>
     </w:p>
@@ -1575,27 +1498,7 @@
           <w:sz w:val="24"/>
           <w:szCs w:val="24"/>
         </w:rPr>
-        <w:t xml:space="preserve">The rapid advancement in electronics technology has </w:t>
-      </w:r>
-      <w:proofErr w:type="spellStart"/>
-      <w:proofErr w:type="gramStart"/>
-      <w:r>
-        <w:rPr>
-          <w:rFonts w:ascii="Times New Roman" w:hAnsi="Times New Roman" w:cs="Times New Roman"/>
-          <w:sz w:val="24"/>
-          <w:szCs w:val="24"/>
-        </w:rPr>
-        <w:t>lead</w:t>
-      </w:r>
-      <w:proofErr w:type="spellEnd"/>
-      <w:proofErr w:type="gramEnd"/>
-      <w:r>
-        <w:rPr>
-          <w:rFonts w:ascii="Times New Roman" w:hAnsi="Times New Roman" w:cs="Times New Roman"/>
-          <w:sz w:val="24"/>
-          <w:szCs w:val="24"/>
-        </w:rPr>
-        <w:t xml:space="preserve"> to the significant increase in demand for a compact, reliable and high performance</w:t>
+        <w:t>The rapid advancement in electronics technology has lead to the significant increase in demand for a compact, reliable and high performance</w:t>
       </w:r>
       <w:r>
         <w:rPr>
@@ -1761,44 +1664,19 @@
           <w:sz w:val="24"/>
           <w:szCs w:val="24"/>
         </w:rPr>
-        <w:t xml:space="preserve">Each stage plays a significant role, </w:t>
-      </w:r>
-      <w:proofErr w:type="gramStart"/>
-      <w:r>
-        <w:rPr>
-          <w:rFonts w:ascii="Times New Roman" w:hAnsi="Times New Roman" w:cs="Times New Roman"/>
-          <w:sz w:val="24"/>
-          <w:szCs w:val="24"/>
-        </w:rPr>
-        <w:t>ensuring  proper</w:t>
-      </w:r>
-      <w:proofErr w:type="gramEnd"/>
-      <w:r>
-        <w:rPr>
-          <w:rFonts w:ascii="Times New Roman" w:hAnsi="Times New Roman" w:cs="Times New Roman"/>
-          <w:sz w:val="24"/>
-          <w:szCs w:val="24"/>
-        </w:rPr>
-        <w:t xml:space="preserve"> solder melting, strong electrical connections and prevents the damage of components. And if the temperature becomes higher or falls below the desired value, then the soldering effects such as cold joints, solder bridges, insufficient wetting, or component failure may occur. Therefore, a precise temperature regulation is one of the most critical </w:t>
-      </w:r>
-      <w:proofErr w:type="gramStart"/>
-      <w:r>
-        <w:rPr>
-          <w:rFonts w:ascii="Times New Roman" w:hAnsi="Times New Roman" w:cs="Times New Roman"/>
-          <w:sz w:val="24"/>
-          <w:szCs w:val="24"/>
-        </w:rPr>
-        <w:t>requirement</w:t>
-      </w:r>
-      <w:proofErr w:type="gramEnd"/>
-      <w:r>
-        <w:rPr>
-          <w:rFonts w:ascii="Times New Roman" w:hAnsi="Times New Roman" w:cs="Times New Roman"/>
-          <w:sz w:val="24"/>
-          <w:szCs w:val="24"/>
-        </w:rPr>
-        <w:t xml:space="preserve"> in the reflow soldering process.</w:t>
-      </w:r>
+        <w:t>Each stage plays a significant role, ensuring  proper solder melting, strong electrical connections and prevents the damage of components. And if the temperature becomes higher or falls below the desired value, then the soldering effects such as cold joints, solder bridges, insufficient wetting, or component failure may occur. Therefore, a precise temperature regulation is one of the most critical requirement in the reflow soldering process.</w:t>
+      </w:r>
+    </w:p>
+    <w:p>
+      <w:pPr>
+        <w:spacing w:line="360" w:lineRule="auto"/>
+        <w:jc w:val="both"/>
+        <w:rPr>
+          <w:rFonts w:ascii="Times New Roman" w:hAnsi="Times New Roman" w:cs="Times New Roman"/>
+          <w:sz w:val="24"/>
+          <w:szCs w:val="24"/>
+        </w:rPr>
+      </w:pPr>
     </w:p>
     <w:p>
       <w:pPr>
@@ -1869,24 +1747,14 @@
       <w:r>
         <w:t xml:space="preserve">Figure </w:t>
       </w:r>
-      <w:r>
-        <w:fldChar w:fldCharType="begin"/>
-      </w:r>
-      <w:r>
-        <w:instrText xml:space="preserve"> SEQ Figure \* ARABIC </w:instrText>
-      </w:r>
-      <w:r>
-        <w:fldChar w:fldCharType="separate"/>
-      </w:r>
-      <w:r>
-        <w:rPr>
-          <w:noProof/>
-        </w:rPr>
-        <w:t>1</w:t>
-      </w:r>
-      <w:r>
-        <w:fldChar w:fldCharType="end"/>
-      </w:r>
+      <w:fldSimple w:instr=" SEQ Figure \* ARABIC ">
+        <w:r>
+          <w:rPr>
+            <w:noProof/>
+          </w:rPr>
+          <w:t>1</w:t>
+        </w:r>
+      </w:fldSimple>
       <w:r>
         <w:rPr>
           <w:lang w:val="en-US"/>
@@ -1919,25 +1787,7 @@
           <w:sz w:val="24"/>
           <w:szCs w:val="24"/>
         </w:rPr>
-        <w:t xml:space="preserve">, and each zone is responsible for maintaining a specific range of temperature. Accurate control of these heating zones ensures that the PCB follows the desired thermal profile </w:t>
-      </w:r>
-      <w:proofErr w:type="spellStart"/>
-      <w:r>
-        <w:rPr>
-          <w:rFonts w:ascii="Times New Roman" w:hAnsi="Times New Roman" w:cs="Times New Roman"/>
-          <w:sz w:val="24"/>
-          <w:szCs w:val="24"/>
-        </w:rPr>
-        <w:t>throught</w:t>
-      </w:r>
-      <w:proofErr w:type="spellEnd"/>
-      <w:r>
-        <w:rPr>
-          <w:rFonts w:ascii="Times New Roman" w:hAnsi="Times New Roman" w:cs="Times New Roman"/>
-          <w:sz w:val="24"/>
-          <w:szCs w:val="24"/>
-        </w:rPr>
-        <w:t xml:space="preserve"> the soldering process. To achieve this, automatic control systems are employed to continuously monitoring the temperature and adjust the heater output correctly.</w:t>
+        <w:t>, and each zone is responsible for maintaining a specific range of temperature. Accurate control of these heating zones ensures that the PCB follows the desired thermal profile throught the soldering process. To achieve this, automatic control systems are employed to continuously monitoring the temperature and adjust the heater output correctly.</w:t>
       </w:r>
     </w:p>
     <w:p>
@@ -1983,71 +1833,7 @@
           <w:sz w:val="24"/>
           <w:szCs w:val="24"/>
         </w:rPr>
-        <w:t xml:space="preserve"> I performed both manual tuning and automatic tuning using MATLAB’s </w:t>
-      </w:r>
-      <w:proofErr w:type="spellStart"/>
-      <w:proofErr w:type="gramStart"/>
-      <w:r>
-        <w:rPr>
-          <w:rFonts w:ascii="Times New Roman" w:hAnsi="Times New Roman" w:cs="Times New Roman"/>
-          <w:sz w:val="24"/>
-          <w:szCs w:val="24"/>
-        </w:rPr>
-        <w:t>pidtune</w:t>
-      </w:r>
-      <w:proofErr w:type="spellEnd"/>
-      <w:r>
-        <w:rPr>
-          <w:rFonts w:ascii="Times New Roman" w:hAnsi="Times New Roman" w:cs="Times New Roman"/>
-          <w:sz w:val="24"/>
-          <w:szCs w:val="24"/>
-        </w:rPr>
-        <w:t>(</w:t>
-      </w:r>
-      <w:proofErr w:type="gramEnd"/>
-      <w:r>
-        <w:rPr>
-          <w:rFonts w:ascii="Times New Roman" w:hAnsi="Times New Roman" w:cs="Times New Roman"/>
-          <w:sz w:val="24"/>
-          <w:szCs w:val="24"/>
-        </w:rPr>
-        <w:t xml:space="preserve">) function to obtain a suitable PI controller parameters. The performance of the controller was </w:t>
-      </w:r>
-      <w:proofErr w:type="spellStart"/>
-      <w:r>
-        <w:rPr>
-          <w:rFonts w:ascii="Times New Roman" w:hAnsi="Times New Roman" w:cs="Times New Roman"/>
-          <w:sz w:val="24"/>
-          <w:szCs w:val="24"/>
-        </w:rPr>
-        <w:t>analyzed</w:t>
-      </w:r>
-      <w:proofErr w:type="spellEnd"/>
-      <w:r>
-        <w:rPr>
-          <w:rFonts w:ascii="Times New Roman" w:hAnsi="Times New Roman" w:cs="Times New Roman"/>
-          <w:sz w:val="24"/>
-          <w:szCs w:val="24"/>
-        </w:rPr>
-        <w:t xml:space="preserve"> under different operating conditions including the variations in the time constant of system and introduction of externally applied disturbances. I have also added dashboard consisting of a circular </w:t>
-      </w:r>
-      <w:proofErr w:type="spellStart"/>
-      <w:r>
-        <w:rPr>
-          <w:rFonts w:ascii="Times New Roman" w:hAnsi="Times New Roman" w:cs="Times New Roman"/>
-          <w:sz w:val="24"/>
-          <w:szCs w:val="24"/>
-        </w:rPr>
-        <w:t>guage</w:t>
-      </w:r>
-      <w:proofErr w:type="spellEnd"/>
-      <w:r>
-        <w:rPr>
-          <w:rFonts w:ascii="Times New Roman" w:hAnsi="Times New Roman" w:cs="Times New Roman"/>
-          <w:sz w:val="24"/>
-          <w:szCs w:val="24"/>
-        </w:rPr>
-        <w:t>, numeric display and an indicator lamp to visualize the simulated oven temperature in real time.</w:t>
+        <w:t xml:space="preserve"> I performed both manual tuning and automatic tuning using MATLAB’s pidtune() function to obtain a suitable PI controller parameters. The performance of the controller was analyzed under different operating conditions including the variations in the time constant of system and introduction of externally applied disturbances. I have also added dashboard consisting of a circular guage, numeric display and an indicator lamp to visualize the simulated oven temperature in real time.</w:t>
       </w:r>
     </w:p>
     <w:p>
@@ -2090,25 +1876,731 @@
     </w:p>
     <w:p>
       <w:pPr>
-        <w:spacing w:line="360" w:lineRule="auto"/>
-        <w:jc w:val="both"/>
-        <w:rPr>
-          <w:rFonts w:ascii="Times New Roman" w:hAnsi="Times New Roman" w:cs="Times New Roman"/>
-          <w:sz w:val="24"/>
-          <w:szCs w:val="24"/>
-        </w:rPr>
-      </w:pPr>
-    </w:p>
-    <w:p>
-      <w:pPr>
-        <w:spacing w:line="360" w:lineRule="auto"/>
-        <w:jc w:val="both"/>
-        <w:rPr>
-          <w:rFonts w:ascii="Times New Roman" w:hAnsi="Times New Roman" w:cs="Times New Roman"/>
-          <w:sz w:val="24"/>
-          <w:szCs w:val="24"/>
-        </w:rPr>
-      </w:pPr>
+        <w:rPr>
+          <w:rFonts w:ascii="Times New Roman" w:hAnsi="Times New Roman" w:cs="Times New Roman"/>
+          <w:sz w:val="24"/>
+          <w:szCs w:val="24"/>
+        </w:rPr>
+      </w:pPr>
+      <w:r>
+        <w:rPr>
+          <w:rFonts w:ascii="Times New Roman" w:hAnsi="Times New Roman" w:cs="Times New Roman"/>
+          <w:sz w:val="24"/>
+          <w:szCs w:val="24"/>
+        </w:rPr>
+        <w:br w:type="page"/>
+      </w:r>
+    </w:p>
+    <w:p>
+      <w:pPr>
+        <w:pStyle w:val="Heading1"/>
+        <w:spacing w:line="360" w:lineRule="auto"/>
+        <w:jc w:val="center"/>
+        <w:rPr>
+          <w:rFonts w:ascii="Times New Roman" w:hAnsi="Times New Roman" w:cs="Times New Roman"/>
+          <w:b/>
+          <w:bCs/>
+          <w:color w:val="000000" w:themeColor="text1"/>
+        </w:rPr>
+      </w:pPr>
+      <w:r>
+        <w:rPr>
+          <w:rFonts w:ascii="Times New Roman" w:hAnsi="Times New Roman" w:cs="Times New Roman"/>
+          <w:b/>
+          <w:bCs/>
+          <w:color w:val="000000" w:themeColor="text1"/>
+        </w:rPr>
+        <w:lastRenderedPageBreak/>
+        <w:t>Objective of Internship</w:t>
+      </w:r>
+    </w:p>
+    <w:p>
+      <w:pPr>
+        <w:spacing w:line="360" w:lineRule="auto"/>
+        <w:jc w:val="both"/>
+        <w:rPr>
+          <w:rFonts w:ascii="Times New Roman" w:hAnsi="Times New Roman" w:cs="Times New Roman"/>
+          <w:sz w:val="24"/>
+          <w:szCs w:val="24"/>
+        </w:rPr>
+      </w:pPr>
+      <w:r>
+        <w:rPr>
+          <w:rFonts w:ascii="Times New Roman" w:hAnsi="Times New Roman" w:cs="Times New Roman"/>
+          <w:sz w:val="24"/>
+          <w:szCs w:val="24"/>
+        </w:rPr>
+        <w:t>The primary objective of this internship was to gain a practical exposure to industrial control systems and their applications in electronics manufacturing. This internship was focused to understand the working principles of reflow ovens used in Surface Mount Technology (SMT) and the importance of accurate temperature control during the soldering process.</w:t>
+      </w:r>
+    </w:p>
+    <w:p>
+      <w:pPr>
+        <w:spacing w:line="360" w:lineRule="auto"/>
+        <w:jc w:val="both"/>
+        <w:rPr>
+          <w:rFonts w:ascii="Times New Roman" w:hAnsi="Times New Roman" w:cs="Times New Roman"/>
+          <w:sz w:val="24"/>
+          <w:szCs w:val="24"/>
+        </w:rPr>
+      </w:pPr>
+      <w:r>
+        <w:rPr>
+          <w:rFonts w:ascii="Times New Roman" w:hAnsi="Times New Roman" w:cs="Times New Roman"/>
+          <w:sz w:val="24"/>
+          <w:szCs w:val="24"/>
+        </w:rPr>
+        <w:t>The major objective of this internship are as follows:</w:t>
+      </w:r>
+    </w:p>
+    <w:p>
+      <w:pPr>
+        <w:pStyle w:val="ListParagraph"/>
+        <w:numPr>
+          <w:ilvl w:val="0"/>
+          <w:numId w:val="9"/>
+        </w:numPr>
+        <w:spacing w:line="360" w:lineRule="auto"/>
+        <w:jc w:val="both"/>
+        <w:rPr>
+          <w:rFonts w:ascii="Times New Roman" w:hAnsi="Times New Roman" w:cs="Times New Roman"/>
+          <w:sz w:val="24"/>
+          <w:szCs w:val="24"/>
+        </w:rPr>
+      </w:pPr>
+      <w:r>
+        <w:rPr>
+          <w:rFonts w:ascii="Times New Roman" w:hAnsi="Times New Roman" w:cs="Times New Roman"/>
+          <w:sz w:val="24"/>
+          <w:szCs w:val="24"/>
+        </w:rPr>
+        <w:t>To understand the working principle and industrial applications off reflow ovens in SMT manufacturing.</w:t>
+      </w:r>
+    </w:p>
+    <w:p>
+      <w:pPr>
+        <w:pStyle w:val="ListParagraph"/>
+        <w:numPr>
+          <w:ilvl w:val="0"/>
+          <w:numId w:val="9"/>
+        </w:numPr>
+        <w:spacing w:line="360" w:lineRule="auto"/>
+        <w:jc w:val="both"/>
+        <w:rPr>
+          <w:rFonts w:ascii="Times New Roman" w:hAnsi="Times New Roman" w:cs="Times New Roman"/>
+          <w:sz w:val="24"/>
+          <w:szCs w:val="24"/>
+        </w:rPr>
+      </w:pPr>
+      <w:r>
+        <w:rPr>
+          <w:rFonts w:ascii="Times New Roman" w:hAnsi="Times New Roman" w:cs="Times New Roman"/>
+          <w:sz w:val="24"/>
+          <w:szCs w:val="24"/>
+        </w:rPr>
+        <w:t>To study the significance of temperature profile tracking to achieve high quality solder joints.</w:t>
+      </w:r>
+    </w:p>
+    <w:p>
+      <w:pPr>
+        <w:pStyle w:val="ListParagraph"/>
+        <w:numPr>
+          <w:ilvl w:val="0"/>
+          <w:numId w:val="9"/>
+        </w:numPr>
+        <w:spacing w:line="360" w:lineRule="auto"/>
+        <w:jc w:val="both"/>
+        <w:rPr>
+          <w:rFonts w:ascii="Times New Roman" w:hAnsi="Times New Roman" w:cs="Times New Roman"/>
+          <w:sz w:val="24"/>
+          <w:szCs w:val="24"/>
+        </w:rPr>
+      </w:pPr>
+      <w:r>
+        <w:rPr>
+          <w:rFonts w:ascii="Times New Roman" w:hAnsi="Times New Roman" w:cs="Times New Roman"/>
+          <w:sz w:val="24"/>
+          <w:szCs w:val="24"/>
+        </w:rPr>
+        <w:t>To develop a mathematical model of a reflow oven heating system using MATLAB/Simulink.</w:t>
+      </w:r>
+    </w:p>
+    <w:p>
+      <w:pPr>
+        <w:pStyle w:val="ListParagraph"/>
+        <w:numPr>
+          <w:ilvl w:val="0"/>
+          <w:numId w:val="9"/>
+        </w:numPr>
+        <w:spacing w:line="360" w:lineRule="auto"/>
+        <w:jc w:val="both"/>
+        <w:rPr>
+          <w:rFonts w:ascii="Times New Roman" w:hAnsi="Times New Roman" w:cs="Times New Roman"/>
+          <w:sz w:val="24"/>
+          <w:szCs w:val="24"/>
+        </w:rPr>
+      </w:pPr>
+      <w:r>
+        <w:rPr>
+          <w:rFonts w:ascii="Times New Roman" w:hAnsi="Times New Roman" w:cs="Times New Roman"/>
+          <w:sz w:val="24"/>
+          <w:szCs w:val="24"/>
+        </w:rPr>
+        <w:t>To design and implementing a Proportional-Integral (PI) controller to regulate the temperature of oven.</w:t>
+      </w:r>
+    </w:p>
+    <w:p>
+      <w:pPr>
+        <w:pStyle w:val="ListParagraph"/>
+        <w:numPr>
+          <w:ilvl w:val="0"/>
+          <w:numId w:val="9"/>
+        </w:numPr>
+        <w:spacing w:line="360" w:lineRule="auto"/>
+        <w:jc w:val="both"/>
+        <w:rPr>
+          <w:rFonts w:ascii="Times New Roman" w:hAnsi="Times New Roman" w:cs="Times New Roman"/>
+          <w:sz w:val="24"/>
+          <w:szCs w:val="24"/>
+        </w:rPr>
+      </w:pPr>
+      <w:r>
+        <w:rPr>
+          <w:rFonts w:ascii="Times New Roman" w:hAnsi="Times New Roman" w:cs="Times New Roman"/>
+          <w:sz w:val="24"/>
+          <w:szCs w:val="24"/>
+        </w:rPr>
+        <w:t>To perform both manual and automatic controller using MATLAB’s pidtune() function.</w:t>
+      </w:r>
+    </w:p>
+    <w:p>
+      <w:pPr>
+        <w:pStyle w:val="ListParagraph"/>
+        <w:numPr>
+          <w:ilvl w:val="0"/>
+          <w:numId w:val="9"/>
+        </w:numPr>
+        <w:spacing w:line="360" w:lineRule="auto"/>
+        <w:jc w:val="both"/>
+        <w:rPr>
+          <w:rFonts w:ascii="Times New Roman" w:hAnsi="Times New Roman" w:cs="Times New Roman"/>
+          <w:sz w:val="24"/>
+          <w:szCs w:val="24"/>
+        </w:rPr>
+      </w:pPr>
+      <w:r>
+        <w:rPr>
+          <w:rFonts w:ascii="Times New Roman" w:hAnsi="Times New Roman" w:cs="Times New Roman"/>
+          <w:sz w:val="24"/>
+          <w:szCs w:val="24"/>
+        </w:rPr>
+        <w:t>To analyse the system performance when introduced different time constants and external disturbances.</w:t>
+      </w:r>
+    </w:p>
+    <w:p>
+      <w:pPr>
+        <w:pStyle w:val="ListParagraph"/>
+        <w:numPr>
+          <w:ilvl w:val="0"/>
+          <w:numId w:val="9"/>
+        </w:numPr>
+        <w:spacing w:line="360" w:lineRule="auto"/>
+        <w:jc w:val="both"/>
+        <w:rPr>
+          <w:rFonts w:ascii="Times New Roman" w:hAnsi="Times New Roman" w:cs="Times New Roman"/>
+          <w:sz w:val="24"/>
+          <w:szCs w:val="24"/>
+        </w:rPr>
+      </w:pPr>
+      <w:r>
+        <w:rPr>
+          <w:rFonts w:ascii="Times New Roman" w:hAnsi="Times New Roman" w:cs="Times New Roman"/>
+          <w:sz w:val="24"/>
+          <w:szCs w:val="24"/>
+        </w:rPr>
+        <w:t>To develop a simple monitoring dashboard containing a circular guage, numerical display and a temperature indicator lamp.</w:t>
+      </w:r>
+    </w:p>
+    <w:p>
+      <w:pPr>
+        <w:pStyle w:val="ListParagraph"/>
+        <w:numPr>
+          <w:ilvl w:val="0"/>
+          <w:numId w:val="9"/>
+        </w:numPr>
+        <w:spacing w:line="360" w:lineRule="auto"/>
+        <w:jc w:val="both"/>
+        <w:rPr>
+          <w:rFonts w:ascii="Times New Roman" w:hAnsi="Times New Roman" w:cs="Times New Roman"/>
+          <w:sz w:val="24"/>
+          <w:szCs w:val="24"/>
+        </w:rPr>
+      </w:pPr>
+      <w:r>
+        <w:rPr>
+          <w:rFonts w:ascii="Times New Roman" w:hAnsi="Times New Roman" w:cs="Times New Roman"/>
+          <w:sz w:val="24"/>
+          <w:szCs w:val="24"/>
+        </w:rPr>
+        <w:t>To enhance the practical knowledge of process control, system modelling, controller design and simulation techniques used in industrial automation.</w:t>
+      </w:r>
+      <w:r>
+        <w:rPr>
+          <w:rFonts w:ascii="Times New Roman" w:hAnsi="Times New Roman" w:cs="Times New Roman"/>
+          <w:sz w:val="24"/>
+          <w:szCs w:val="24"/>
+        </w:rPr>
+        <w:t xml:space="preserve"> </w:t>
+      </w:r>
+    </w:p>
+    <w:p>
+      <w:pPr>
+        <w:jc w:val="both"/>
+        <w:rPr>
+          <w:rFonts w:ascii="Times New Roman" w:hAnsi="Times New Roman" w:cs="Times New Roman"/>
+          <w:sz w:val="24"/>
+          <w:szCs w:val="24"/>
+        </w:rPr>
+      </w:pPr>
+      <w:r>
+        <w:rPr>
+          <w:rFonts w:ascii="Times New Roman" w:hAnsi="Times New Roman" w:cs="Times New Roman"/>
+          <w:sz w:val="24"/>
+          <w:szCs w:val="24"/>
+        </w:rPr>
+        <w:br w:type="page"/>
+      </w:r>
+    </w:p>
+    <w:p>
+      <w:pPr>
+        <w:pStyle w:val="Heading1"/>
+        <w:jc w:val="center"/>
+        <w:rPr>
+          <w:rFonts w:ascii="Times New Roman" w:hAnsi="Times New Roman" w:cs="Times New Roman"/>
+          <w:b/>
+          <w:bCs/>
+          <w:color w:val="000000" w:themeColor="text1"/>
+        </w:rPr>
+      </w:pPr>
+      <w:r>
+        <w:rPr>
+          <w:rFonts w:ascii="Times New Roman" w:hAnsi="Times New Roman" w:cs="Times New Roman"/>
+          <w:b/>
+          <w:bCs/>
+          <w:color w:val="000000" w:themeColor="text1"/>
+        </w:rPr>
+        <w:lastRenderedPageBreak/>
+        <w:t>Company Profile</w:t>
+      </w:r>
+    </w:p>
+    <w:p>
+      <w:pPr>
+        <w:spacing w:line="360" w:lineRule="auto"/>
+        <w:rPr>
+          <w:rFonts w:ascii="Times New Roman" w:hAnsi="Times New Roman" w:cs="Times New Roman"/>
+          <w:b/>
+          <w:bCs/>
+        </w:rPr>
+      </w:pPr>
+      <w:r>
+        <w:rPr>
+          <w:rFonts w:ascii="Times New Roman" w:hAnsi="Times New Roman" w:cs="Times New Roman"/>
+          <w:b/>
+          <w:bCs/>
+        </w:rPr>
+        <w:t>About Elin Electronics Ltd.</w:t>
+      </w:r>
+    </w:p>
+    <w:p>
+      <w:pPr>
+        <w:spacing w:line="360" w:lineRule="auto"/>
+        <w:rPr>
+          <w:rFonts w:ascii="Times New Roman" w:hAnsi="Times New Roman" w:cs="Times New Roman"/>
+        </w:rPr>
+      </w:pPr>
+      <w:r>
+        <w:rPr>
+          <w:rFonts w:ascii="Times New Roman" w:hAnsi="Times New Roman" w:cs="Times New Roman"/>
+          <w:b/>
+          <w:bCs/>
+        </w:rPr>
+        <w:t xml:space="preserve">Elin Electronics </w:t>
+      </w:r>
+      <w:r>
+        <w:rPr>
+          <w:rFonts w:ascii="Times New Roman" w:hAnsi="Times New Roman" w:cs="Times New Roman"/>
+        </w:rPr>
+        <w:t>is India’s one of the leading company among the Electronics Manufacturing Services (EMS) companies,</w:t>
+      </w:r>
+      <w:r>
+        <w:rPr>
+          <w:rFonts w:ascii="Times New Roman" w:hAnsi="Times New Roman" w:cs="Times New Roman"/>
+        </w:rPr>
+        <w:t xml:space="preserve"> providing end to end manufacturing solutions for a wide range of electronics products. The company was established in 1982 and throught the time the company has developed expertise in designing, manufacturing and assembling electronic products for both domestic and international markets. With multiple manufacturing facilities across India, Elin Electronics serves customers from various sectors including consumer electronics, home appliances, lighting, automative electronics and medical equipment.</w:t>
+      </w:r>
+    </w:p>
+    <w:p>
+      <w:pPr>
+        <w:spacing w:line="360" w:lineRule="auto"/>
+        <w:rPr>
+          <w:rFonts w:ascii="Times New Roman" w:hAnsi="Times New Roman" w:cs="Times New Roman"/>
+        </w:rPr>
+      </w:pPr>
+      <w:r>
+        <w:rPr>
+          <w:rFonts w:ascii="Times New Roman" w:hAnsi="Times New Roman" w:cs="Times New Roman"/>
+        </w:rPr>
+        <w:t xml:space="preserve">The company is specialized in high quality electronic manufacturing by integrating advanced production techniques, automated assembly lines and stringent quality control procedures. Its focus on innovation, precision and customer satisfaction has made it a trusted manufacturer partner with several well known partners. </w:t>
+      </w:r>
+    </w:p>
+    <w:p>
+      <w:pPr>
+        <w:spacing w:line="360" w:lineRule="auto"/>
+        <w:rPr>
+          <w:rFonts w:ascii="Times New Roman" w:hAnsi="Times New Roman" w:cs="Times New Roman"/>
+          <w:b/>
+          <w:bCs/>
+        </w:rPr>
+      </w:pPr>
+    </w:p>
+    <w:p>
+      <w:pPr>
+        <w:spacing w:line="360" w:lineRule="auto"/>
+        <w:rPr>
+          <w:rFonts w:ascii="Times New Roman" w:hAnsi="Times New Roman" w:cs="Times New Roman"/>
+          <w:b/>
+          <w:bCs/>
+        </w:rPr>
+      </w:pPr>
+      <w:r>
+        <w:rPr>
+          <w:rFonts w:ascii="Times New Roman" w:hAnsi="Times New Roman" w:cs="Times New Roman"/>
+          <w:b/>
+          <w:bCs/>
+        </w:rPr>
+        <w:t>Organizational Overview</w:t>
+      </w:r>
+    </w:p>
+    <w:p>
+      <w:pPr>
+        <w:spacing w:line="360" w:lineRule="auto"/>
+        <w:rPr>
+          <w:rFonts w:ascii="Times New Roman" w:hAnsi="Times New Roman" w:cs="Times New Roman"/>
+        </w:rPr>
+      </w:pPr>
+      <w:r>
+        <w:rPr>
+          <w:rFonts w:ascii="Times New Roman" w:hAnsi="Times New Roman" w:cs="Times New Roman"/>
+        </w:rPr>
+        <w:t>Elin Electronics follows a well structured organizational framework that enables an efficient coordination between various departments involving product development and manufacturing. The company consists of specialized teams</w:t>
+      </w:r>
+      <w:r>
+        <w:rPr>
+          <w:rFonts w:ascii="Times New Roman" w:hAnsi="Times New Roman" w:cs="Times New Roman"/>
+        </w:rPr>
+        <w:t xml:space="preserve"> which are responsible for research and development , production, quality assurance, supply chain management, testing, maintainance and customer support.</w:t>
+      </w:r>
+    </w:p>
+    <w:p>
+      <w:pPr>
+        <w:spacing w:line="360" w:lineRule="auto"/>
+        <w:rPr>
+          <w:rFonts w:ascii="Times New Roman" w:hAnsi="Times New Roman" w:cs="Times New Roman"/>
+        </w:rPr>
+      </w:pPr>
+      <w:r>
+        <w:rPr>
+          <w:rFonts w:ascii="Times New Roman" w:hAnsi="Times New Roman" w:cs="Times New Roman"/>
+        </w:rPr>
+        <w:t>Modern manufacturing facilities integrated with automated production lines, inspection systems and testing equipment ensures a consistent product quality and high production efficiency. Continuous improvement in processes and adherence to international quality standards contributes significantly to the company’s operational excellence.</w:t>
+      </w:r>
+    </w:p>
+    <w:p>
+      <w:pPr>
+        <w:spacing w:line="360" w:lineRule="auto"/>
+        <w:rPr>
+          <w:rFonts w:ascii="Times New Roman" w:hAnsi="Times New Roman" w:cs="Times New Roman"/>
+        </w:rPr>
+      </w:pPr>
+    </w:p>
+    <w:p>
+      <w:pPr>
+        <w:spacing w:line="360" w:lineRule="auto"/>
+        <w:rPr>
+          <w:rFonts w:ascii="Times New Roman" w:hAnsi="Times New Roman" w:cs="Times New Roman"/>
+          <w:b/>
+          <w:bCs/>
+        </w:rPr>
+      </w:pPr>
+      <w:r>
+        <w:rPr>
+          <w:rFonts w:ascii="Times New Roman" w:hAnsi="Times New Roman" w:cs="Times New Roman"/>
+          <w:b/>
+          <w:bCs/>
+        </w:rPr>
+        <w:t xml:space="preserve">Products and Services </w:t>
+      </w:r>
+    </w:p>
+    <w:p>
+      <w:pPr>
+        <w:spacing w:line="360" w:lineRule="auto"/>
+        <w:rPr>
+          <w:rFonts w:ascii="Times New Roman" w:hAnsi="Times New Roman" w:cs="Times New Roman"/>
+        </w:rPr>
+      </w:pPr>
+      <w:r>
+        <w:rPr>
+          <w:rFonts w:ascii="Times New Roman" w:hAnsi="Times New Roman" w:cs="Times New Roman"/>
+        </w:rPr>
+        <w:t>Elin Electronics manufactures and assembles a diverse range of electronic products and provides comprehensive Electronic Manufacturing Services (EMS). Some of the major products and service includes:</w:t>
+      </w:r>
+    </w:p>
+    <w:p>
+      <w:pPr>
+        <w:pStyle w:val="ListParagraph"/>
+        <w:numPr>
+          <w:ilvl w:val="0"/>
+          <w:numId w:val="10"/>
+        </w:numPr>
+        <w:spacing w:line="360" w:lineRule="auto"/>
+        <w:rPr>
+          <w:rFonts w:ascii="Times New Roman" w:hAnsi="Times New Roman" w:cs="Times New Roman"/>
+        </w:rPr>
+      </w:pPr>
+      <w:r>
+        <w:rPr>
+          <w:rFonts w:ascii="Times New Roman" w:hAnsi="Times New Roman" w:cs="Times New Roman"/>
+        </w:rPr>
+        <w:t>Consumer electronic products</w:t>
+      </w:r>
+    </w:p>
+    <w:p>
+      <w:pPr>
+        <w:pStyle w:val="ListParagraph"/>
+        <w:numPr>
+          <w:ilvl w:val="0"/>
+          <w:numId w:val="10"/>
+        </w:numPr>
+        <w:spacing w:line="360" w:lineRule="auto"/>
+        <w:rPr>
+          <w:rFonts w:ascii="Times New Roman" w:hAnsi="Times New Roman" w:cs="Times New Roman"/>
+        </w:rPr>
+      </w:pPr>
+      <w:r>
+        <w:rPr>
+          <w:rFonts w:ascii="Times New Roman" w:hAnsi="Times New Roman" w:cs="Times New Roman"/>
+        </w:rPr>
+        <w:t>LED lighting solutions</w:t>
+      </w:r>
+    </w:p>
+    <w:p>
+      <w:pPr>
+        <w:pStyle w:val="ListParagraph"/>
+        <w:numPr>
+          <w:ilvl w:val="0"/>
+          <w:numId w:val="10"/>
+        </w:numPr>
+        <w:spacing w:line="360" w:lineRule="auto"/>
+        <w:rPr>
+          <w:rFonts w:ascii="Times New Roman" w:hAnsi="Times New Roman" w:cs="Times New Roman"/>
+        </w:rPr>
+      </w:pPr>
+      <w:r>
+        <w:rPr>
+          <w:rFonts w:ascii="Times New Roman" w:hAnsi="Times New Roman" w:cs="Times New Roman"/>
+        </w:rPr>
+        <w:t>Home appliance electronics</w:t>
+      </w:r>
+    </w:p>
+    <w:p>
+      <w:pPr>
+        <w:pStyle w:val="ListParagraph"/>
+        <w:numPr>
+          <w:ilvl w:val="0"/>
+          <w:numId w:val="10"/>
+        </w:numPr>
+        <w:spacing w:line="360" w:lineRule="auto"/>
+        <w:rPr>
+          <w:rFonts w:ascii="Times New Roman" w:hAnsi="Times New Roman" w:cs="Times New Roman"/>
+        </w:rPr>
+      </w:pPr>
+      <w:r>
+        <w:rPr>
+          <w:rFonts w:ascii="Times New Roman" w:hAnsi="Times New Roman" w:cs="Times New Roman"/>
+        </w:rPr>
+        <w:t>Automative electronic assemblies</w:t>
+      </w:r>
+    </w:p>
+    <w:p>
+      <w:pPr>
+        <w:pStyle w:val="ListParagraph"/>
+        <w:numPr>
+          <w:ilvl w:val="0"/>
+          <w:numId w:val="10"/>
+        </w:numPr>
+        <w:spacing w:line="360" w:lineRule="auto"/>
+        <w:rPr>
+          <w:rFonts w:ascii="Times New Roman" w:hAnsi="Times New Roman" w:cs="Times New Roman"/>
+        </w:rPr>
+      </w:pPr>
+      <w:r>
+        <w:rPr>
+          <w:rFonts w:ascii="Times New Roman" w:hAnsi="Times New Roman" w:cs="Times New Roman"/>
+        </w:rPr>
+        <w:lastRenderedPageBreak/>
+        <w:t>Medical electronic devices</w:t>
+      </w:r>
+    </w:p>
+    <w:p>
+      <w:pPr>
+        <w:pStyle w:val="ListParagraph"/>
+        <w:numPr>
+          <w:ilvl w:val="0"/>
+          <w:numId w:val="10"/>
+        </w:numPr>
+        <w:spacing w:line="360" w:lineRule="auto"/>
+        <w:rPr>
+          <w:rFonts w:ascii="Times New Roman" w:hAnsi="Times New Roman" w:cs="Times New Roman"/>
+        </w:rPr>
+      </w:pPr>
+      <w:r>
+        <w:rPr>
+          <w:rFonts w:ascii="Times New Roman" w:hAnsi="Times New Roman" w:cs="Times New Roman"/>
+        </w:rPr>
+        <w:t>Printed Circuit Board Assemblies (PCBAs)</w:t>
+      </w:r>
+    </w:p>
+    <w:p>
+      <w:pPr>
+        <w:pStyle w:val="ListParagraph"/>
+        <w:numPr>
+          <w:ilvl w:val="0"/>
+          <w:numId w:val="10"/>
+        </w:numPr>
+        <w:spacing w:line="360" w:lineRule="auto"/>
+        <w:rPr>
+          <w:rFonts w:ascii="Times New Roman" w:hAnsi="Times New Roman" w:cs="Times New Roman"/>
+        </w:rPr>
+      </w:pPr>
+      <w:r>
+        <w:rPr>
+          <w:rFonts w:ascii="Times New Roman" w:hAnsi="Times New Roman" w:cs="Times New Roman"/>
+        </w:rPr>
+        <w:t>Original Equipment Manufacturing (OEM)</w:t>
+      </w:r>
+    </w:p>
+    <w:p>
+      <w:pPr>
+        <w:pStyle w:val="ListParagraph"/>
+        <w:numPr>
+          <w:ilvl w:val="0"/>
+          <w:numId w:val="10"/>
+        </w:numPr>
+        <w:spacing w:line="360" w:lineRule="auto"/>
+        <w:rPr>
+          <w:rFonts w:ascii="Times New Roman" w:hAnsi="Times New Roman" w:cs="Times New Roman"/>
+        </w:rPr>
+      </w:pPr>
+      <w:r>
+        <w:rPr>
+          <w:rFonts w:ascii="Times New Roman" w:hAnsi="Times New Roman" w:cs="Times New Roman"/>
+        </w:rPr>
+        <w:t>Original Design Manufacturing (ODM)</w:t>
+      </w:r>
+    </w:p>
+    <w:p>
+      <w:pPr>
+        <w:spacing w:line="360" w:lineRule="auto"/>
+        <w:rPr>
+          <w:rFonts w:ascii="Times New Roman" w:hAnsi="Times New Roman" w:cs="Times New Roman"/>
+        </w:rPr>
+      </w:pPr>
+      <w:r>
+        <w:rPr>
+          <w:rFonts w:ascii="Times New Roman" w:hAnsi="Times New Roman" w:cs="Times New Roman"/>
+        </w:rPr>
+        <w:t>The company also offers PCB assembly, testing, quality inspection, product integration and complete manufacturing support for various industries.</w:t>
+      </w:r>
+    </w:p>
+    <w:p>
+      <w:pPr>
+        <w:rPr>
+          <w:rFonts w:ascii="Times New Roman" w:hAnsi="Times New Roman" w:cs="Times New Roman"/>
+        </w:rPr>
+      </w:pPr>
+      <w:r>
+        <w:rPr>
+          <w:rFonts w:ascii="Times New Roman" w:hAnsi="Times New Roman" w:cs="Times New Roman"/>
+        </w:rPr>
+        <w:br w:type="page"/>
+      </w:r>
+    </w:p>
+    <w:p>
+      <w:pPr>
+        <w:pStyle w:val="Heading1"/>
+        <w:jc w:val="center"/>
+        <w:rPr>
+          <w:rFonts w:ascii="Times New Roman" w:hAnsi="Times New Roman" w:cs="Times New Roman"/>
+          <w:color w:val="000000" w:themeColor="text1"/>
+        </w:rPr>
+      </w:pPr>
+      <w:r>
+        <w:rPr>
+          <w:rFonts w:ascii="Times New Roman" w:hAnsi="Times New Roman" w:cs="Times New Roman"/>
+          <w:color w:val="000000" w:themeColor="text1"/>
+        </w:rPr>
+        <w:lastRenderedPageBreak/>
+        <w:t>Project Focus Area</w:t>
+      </w:r>
+    </w:p>
+    <w:p>
+      <w:r>
+        <w:t>This part of the report introduces the</w:t>
+      </w:r>
+      <w:r>
+        <w:t xml:space="preserve"> technologies and concepts used in the project therefore before explaining the actual implementation the heading is divided into four sub sections for a better understanding.</w:t>
+      </w:r>
+    </w:p>
+    <w:p/>
+    <w:p>
+      <w:r>
+        <w:t>Reflow Oven</w:t>
+      </w:r>
+    </w:p>
+    <w:p>
+      <w:r>
+        <w:t>A reflow oven is the heating system used in industries in the Surface Mount Technology (SMT) for soldering the electronic components on Printed Circuit Boards (PCBs). When the electronic components are placed on a PCB using a solder paste, after that the assembled board passes through a reflow oven where it is allowed to heat according to a carefully controlled temperature profile. And this controlled heating process melts the solder paste, and thus forming a reliable electrical and mechanical connections between the components and the PCB.</w:t>
+      </w:r>
+    </w:p>
+    <w:p>
+      <w:r>
+        <w:t>Nowadays, modern reflow ovens consists of multiple heating zones, thus each operating at different temperatures to gradually heat and cool the PCB. To produce a high quality solder joint and preventing the electronic components from damage, maintain</w:t>
+      </w:r>
+      <w:r>
+        <w:t>e</w:t>
+      </w:r>
+      <w:r>
+        <w:t xml:space="preserve">nce of correct temperature is </w:t>
+      </w:r>
+      <w:r>
+        <w:t xml:space="preserve">a </w:t>
+      </w:r>
+      <w:r>
+        <w:t>essential</w:t>
+      </w:r>
+      <w:r>
+        <w:t xml:space="preserve"> point. Thus, accurate temperature control plays crucial role in ensuring a reliable manufacturing and product quality.</w:t>
+      </w:r>
+    </w:p>
+    <w:p/>
+    <w:p>
+      <w:r>
+        <w:t>Surface Mount Technology</w:t>
+      </w:r>
+    </w:p>
+    <w:p>
+      <w:r>
+        <w:t>Surface Mount Technology (SMT) is a widely used manufacturing process</w:t>
+      </w:r>
     </w:p>
     <w:p>
       <w:pPr>
@@ -2152,6 +2644,119 @@
 <file path=word/numbering.xml><?xml version="1.0" encoding="utf-8"?>
 <w:numbering xmlns:wpc="http://schemas.microsoft.com/office/word/2010/wordprocessingCanvas" xmlns:cx="http://schemas.microsoft.com/office/drawing/2014/chartex" xmlns:cx1="http://schemas.microsoft.com/office/drawing/2015/9/8/chartex" xmlns:cx2="http://schemas.microsoft.com/office/drawing/2015/10/21/chartex" xmlns:cx3="http://schemas.microsoft.com/office/drawing/2016/5/9/chartex" xmlns:cx4="http://schemas.microsoft.com/office/drawing/2016/5/10/chartex" xmlns:cx5="http://schemas.microsoft.com/office/drawing/2016/5/11/chartex" xmlns:cx6="http://schemas.microsoft.com/office/drawing/2016/5/12/chartex" xmlns:cx7="http://schemas.microsoft.com/office/drawing/2016/5/13/chartex" xmlns:cx8="http://schemas.microsoft.com/office/drawing/2016/5/14/chartex" xmlns:mc="http://schemas.openxmlformats.org/markup-compatibility/2006" xmlns:aink="http://schemas.microsoft.com/office/drawing/2016/ink" xmlns:am3d="http://schemas.microsoft.com/office/drawing/2017/model3d" xmlns:o="urn:schemas-microsoft-com:office:office" xmlns:oel="http://schemas.microsoft.com/office/2019/extlst" xmlns:r="http://schemas.openxmlformats.org/officeDocument/2006/relationships" xmlns:m="http://schemas.openxmlformats.org/officeDocument/2006/math" xmlns:v="urn:schemas-microsoft-com:vml" xmlns:wp14="http://schemas.microsoft.com/office/word/2010/wordprocessingDrawing" xmlns:wp="http://schemas.openxmlformats.org/drawingml/2006/wordprocessingDrawing" xmlns:w10="urn:schemas-microsoft-com:office:word" xmlns:w="http://schemas.openxmlformats.org/wordprocessingml/2006/main" xmlns:w14="http://schemas.microsoft.com/office/word/2010/wordml" xmlns:w15="http://schemas.microsoft.com/office/word/2012/wordml" xmlns:w16cex="http://schemas.microsoft.com/office/word/2018/wordml/cex" xmlns:w16cid="http://schemas.microsoft.com/office/word/2016/wordml/cid" xmlns:w16="http://schemas.microsoft.com/office/word/2018/wordml" xmlns:w16du="http://schemas.microsoft.com/office/word/2023/wordml/word16du" xmlns:w16sdtdh="http://schemas.microsoft.com/office/word/2020/wordml/sdtdatahash" xmlns:w16sdtfl="http://schemas.microsoft.com/office/word/2024/wordml/sdtformatlock" xmlns:w16se="http://schemas.microsoft.com/office/word/2015/wordml/symex" xmlns:wpg="http://schemas.microsoft.com/office/word/2010/wordprocessingGroup" xmlns:wpi="http://schemas.microsoft.com/office/word/2010/wordprocessingInk" xmlns:wne="http://schemas.microsoft.com/office/word/2006/wordml" xmlns:wps="http://schemas.microsoft.com/office/word/2010/wordprocessingShape" mc:Ignorable="w14 w15 w16se w16cid w16 w16cex w16sdtdh w16sdtfl w16du wp14">
   <w:abstractNum w:abstractNumId="0" w15:restartNumberingAfterBreak="0">
+    <w:nsid w:val="20D5342F"/>
+    <w:multiLevelType w:val="hybridMultilevel"/>
+    <w:tmpl w:val="3D44ECAC"/>
+    <w:lvl w:ilvl="0" w:tplc="40090001">
+      <w:start w:val="1"/>
+      <w:numFmt w:val="bullet"/>
+      <w:lvlText w:val=""/>
+      <w:lvlJc w:val="left"/>
+      <w:pPr>
+        <w:ind w:left="720" w:hanging="360"/>
+      </w:pPr>
+      <w:rPr>
+        <w:rFonts w:ascii="Symbol" w:hAnsi="Symbol" w:hint="default"/>
+      </w:rPr>
+    </w:lvl>
+    <w:lvl w:ilvl="1" w:tplc="40090003" w:tentative="1">
+      <w:start w:val="1"/>
+      <w:numFmt w:val="bullet"/>
+      <w:lvlText w:val="o"/>
+      <w:lvlJc w:val="left"/>
+      <w:pPr>
+        <w:ind w:left="1440" w:hanging="360"/>
+      </w:pPr>
+      <w:rPr>
+        <w:rFonts w:ascii="Courier New" w:hAnsi="Courier New" w:cs="Courier New" w:hint="default"/>
+      </w:rPr>
+    </w:lvl>
+    <w:lvl w:ilvl="2" w:tplc="40090005" w:tentative="1">
+      <w:start w:val="1"/>
+      <w:numFmt w:val="bullet"/>
+      <w:lvlText w:val=""/>
+      <w:lvlJc w:val="left"/>
+      <w:pPr>
+        <w:ind w:left="2160" w:hanging="360"/>
+      </w:pPr>
+      <w:rPr>
+        <w:rFonts w:ascii="Wingdings" w:hAnsi="Wingdings" w:hint="default"/>
+      </w:rPr>
+    </w:lvl>
+    <w:lvl w:ilvl="3" w:tplc="40090001" w:tentative="1">
+      <w:start w:val="1"/>
+      <w:numFmt w:val="bullet"/>
+      <w:lvlText w:val=""/>
+      <w:lvlJc w:val="left"/>
+      <w:pPr>
+        <w:ind w:left="2880" w:hanging="360"/>
+      </w:pPr>
+      <w:rPr>
+        <w:rFonts w:ascii="Symbol" w:hAnsi="Symbol" w:hint="default"/>
+      </w:rPr>
+    </w:lvl>
+    <w:lvl w:ilvl="4" w:tplc="40090003" w:tentative="1">
+      <w:start w:val="1"/>
+      <w:numFmt w:val="bullet"/>
+      <w:lvlText w:val="o"/>
+      <w:lvlJc w:val="left"/>
+      <w:pPr>
+        <w:ind w:left="3600" w:hanging="360"/>
+      </w:pPr>
+      <w:rPr>
+        <w:rFonts w:ascii="Courier New" w:hAnsi="Courier New" w:cs="Courier New" w:hint="default"/>
+      </w:rPr>
+    </w:lvl>
+    <w:lvl w:ilvl="5" w:tplc="40090005" w:tentative="1">
+      <w:start w:val="1"/>
+      <w:numFmt w:val="bullet"/>
+      <w:lvlText w:val=""/>
+      <w:lvlJc w:val="left"/>
+      <w:pPr>
+        <w:ind w:left="4320" w:hanging="360"/>
+      </w:pPr>
+      <w:rPr>
+        <w:rFonts w:ascii="Wingdings" w:hAnsi="Wingdings" w:hint="default"/>
+      </w:rPr>
+    </w:lvl>
+    <w:lvl w:ilvl="6" w:tplc="40090001" w:tentative="1">
+      <w:start w:val="1"/>
+      <w:numFmt w:val="bullet"/>
+      <w:lvlText w:val=""/>
+      <w:lvlJc w:val="left"/>
+      <w:pPr>
+        <w:ind w:left="5040" w:hanging="360"/>
+      </w:pPr>
+      <w:rPr>
+        <w:rFonts w:ascii="Symbol" w:hAnsi="Symbol" w:hint="default"/>
+      </w:rPr>
+    </w:lvl>
+    <w:lvl w:ilvl="7" w:tplc="40090003" w:tentative="1">
+      <w:start w:val="1"/>
+      <w:numFmt w:val="bullet"/>
+      <w:lvlText w:val="o"/>
+      <w:lvlJc w:val="left"/>
+      <w:pPr>
+        <w:ind w:left="5760" w:hanging="360"/>
+      </w:pPr>
+      <w:rPr>
+        <w:rFonts w:ascii="Courier New" w:hAnsi="Courier New" w:cs="Courier New" w:hint="default"/>
+      </w:rPr>
+    </w:lvl>
+    <w:lvl w:ilvl="8" w:tplc="40090005" w:tentative="1">
+      <w:start w:val="1"/>
+      <w:numFmt w:val="bullet"/>
+      <w:lvlText w:val=""/>
+      <w:lvlJc w:val="left"/>
+      <w:pPr>
+        <w:ind w:left="6480" w:hanging="360"/>
+      </w:pPr>
+      <w:rPr>
+        <w:rFonts w:ascii="Wingdings" w:hAnsi="Wingdings" w:hint="default"/>
+      </w:rPr>
+    </w:lvl>
+  </w:abstractNum>
+  <w:abstractNum w:abstractNumId="1" w15:restartNumberingAfterBreak="0">
     <w:nsid w:val="24940DD7"/>
     <w:multiLevelType w:val="hybridMultilevel"/>
     <w:tmpl w:val="6282A794"/>
@@ -2240,7 +2845,7 @@
       </w:pPr>
     </w:lvl>
   </w:abstractNum>
-  <w:abstractNum w:abstractNumId="1" w15:restartNumberingAfterBreak="0">
+  <w:abstractNum w:abstractNumId="2" w15:restartNumberingAfterBreak="0">
     <w:nsid w:val="32B04232"/>
     <w:multiLevelType w:val="hybridMultilevel"/>
     <w:tmpl w:val="AF12C438"/>
@@ -2329,7 +2934,120 @@
       </w:pPr>
     </w:lvl>
   </w:abstractNum>
-  <w:abstractNum w:abstractNumId="2" w15:restartNumberingAfterBreak="0">
+  <w:abstractNum w:abstractNumId="3" w15:restartNumberingAfterBreak="0">
+    <w:nsid w:val="34BD7120"/>
+    <w:multiLevelType w:val="hybridMultilevel"/>
+    <w:tmpl w:val="56E28408"/>
+    <w:lvl w:ilvl="0" w:tplc="40090001">
+      <w:start w:val="1"/>
+      <w:numFmt w:val="bullet"/>
+      <w:lvlText w:val=""/>
+      <w:lvlJc w:val="left"/>
+      <w:pPr>
+        <w:ind w:left="773" w:hanging="360"/>
+      </w:pPr>
+      <w:rPr>
+        <w:rFonts w:ascii="Symbol" w:hAnsi="Symbol" w:hint="default"/>
+      </w:rPr>
+    </w:lvl>
+    <w:lvl w:ilvl="1" w:tplc="40090003" w:tentative="1">
+      <w:start w:val="1"/>
+      <w:numFmt w:val="bullet"/>
+      <w:lvlText w:val="o"/>
+      <w:lvlJc w:val="left"/>
+      <w:pPr>
+        <w:ind w:left="1493" w:hanging="360"/>
+      </w:pPr>
+      <w:rPr>
+        <w:rFonts w:ascii="Courier New" w:hAnsi="Courier New" w:cs="Courier New" w:hint="default"/>
+      </w:rPr>
+    </w:lvl>
+    <w:lvl w:ilvl="2" w:tplc="40090005" w:tentative="1">
+      <w:start w:val="1"/>
+      <w:numFmt w:val="bullet"/>
+      <w:lvlText w:val=""/>
+      <w:lvlJc w:val="left"/>
+      <w:pPr>
+        <w:ind w:left="2213" w:hanging="360"/>
+      </w:pPr>
+      <w:rPr>
+        <w:rFonts w:ascii="Wingdings" w:hAnsi="Wingdings" w:hint="default"/>
+      </w:rPr>
+    </w:lvl>
+    <w:lvl w:ilvl="3" w:tplc="40090001" w:tentative="1">
+      <w:start w:val="1"/>
+      <w:numFmt w:val="bullet"/>
+      <w:lvlText w:val=""/>
+      <w:lvlJc w:val="left"/>
+      <w:pPr>
+        <w:ind w:left="2933" w:hanging="360"/>
+      </w:pPr>
+      <w:rPr>
+        <w:rFonts w:ascii="Symbol" w:hAnsi="Symbol" w:hint="default"/>
+      </w:rPr>
+    </w:lvl>
+    <w:lvl w:ilvl="4" w:tplc="40090003" w:tentative="1">
+      <w:start w:val="1"/>
+      <w:numFmt w:val="bullet"/>
+      <w:lvlText w:val="o"/>
+      <w:lvlJc w:val="left"/>
+      <w:pPr>
+        <w:ind w:left="3653" w:hanging="360"/>
+      </w:pPr>
+      <w:rPr>
+        <w:rFonts w:ascii="Courier New" w:hAnsi="Courier New" w:cs="Courier New" w:hint="default"/>
+      </w:rPr>
+    </w:lvl>
+    <w:lvl w:ilvl="5" w:tplc="40090005" w:tentative="1">
+      <w:start w:val="1"/>
+      <w:numFmt w:val="bullet"/>
+      <w:lvlText w:val=""/>
+      <w:lvlJc w:val="left"/>
+      <w:pPr>
+        <w:ind w:left="4373" w:hanging="360"/>
+      </w:pPr>
+      <w:rPr>
+        <w:rFonts w:ascii="Wingdings" w:hAnsi="Wingdings" w:hint="default"/>
+      </w:rPr>
+    </w:lvl>
+    <w:lvl w:ilvl="6" w:tplc="40090001" w:tentative="1">
+      <w:start w:val="1"/>
+      <w:numFmt w:val="bullet"/>
+      <w:lvlText w:val=""/>
+      <w:lvlJc w:val="left"/>
+      <w:pPr>
+        <w:ind w:left="5093" w:hanging="360"/>
+      </w:pPr>
+      <w:rPr>
+        <w:rFonts w:ascii="Symbol" w:hAnsi="Symbol" w:hint="default"/>
+      </w:rPr>
+    </w:lvl>
+    <w:lvl w:ilvl="7" w:tplc="40090003" w:tentative="1">
+      <w:start w:val="1"/>
+      <w:numFmt w:val="bullet"/>
+      <w:lvlText w:val="o"/>
+      <w:lvlJc w:val="left"/>
+      <w:pPr>
+        <w:ind w:left="5813" w:hanging="360"/>
+      </w:pPr>
+      <w:rPr>
+        <w:rFonts w:ascii="Courier New" w:hAnsi="Courier New" w:cs="Courier New" w:hint="default"/>
+      </w:rPr>
+    </w:lvl>
+    <w:lvl w:ilvl="8" w:tplc="40090005" w:tentative="1">
+      <w:start w:val="1"/>
+      <w:numFmt w:val="bullet"/>
+      <w:lvlText w:val=""/>
+      <w:lvlJc w:val="left"/>
+      <w:pPr>
+        <w:ind w:left="6533" w:hanging="360"/>
+      </w:pPr>
+      <w:rPr>
+        <w:rFonts w:ascii="Wingdings" w:hAnsi="Wingdings" w:hint="default"/>
+      </w:rPr>
+    </w:lvl>
+  </w:abstractNum>
+  <w:abstractNum w:abstractNumId="4" w15:restartNumberingAfterBreak="0">
     <w:nsid w:val="40681EE4"/>
     <w:multiLevelType w:val="hybridMultilevel"/>
     <w:tmpl w:val="AF12C438"/>
@@ -2418,7 +3136,7 @@
       </w:pPr>
     </w:lvl>
   </w:abstractNum>
-  <w:abstractNum w:abstractNumId="3" w15:restartNumberingAfterBreak="0">
+  <w:abstractNum w:abstractNumId="5" w15:restartNumberingAfterBreak="0">
     <w:nsid w:val="4F8B50FB"/>
     <w:multiLevelType w:val="hybridMultilevel"/>
     <w:tmpl w:val="43C8B0FC"/>
@@ -2504,7 +3222,7 @@
       </w:pPr>
     </w:lvl>
   </w:abstractNum>
-  <w:abstractNum w:abstractNumId="4" w15:restartNumberingAfterBreak="0">
+  <w:abstractNum w:abstractNumId="6" w15:restartNumberingAfterBreak="0">
     <w:nsid w:val="5D321B82"/>
     <w:multiLevelType w:val="hybridMultilevel"/>
     <w:tmpl w:val="E65AC260"/>
@@ -2593,7 +3311,7 @@
       </w:pPr>
     </w:lvl>
   </w:abstractNum>
-  <w:abstractNum w:abstractNumId="5" w15:restartNumberingAfterBreak="0">
+  <w:abstractNum w:abstractNumId="7" w15:restartNumberingAfterBreak="0">
     <w:nsid w:val="6CDF7195"/>
     <w:multiLevelType w:val="hybridMultilevel"/>
     <w:tmpl w:val="565ECE92"/>
@@ -2682,7 +3400,7 @@
       </w:pPr>
     </w:lvl>
   </w:abstractNum>
-  <w:abstractNum w:abstractNumId="6" w15:restartNumberingAfterBreak="0">
+  <w:abstractNum w:abstractNumId="8" w15:restartNumberingAfterBreak="0">
     <w:nsid w:val="6EC838CE"/>
     <w:multiLevelType w:val="hybridMultilevel"/>
     <w:tmpl w:val="0EE6CD74"/>
@@ -2771,7 +3489,7 @@
       </w:pPr>
     </w:lvl>
   </w:abstractNum>
-  <w:abstractNum w:abstractNumId="7" w15:restartNumberingAfterBreak="0">
+  <w:abstractNum w:abstractNumId="9" w15:restartNumberingAfterBreak="0">
     <w:nsid w:val="7E7C3B25"/>
     <w:multiLevelType w:val="hybridMultilevel"/>
     <w:tmpl w:val="85E29EB8"/>
@@ -2885,28 +3603,34 @@
     </w:lvl>
   </w:abstractNum>
   <w:num w:numId="1" w16cid:durableId="1417287238">
+    <w:abstractNumId w:val="4"/>
+  </w:num>
+  <w:num w:numId="2" w16cid:durableId="793670838">
     <w:abstractNumId w:val="2"/>
   </w:num>
-  <w:num w:numId="2" w16cid:durableId="793670838">
+  <w:num w:numId="3" w16cid:durableId="1197501969">
+    <w:abstractNumId w:val="5"/>
+  </w:num>
+  <w:num w:numId="4" w16cid:durableId="1782727289">
+    <w:abstractNumId w:val="7"/>
+  </w:num>
+  <w:num w:numId="5" w16cid:durableId="595528463">
+    <w:abstractNumId w:val="8"/>
+  </w:num>
+  <w:num w:numId="6" w16cid:durableId="562108961">
     <w:abstractNumId w:val="1"/>
   </w:num>
-  <w:num w:numId="3" w16cid:durableId="1197501969">
+  <w:num w:numId="7" w16cid:durableId="1476604863">
+    <w:abstractNumId w:val="6"/>
+  </w:num>
+  <w:num w:numId="8" w16cid:durableId="1092624181">
+    <w:abstractNumId w:val="9"/>
+  </w:num>
+  <w:num w:numId="9" w16cid:durableId="973213524">
     <w:abstractNumId w:val="3"/>
   </w:num>
-  <w:num w:numId="4" w16cid:durableId="1782727289">
-    <w:abstractNumId w:val="5"/>
-  </w:num>
-  <w:num w:numId="5" w16cid:durableId="595528463">
-    <w:abstractNumId w:val="6"/>
-  </w:num>
-  <w:num w:numId="6" w16cid:durableId="562108961">
+  <w:num w:numId="10" w16cid:durableId="649481661">
     <w:abstractNumId w:val="0"/>
-  </w:num>
-  <w:num w:numId="7" w16cid:durableId="1476604863">
-    <w:abstractNumId w:val="4"/>
-  </w:num>
-  <w:num w:numId="8" w16cid:durableId="1092624181">
-    <w:abstractNumId w:val="7"/>
   </w:num>
 </w:numbering>
 </file>
@@ -3514,6 +4238,7 @@
   <w:style w:type="character" w:default="1" w:styleId="DefaultParagraphFont">
     <w:name w:val="Default Paragraph Font"/>
     <w:uiPriority w:val="1"/>
+    <w:semiHidden/>
     <w:unhideWhenUsed/>
   </w:style>
   <w:style w:type="table" w:default="1" w:styleId="TableNormal">

</xml_diff>